<commit_message>
Agregar el modelo físico del DataMart a la primera presentación
El punto 5 incluye ahora el diagrama del modelo físico (tablas, columnas,
tipos de datos, PK, FK, UNIQUE y NOT NULL), generado desde el catálogo de
PostgreSQL, y el script de creación de tablas e índices como anexo.

Co-Authored-By: Claude Opus 5.5 <noreply@anthropic.com>
Claude-Session: https://claude.ai/code/session_01UrpbqW5jvhcx6qo3xxD3vZ
</commit_message>
<xml_diff>
--- a/proyecto-dw-vuelos/docs/Primera_Presentacion_DW_Vuelos.docx
+++ b/proyecto-dw-vuelos/docs/Primera_Presentacion_DW_Vuelos.docx
@@ -1207,6 +1207,1425 @@
         <w:t xml:space="preserve"> índices en cada FK, en (aerolínea, fecha), en la ruta (origen, destino) y un índice parcial de vuelos cancelados; la clave natural única permite recargar sin duplicar y el miembro «Desconocido» (-1) evita perder vuelos con códigos no encontrados.</w:t>
       </w:r>
     </w:p>
+    <w:p>
+      <w:pPr>
+        <w:jc w:val="both"/>
+      </w:pPr>
+      <w:r>
+        <w:rPr>
+          <w:b w:val="0"/>
+        </w:rPr>
+        <w:t>La Figura 1 muestra el modelo físico implementado, obtenido del catálogo de PostgreSQL: cada tabla con sus columnas, tipos de datos, claves y columnas obligatorias. El script de creación completo está en el Anexo.</w:t>
+      </w:r>
+    </w:p>
+    <w:p>
+      <w:pPr>
+        <w:sectPr>
+          <w:pgSz w:w="11906" w:h="16838"/>
+          <w:pgMar w:top="1417" w:right="1417" w:bottom="1417" w:left="1417" w:header="720" w:footer="720" w:gutter="0"/>
+          <w:cols w:space="720"/>
+          <w:docGrid w:linePitch="360"/>
+        </w:sectPr>
+      </w:pPr>
+    </w:p>
+    <w:p>
+      <w:pPr>
+        <w:jc w:val="center"/>
+      </w:pPr>
+      <w:r>
+        <w:drawing>
+          <wp:inline xmlns:a="http://schemas.openxmlformats.org/drawingml/2006/main" xmlns:pic="http://schemas.openxmlformats.org/drawingml/2006/picture">
+            <wp:extent cx="9540000" cy="4569660"/>
+            <wp:docPr id="1" name="Picture 1"/>
+            <wp:cNvGraphicFramePr>
+              <a:graphicFrameLocks noChangeAspect="1"/>
+            </wp:cNvGraphicFramePr>
+            <a:graphic>
+              <a:graphicData uri="http://schemas.openxmlformats.org/drawingml/2006/picture">
+                <pic:pic>
+                  <pic:nvPicPr>
+                    <pic:cNvPr id="0" name="modelo_fisico.png"/>
+                    <pic:cNvPicPr/>
+                  </pic:nvPicPr>
+                  <pic:blipFill>
+                    <a:blip r:embed="rId9"/>
+                    <a:stretch>
+                      <a:fillRect/>
+                    </a:stretch>
+                  </pic:blipFill>
+                  <pic:spPr>
+                    <a:xfrm>
+                      <a:off x="0" y="0"/>
+                      <a:ext cx="9540000" cy="4569660"/>
+                    </a:xfrm>
+                    <a:prstGeom prst="rect"/>
+                  </pic:spPr>
+                </pic:pic>
+              </a:graphicData>
+            </a:graphic>
+          </wp:inline>
+        </w:drawing>
+      </w:r>
+    </w:p>
+    <w:p>
+      <w:pPr>
+        <w:jc w:val="center"/>
+      </w:pPr>
+      <w:r>
+        <w:rPr>
+          <w:b/>
+        </w:rPr>
+        <w:t>Figura 1.</w:t>
+      </w:r>
+      <w:r>
+        <w:rPr>
+          <w:b w:val="0"/>
+        </w:rPr>
+        <w:t xml:space="preserve"> Modelo físico del DataMart Puntualidad de Vuelos en PostgreSQL 16 (esquema dw_vuelos).</w:t>
+      </w:r>
+    </w:p>
+    <w:p>
+      <w:pPr>
+        <w:jc w:val="center"/>
+      </w:pPr>
+      <w:r>
+        <w:rPr>
+          <w:b w:val="0"/>
+        </w:rPr>
+        <w:t>PK = clave primaria; FK = clave foránea; UK = forma parte de una restricción UNIQUE; NN = NOT NULL; IDENTITY = valor generado por el DBMS; ‖──&lt; = relación 1:N. dim_aeropuerto se relaciona dos veces con fact_vuelo (origen y destino).</w:t>
+      </w:r>
+    </w:p>
+    <w:p>
+      <w:pPr>
+        <w:sectPr>
+          <w:pgSz w:w="16838" w:h="11906" w:orient="landscape"/>
+          <w:pgMar w:top="1134" w:right="850" w:bottom="1134" w:left="850" w:header="720" w:footer="720" w:gutter="0"/>
+          <w:cols w:space="720"/>
+          <w:docGrid w:linePitch="360"/>
+        </w:sectPr>
+      </w:pPr>
+    </w:p>
+    <w:p>
+      <w:pPr>
+        <w:keepNext/>
+        <w:spacing w:before="120"/>
+      </w:pPr>
+      <w:r>
+        <w:rPr>
+          <w:b/>
+        </w:rPr>
+        <w:t>Anexo. Script del modelo físico (PostgreSQL 16)</w:t>
+      </w:r>
+    </w:p>
+    <w:p>
+      <w:pPr>
+        <w:jc w:val="both"/>
+      </w:pPr>
+      <w:r>
+        <w:rPr>
+          <w:b w:val="0"/>
+        </w:rPr>
+        <w:t>Scripts 01_crear_esquema_y_tablas.sql y 02_crear_indices.sql, sin los comentarios:</w:t>
+      </w:r>
+    </w:p>
+    <w:p>
+      <w:pPr>
+        <w:spacing w:after="0"/>
+        <w:ind w:left="0"/>
+      </w:pPr>
+      <w:r>
+        <w:t>DROP SCHEMA IF EXISTS dw_vuelos CASCADE;</w:t>
+      </w:r>
+    </w:p>
+    <w:p>
+      <w:pPr>
+        <w:spacing w:after="0"/>
+        <w:ind w:left="0"/>
+      </w:pPr>
+      <w:r>
+        <w:t>CREATE SCHEMA dw_vuelos;</w:t>
+      </w:r>
+    </w:p>
+    <w:p>
+      <w:pPr>
+        <w:spacing w:after="0"/>
+        <w:ind w:left="0"/>
+      </w:pPr>
+      <w:r/>
+    </w:p>
+    <w:p>
+      <w:pPr>
+        <w:spacing w:after="0"/>
+        <w:ind w:left="0"/>
+      </w:pPr>
+      <w:r>
+        <w:t>SET search_path TO dw_vuelos;</w:t>
+      </w:r>
+    </w:p>
+    <w:p>
+      <w:pPr>
+        <w:spacing w:after="0"/>
+        <w:ind w:left="0"/>
+      </w:pPr>
+      <w:r/>
+    </w:p>
+    <w:p>
+      <w:pPr>
+        <w:spacing w:after="0"/>
+        <w:ind w:left="0"/>
+      </w:pPr>
+      <w:r>
+        <w:t>CREATE TABLE dim_fecha (</w:t>
+      </w:r>
+    </w:p>
+    <w:p>
+      <w:pPr>
+        <w:spacing w:after="0"/>
+        <w:ind w:left="567"/>
+      </w:pPr>
+      <w:r>
+        <w:t>sk_fecha INTEGER NOT NULL,</w:t>
+      </w:r>
+    </w:p>
+    <w:p>
+      <w:pPr>
+        <w:spacing w:after="0"/>
+        <w:ind w:left="567"/>
+      </w:pPr>
+      <w:r>
+        <w:t>fecha DATE NOT NULL,</w:t>
+      </w:r>
+    </w:p>
+    <w:p>
+      <w:pPr>
+        <w:spacing w:after="0"/>
+        <w:ind w:left="567"/>
+      </w:pPr>
+      <w:r>
+        <w:t>dia SMALLINT NOT NULL,</w:t>
+      </w:r>
+    </w:p>
+    <w:p>
+      <w:pPr>
+        <w:spacing w:after="0"/>
+        <w:ind w:left="567"/>
+      </w:pPr>
+      <w:r>
+        <w:t>dia_semana SMALLINT NOT NULL,</w:t>
+      </w:r>
+    </w:p>
+    <w:p>
+      <w:pPr>
+        <w:spacing w:after="0"/>
+        <w:ind w:left="567"/>
+      </w:pPr>
+      <w:r>
+        <w:t>nombre_dia VARCHAR(10) NOT NULL,</w:t>
+      </w:r>
+    </w:p>
+    <w:p>
+      <w:pPr>
+        <w:spacing w:after="0"/>
+        <w:ind w:left="567"/>
+      </w:pPr>
+      <w:r>
+        <w:t>es_fin_de_semana BOOLEAN NOT NULL,</w:t>
+      </w:r>
+    </w:p>
+    <w:p>
+      <w:pPr>
+        <w:spacing w:after="0"/>
+        <w:ind w:left="567"/>
+      </w:pPr>
+      <w:r>
+        <w:t>mes SMALLINT NOT NULL,</w:t>
+      </w:r>
+    </w:p>
+    <w:p>
+      <w:pPr>
+        <w:spacing w:after="0"/>
+        <w:ind w:left="567"/>
+      </w:pPr>
+      <w:r>
+        <w:t>nombre_mes VARCHAR(10) NOT NULL,</w:t>
+      </w:r>
+    </w:p>
+    <w:p>
+      <w:pPr>
+        <w:spacing w:after="0"/>
+        <w:ind w:left="567"/>
+      </w:pPr>
+      <w:r>
+        <w:t>trimestre SMALLINT NOT NULL,</w:t>
+      </w:r>
+    </w:p>
+    <w:p>
+      <w:pPr>
+        <w:spacing w:after="0"/>
+        <w:ind w:left="567"/>
+      </w:pPr>
+      <w:r>
+        <w:t>anio SMALLINT NOT NULL,</w:t>
+      </w:r>
+    </w:p>
+    <w:p>
+      <w:pPr>
+        <w:spacing w:after="0"/>
+        <w:ind w:left="567"/>
+      </w:pPr>
+      <w:r>
+        <w:t>CONSTRAINT pk_dim_fecha PRIMARY KEY (sk_fecha),</w:t>
+      </w:r>
+    </w:p>
+    <w:p>
+      <w:pPr>
+        <w:spacing w:after="0"/>
+        <w:ind w:left="567"/>
+      </w:pPr>
+      <w:r>
+        <w:t>CONSTRAINT uq_dim_fecha_fecha UNIQUE (fecha),</w:t>
+      </w:r>
+    </w:p>
+    <w:p>
+      <w:pPr>
+        <w:spacing w:after="0"/>
+        <w:ind w:left="567"/>
+      </w:pPr>
+      <w:r>
+        <w:t>CONSTRAINT ck_dim_fecha_sk CHECK (sk_fecha = EXTRACT(YEAR FROM fecha) * 10000</w:t>
+      </w:r>
+    </w:p>
+    <w:p>
+      <w:pPr>
+        <w:spacing w:after="0"/>
+        <w:ind w:left="1134"/>
+      </w:pPr>
+      <w:r>
+        <w:t>+ EXTRACT(MONTH FROM fecha) * 100</w:t>
+      </w:r>
+    </w:p>
+    <w:p>
+      <w:pPr>
+        <w:spacing w:after="0"/>
+        <w:ind w:left="1134"/>
+      </w:pPr>
+      <w:r>
+        <w:t>+ EXTRACT(DAY FROM fecha)),</w:t>
+      </w:r>
+    </w:p>
+    <w:p>
+      <w:pPr>
+        <w:spacing w:after="0"/>
+        <w:ind w:left="567"/>
+      </w:pPr>
+      <w:r>
+        <w:t>CONSTRAINT ck_dim_fecha_dia CHECK (dia BETWEEN 1 AND 31),</w:t>
+      </w:r>
+    </w:p>
+    <w:p>
+      <w:pPr>
+        <w:spacing w:after="0"/>
+        <w:ind w:left="567"/>
+      </w:pPr>
+      <w:r>
+        <w:t>CONSTRAINT ck_dim_fecha_dia_semana CHECK (dia_semana BETWEEN 1 AND 7),</w:t>
+      </w:r>
+    </w:p>
+    <w:p>
+      <w:pPr>
+        <w:spacing w:after="0"/>
+        <w:ind w:left="567"/>
+      </w:pPr>
+      <w:r>
+        <w:t>CONSTRAINT ck_dim_fecha_mes CHECK (mes BETWEEN 1 AND 12),</w:t>
+      </w:r>
+    </w:p>
+    <w:p>
+      <w:pPr>
+        <w:spacing w:after="0"/>
+        <w:ind w:left="567"/>
+      </w:pPr>
+      <w:r>
+        <w:t>CONSTRAINT ck_dim_fecha_trimestre CHECK (trimestre BETWEEN 1 AND 4)</w:t>
+      </w:r>
+    </w:p>
+    <w:p>
+      <w:pPr>
+        <w:spacing w:after="0"/>
+        <w:ind w:left="0"/>
+      </w:pPr>
+      <w:r>
+        <w:t>);</w:t>
+      </w:r>
+    </w:p>
+    <w:p>
+      <w:pPr>
+        <w:spacing w:after="0"/>
+        <w:ind w:left="0"/>
+      </w:pPr>
+      <w:r/>
+    </w:p>
+    <w:p>
+      <w:pPr>
+        <w:spacing w:after="0"/>
+        <w:ind w:left="0"/>
+      </w:pPr>
+      <w:r>
+        <w:t>CREATE TABLE dim_hora (</w:t>
+      </w:r>
+    </w:p>
+    <w:p>
+      <w:pPr>
+        <w:spacing w:after="0"/>
+        <w:ind w:left="567"/>
+      </w:pPr>
+      <w:r>
+        <w:t>sk_hora SMALLINT NOT NULL,</w:t>
+      </w:r>
+    </w:p>
+    <w:p>
+      <w:pPr>
+        <w:spacing w:after="0"/>
+        <w:ind w:left="567"/>
+      </w:pPr>
+      <w:r>
+        <w:t>hora_texto CHAR(5) NOT NULL,</w:t>
+      </w:r>
+    </w:p>
+    <w:p>
+      <w:pPr>
+        <w:spacing w:after="0"/>
+        <w:ind w:left="567"/>
+      </w:pPr>
+      <w:r>
+        <w:t>franja_horaria VARCHAR(10) NOT NULL,</w:t>
+      </w:r>
+    </w:p>
+    <w:p>
+      <w:pPr>
+        <w:spacing w:after="0"/>
+        <w:ind w:left="567"/>
+      </w:pPr>
+      <w:r>
+        <w:t>CONSTRAINT pk_dim_hora PRIMARY KEY (sk_hora),</w:t>
+      </w:r>
+    </w:p>
+    <w:p>
+      <w:pPr>
+        <w:spacing w:after="0"/>
+        <w:ind w:left="567"/>
+      </w:pPr>
+      <w:r>
+        <w:t>CONSTRAINT ck_dim_hora CHECK (sk_hora BETWEEN 0 AND 23),</w:t>
+      </w:r>
+    </w:p>
+    <w:p>
+      <w:pPr>
+        <w:spacing w:after="0"/>
+        <w:ind w:left="567"/>
+      </w:pPr>
+      <w:r>
+        <w:t>CONSTRAINT ck_dim_hora_franja CHECK (franja_horaria IN ('Madrugada', 'Mañana', 'Tarde', 'Noche'))</w:t>
+      </w:r>
+    </w:p>
+    <w:p>
+      <w:pPr>
+        <w:spacing w:after="0"/>
+        <w:ind w:left="0"/>
+      </w:pPr>
+      <w:r>
+        <w:t>);</w:t>
+      </w:r>
+    </w:p>
+    <w:p>
+      <w:pPr>
+        <w:spacing w:after="0"/>
+        <w:ind w:left="0"/>
+      </w:pPr>
+      <w:r/>
+    </w:p>
+    <w:p>
+      <w:pPr>
+        <w:spacing w:after="0"/>
+        <w:ind w:left="0"/>
+      </w:pPr>
+      <w:r>
+        <w:t>CREATE TABLE dim_aerolinea (</w:t>
+      </w:r>
+    </w:p>
+    <w:p>
+      <w:pPr>
+        <w:spacing w:after="0"/>
+        <w:ind w:left="567"/>
+      </w:pPr>
+      <w:r>
+        <w:t>sk_aerolinea INTEGER GENERATED BY DEFAULT AS IDENTITY,</w:t>
+      </w:r>
+    </w:p>
+    <w:p>
+      <w:pPr>
+        <w:spacing w:after="0"/>
+        <w:ind w:left="567"/>
+      </w:pPr>
+      <w:r>
+        <w:t>codigo_iata VARCHAR(3) NOT NULL,</w:t>
+      </w:r>
+    </w:p>
+    <w:p>
+      <w:pPr>
+        <w:spacing w:after="0"/>
+        <w:ind w:left="567"/>
+      </w:pPr>
+      <w:r>
+        <w:t>nombre_aerolinea VARCHAR(100) NOT NULL,</w:t>
+      </w:r>
+    </w:p>
+    <w:p>
+      <w:pPr>
+        <w:spacing w:after="0"/>
+        <w:ind w:left="567"/>
+      </w:pPr>
+      <w:r>
+        <w:t>CONSTRAINT pk_dim_aerolinea PRIMARY KEY (sk_aerolinea),</w:t>
+      </w:r>
+    </w:p>
+    <w:p>
+      <w:pPr>
+        <w:spacing w:after="0"/>
+        <w:ind w:left="567"/>
+      </w:pPr>
+      <w:r>
+        <w:t>CONSTRAINT uq_dim_aerolinea_codigo UNIQUE (codigo_iata)</w:t>
+      </w:r>
+    </w:p>
+    <w:p>
+      <w:pPr>
+        <w:spacing w:after="0"/>
+        <w:ind w:left="0"/>
+      </w:pPr>
+      <w:r>
+        <w:t>);</w:t>
+      </w:r>
+    </w:p>
+    <w:p>
+      <w:pPr>
+        <w:spacing w:after="0"/>
+        <w:ind w:left="0"/>
+      </w:pPr>
+      <w:r/>
+    </w:p>
+    <w:p>
+      <w:pPr>
+        <w:spacing w:after="0"/>
+        <w:ind w:left="0"/>
+      </w:pPr>
+      <w:r>
+        <w:t>CREATE TABLE dim_aeropuerto (</w:t>
+      </w:r>
+    </w:p>
+    <w:p>
+      <w:pPr>
+        <w:spacing w:after="0"/>
+        <w:ind w:left="567"/>
+      </w:pPr>
+      <w:r>
+        <w:t>sk_aeropuerto INTEGER GENERATED BY DEFAULT AS IDENTITY,</w:t>
+      </w:r>
+    </w:p>
+    <w:p>
+      <w:pPr>
+        <w:spacing w:after="0"/>
+        <w:ind w:left="567"/>
+      </w:pPr>
+      <w:r>
+        <w:t>codigo_iata VARCHAR(3) NOT NULL,</w:t>
+      </w:r>
+    </w:p>
+    <w:p>
+      <w:pPr>
+        <w:spacing w:after="0"/>
+        <w:ind w:left="567"/>
+      </w:pPr>
+      <w:r>
+        <w:t>nombre_aeropuerto VARCHAR(150) NOT NULL,</w:t>
+      </w:r>
+    </w:p>
+    <w:p>
+      <w:pPr>
+        <w:spacing w:after="0"/>
+        <w:ind w:left="567"/>
+      </w:pPr>
+      <w:r>
+        <w:t>ciudad VARCHAR(80) NOT NULL,</w:t>
+      </w:r>
+    </w:p>
+    <w:p>
+      <w:pPr>
+        <w:spacing w:after="0"/>
+        <w:ind w:left="567"/>
+      </w:pPr>
+      <w:r>
+        <w:t>estado CHAR(2) NOT NULL,</w:t>
+      </w:r>
+    </w:p>
+    <w:p>
+      <w:pPr>
+        <w:spacing w:after="0"/>
+        <w:ind w:left="567"/>
+      </w:pPr>
+      <w:r>
+        <w:t>region VARCHAR(15) NOT NULL,</w:t>
+      </w:r>
+    </w:p>
+    <w:p>
+      <w:pPr>
+        <w:spacing w:after="0"/>
+        <w:ind w:left="567"/>
+      </w:pPr>
+      <w:r>
+        <w:t>pais VARCHAR(30) NOT NULL,</w:t>
+      </w:r>
+    </w:p>
+    <w:p>
+      <w:pPr>
+        <w:spacing w:after="0"/>
+        <w:ind w:left="567"/>
+      </w:pPr>
+      <w:r>
+        <w:t>latitud NUMERIC(9,6) NULL,</w:t>
+      </w:r>
+    </w:p>
+    <w:p>
+      <w:pPr>
+        <w:spacing w:after="0"/>
+        <w:ind w:left="567"/>
+      </w:pPr>
+      <w:r>
+        <w:t>longitud NUMERIC(9,6) NULL,</w:t>
+      </w:r>
+    </w:p>
+    <w:p>
+      <w:pPr>
+        <w:spacing w:after="0"/>
+        <w:ind w:left="567"/>
+      </w:pPr>
+      <w:r>
+        <w:t>CONSTRAINT pk_dim_aeropuerto PRIMARY KEY (sk_aeropuerto),</w:t>
+      </w:r>
+    </w:p>
+    <w:p>
+      <w:pPr>
+        <w:spacing w:after="0"/>
+        <w:ind w:left="567"/>
+      </w:pPr>
+      <w:r>
+        <w:t>CONSTRAINT uq_dim_aeropuerto_codigo UNIQUE (codigo_iata),</w:t>
+      </w:r>
+    </w:p>
+    <w:p>
+      <w:pPr>
+        <w:spacing w:after="0"/>
+        <w:ind w:left="567"/>
+      </w:pPr>
+      <w:r>
+        <w:t>CONSTRAINT ck_dim_aeropuerto_region CHECK (region IN</w:t>
+      </w:r>
+    </w:p>
+    <w:p>
+      <w:pPr>
+        <w:spacing w:after="0"/>
+        <w:ind w:left="1134"/>
+      </w:pPr>
+      <w:r>
+        <w:t>('Noreste', 'Medio Oeste', 'Sur', 'Oeste', 'Territorios', 'Desconocida')),</w:t>
+      </w:r>
+    </w:p>
+    <w:p>
+      <w:pPr>
+        <w:spacing w:after="0"/>
+        <w:ind w:left="567"/>
+      </w:pPr>
+      <w:r>
+        <w:t>CONSTRAINT ck_dim_aeropuerto_latitud CHECK (latitud BETWEEN -90 AND 90),</w:t>
+      </w:r>
+    </w:p>
+    <w:p>
+      <w:pPr>
+        <w:spacing w:after="0"/>
+        <w:ind w:left="567"/>
+      </w:pPr>
+      <w:r>
+        <w:t>CONSTRAINT ck_dim_aeropuerto_longitud CHECK (longitud BETWEEN -180 AND 180)</w:t>
+      </w:r>
+    </w:p>
+    <w:p>
+      <w:pPr>
+        <w:spacing w:after="0"/>
+        <w:ind w:left="0"/>
+      </w:pPr>
+      <w:r>
+        <w:t>);</w:t>
+      </w:r>
+    </w:p>
+    <w:p>
+      <w:pPr>
+        <w:spacing w:after="0"/>
+        <w:ind w:left="0"/>
+      </w:pPr>
+      <w:r/>
+    </w:p>
+    <w:p>
+      <w:pPr>
+        <w:spacing w:after="0"/>
+        <w:ind w:left="0"/>
+      </w:pPr>
+      <w:r>
+        <w:t>CREATE TABLE dim_motivo_cancelacion (</w:t>
+      </w:r>
+    </w:p>
+    <w:p>
+      <w:pPr>
+        <w:spacing w:after="0"/>
+        <w:ind w:left="567"/>
+      </w:pPr>
+      <w:r>
+        <w:t>sk_motivo_cancelacion SMALLINT NOT NULL,</w:t>
+      </w:r>
+    </w:p>
+    <w:p>
+      <w:pPr>
+        <w:spacing w:after="0"/>
+        <w:ind w:left="567"/>
+      </w:pPr>
+      <w:r>
+        <w:t>codigo_motivo CHAR(1) NOT NULL,</w:t>
+      </w:r>
+    </w:p>
+    <w:p>
+      <w:pPr>
+        <w:spacing w:after="0"/>
+        <w:ind w:left="567"/>
+      </w:pPr>
+      <w:r>
+        <w:t>descripcion VARCHAR(40) NOT NULL,</w:t>
+      </w:r>
+    </w:p>
+    <w:p>
+      <w:pPr>
+        <w:spacing w:after="0"/>
+        <w:ind w:left="567"/>
+      </w:pPr>
+      <w:r>
+        <w:t>CONSTRAINT pk_dim_motivo_cancelacion PRIMARY KEY (sk_motivo_cancelacion),</w:t>
+      </w:r>
+    </w:p>
+    <w:p>
+      <w:pPr>
+        <w:spacing w:after="0"/>
+        <w:ind w:left="567"/>
+      </w:pPr>
+      <w:r>
+        <w:t>CONSTRAINT uq_dim_motivo_cancelacion_codigo UNIQUE (codigo_motivo),</w:t>
+      </w:r>
+    </w:p>
+    <w:p>
+      <w:pPr>
+        <w:spacing w:after="0"/>
+        <w:ind w:left="567"/>
+      </w:pPr>
+      <w:r>
+        <w:t>CONSTRAINT ck_dim_motivo_cancelacion_codigo CHECK (codigo_motivo IN ('N', 'A', 'B', 'C', 'D'))</w:t>
+      </w:r>
+    </w:p>
+    <w:p>
+      <w:pPr>
+        <w:spacing w:after="0"/>
+        <w:ind w:left="0"/>
+      </w:pPr>
+      <w:r>
+        <w:t>);</w:t>
+      </w:r>
+    </w:p>
+    <w:p>
+      <w:pPr>
+        <w:spacing w:after="0"/>
+        <w:ind w:left="0"/>
+      </w:pPr>
+      <w:r/>
+    </w:p>
+    <w:p>
+      <w:pPr>
+        <w:spacing w:after="0"/>
+        <w:ind w:left="0"/>
+      </w:pPr>
+      <w:r>
+        <w:t>CREATE TABLE fact_vuelo (</w:t>
+      </w:r>
+    </w:p>
+    <w:p>
+      <w:pPr>
+        <w:spacing w:after="0"/>
+        <w:ind w:left="567"/>
+      </w:pPr>
+      <w:r>
+        <w:t>sk_vuelo BIGINT GENERATED BY DEFAULT AS IDENTITY,</w:t>
+      </w:r>
+    </w:p>
+    <w:p>
+      <w:pPr>
+        <w:spacing w:after="0"/>
+        <w:ind w:left="567"/>
+      </w:pPr>
+      <w:r>
+        <w:t>sk_fecha INTEGER NOT NULL,</w:t>
+      </w:r>
+    </w:p>
+    <w:p>
+      <w:pPr>
+        <w:spacing w:after="0"/>
+        <w:ind w:left="567"/>
+      </w:pPr>
+      <w:r>
+        <w:t>sk_hora_salida SMALLINT NOT NULL,</w:t>
+      </w:r>
+    </w:p>
+    <w:p>
+      <w:pPr>
+        <w:spacing w:after="0"/>
+        <w:ind w:left="567"/>
+      </w:pPr>
+      <w:r>
+        <w:t>sk_aerolinea INTEGER NOT NULL,</w:t>
+      </w:r>
+    </w:p>
+    <w:p>
+      <w:pPr>
+        <w:spacing w:after="0"/>
+        <w:ind w:left="567"/>
+      </w:pPr>
+      <w:r>
+        <w:t>sk_aeropuerto_origen INTEGER NOT NULL,</w:t>
+      </w:r>
+    </w:p>
+    <w:p>
+      <w:pPr>
+        <w:spacing w:after="0"/>
+        <w:ind w:left="567"/>
+      </w:pPr>
+      <w:r>
+        <w:t>sk_aeropuerto_destino INTEGER NOT NULL,</w:t>
+      </w:r>
+    </w:p>
+    <w:p>
+      <w:pPr>
+        <w:spacing w:after="0"/>
+        <w:ind w:left="567"/>
+      </w:pPr>
+      <w:r>
+        <w:t>sk_motivo_cancelacion SMALLINT NOT NULL,</w:t>
+      </w:r>
+    </w:p>
+    <w:p>
+      <w:pPr>
+        <w:spacing w:after="0"/>
+        <w:ind w:left="567"/>
+      </w:pPr>
+      <w:r>
+        <w:t>numero_vuelo INTEGER NOT NULL,</w:t>
+      </w:r>
+    </w:p>
+    <w:p>
+      <w:pPr>
+        <w:spacing w:after="0"/>
+        <w:ind w:left="567"/>
+      </w:pPr>
+      <w:r>
+        <w:t>matricula_avion VARCHAR(10) NULL,</w:t>
+      </w:r>
+    </w:p>
+    <w:p>
+      <w:pPr>
+        <w:spacing w:after="0"/>
+        <w:ind w:left="567"/>
+      </w:pPr>
+      <w:r>
+        <w:t>salida_programada TIME NOT NULL,</w:t>
+      </w:r>
+    </w:p>
+    <w:p>
+      <w:pPr>
+        <w:spacing w:after="0"/>
+        <w:ind w:left="567"/>
+      </w:pPr>
+      <w:r>
+        <w:t>retraso_salida_min SMALLINT NULL,</w:t>
+      </w:r>
+    </w:p>
+    <w:p>
+      <w:pPr>
+        <w:spacing w:after="0"/>
+        <w:ind w:left="567"/>
+      </w:pPr>
+      <w:r>
+        <w:t>retraso_llegada_min SMALLINT NULL,</w:t>
+      </w:r>
+    </w:p>
+    <w:p>
+      <w:pPr>
+        <w:spacing w:after="0"/>
+        <w:ind w:left="567"/>
+      </w:pPr>
+      <w:r>
+        <w:t>taxi_salida_min SMALLINT NULL,</w:t>
+      </w:r>
+    </w:p>
+    <w:p>
+      <w:pPr>
+        <w:spacing w:after="0"/>
+        <w:ind w:left="567"/>
+      </w:pPr>
+      <w:r>
+        <w:t>taxi_llegada_min SMALLINT NULL,</w:t>
+      </w:r>
+    </w:p>
+    <w:p>
+      <w:pPr>
+        <w:spacing w:after="0"/>
+        <w:ind w:left="567"/>
+      </w:pPr>
+      <w:r>
+        <w:t>tiempo_programado_min SMALLINT NULL,</w:t>
+      </w:r>
+    </w:p>
+    <w:p>
+      <w:pPr>
+        <w:spacing w:after="0"/>
+        <w:ind w:left="567"/>
+      </w:pPr>
+      <w:r>
+        <w:t>tiempo_real_min SMALLINT NULL,</w:t>
+      </w:r>
+    </w:p>
+    <w:p>
+      <w:pPr>
+        <w:spacing w:after="0"/>
+        <w:ind w:left="567"/>
+      </w:pPr>
+      <w:r>
+        <w:t>tiempo_aire_min SMALLINT NULL,</w:t>
+      </w:r>
+    </w:p>
+    <w:p>
+      <w:pPr>
+        <w:spacing w:after="0"/>
+        <w:ind w:left="567"/>
+      </w:pPr>
+      <w:r>
+        <w:t>distancia_millas SMALLINT NOT NULL,</w:t>
+      </w:r>
+    </w:p>
+    <w:p>
+      <w:pPr>
+        <w:spacing w:after="0"/>
+        <w:ind w:left="567"/>
+      </w:pPr>
+      <w:r>
+        <w:t>retraso_aerolinea_min SMALLINT NOT NULL DEFAULT 0,</w:t>
+      </w:r>
+    </w:p>
+    <w:p>
+      <w:pPr>
+        <w:spacing w:after="0"/>
+        <w:ind w:left="567"/>
+      </w:pPr>
+      <w:r>
+        <w:t>retraso_clima_min SMALLINT NOT NULL DEFAULT 0,</w:t>
+      </w:r>
+    </w:p>
+    <w:p>
+      <w:pPr>
+        <w:spacing w:after="0"/>
+        <w:ind w:left="567"/>
+      </w:pPr>
+      <w:r>
+        <w:t>retraso_sistema_aereo_min SMALLINT NOT NULL DEFAULT 0,</w:t>
+      </w:r>
+    </w:p>
+    <w:p>
+      <w:pPr>
+        <w:spacing w:after="0"/>
+        <w:ind w:left="567"/>
+      </w:pPr>
+      <w:r>
+        <w:t>retraso_seguridad_min SMALLINT NOT NULL DEFAULT 0,</w:t>
+      </w:r>
+    </w:p>
+    <w:p>
+      <w:pPr>
+        <w:spacing w:after="0"/>
+        <w:ind w:left="567"/>
+      </w:pPr>
+      <w:r>
+        <w:t>retraso_avion_tardio_min SMALLINT NOT NULL DEFAULT 0,</w:t>
+      </w:r>
+    </w:p>
+    <w:p>
+      <w:pPr>
+        <w:spacing w:after="0"/>
+        <w:ind w:left="567"/>
+      </w:pPr>
+      <w:r>
+        <w:t>es_cancelado SMALLINT NOT NULL DEFAULT 0,</w:t>
+      </w:r>
+    </w:p>
+    <w:p>
+      <w:pPr>
+        <w:spacing w:after="0"/>
+        <w:ind w:left="567"/>
+      </w:pPr>
+      <w:r>
+        <w:t>es_desviado SMALLINT NOT NULL DEFAULT 0,</w:t>
+      </w:r>
+    </w:p>
+    <w:p>
+      <w:pPr>
+        <w:spacing w:after="0"/>
+        <w:ind w:left="567"/>
+      </w:pPr>
+      <w:r>
+        <w:t>es_retrasado SMALLINT NOT NULL DEFAULT 0,</w:t>
+      </w:r>
+    </w:p>
+    <w:p>
+      <w:pPr>
+        <w:spacing w:after="0"/>
+        <w:ind w:left="567"/>
+      </w:pPr>
+      <w:r>
+        <w:t>es_puntual SMALLINT NOT NULL DEFAULT 0,</w:t>
+      </w:r>
+    </w:p>
+    <w:p>
+      <w:pPr>
+        <w:spacing w:after="0"/>
+        <w:ind w:left="567"/>
+      </w:pPr>
+      <w:r>
+        <w:t>fecha_carga TIMESTAMP NOT NULL DEFAULT CURRENT_TIMESTAMP,</w:t>
+      </w:r>
+    </w:p>
+    <w:p>
+      <w:pPr>
+        <w:spacing w:after="0"/>
+        <w:ind w:left="0"/>
+      </w:pPr>
+      <w:r/>
+    </w:p>
+    <w:p>
+      <w:pPr>
+        <w:spacing w:after="0"/>
+        <w:ind w:left="567"/>
+      </w:pPr>
+      <w:r>
+        <w:t>CONSTRAINT pk_fact_vuelo PRIMARY KEY (sk_vuelo),</w:t>
+      </w:r>
+    </w:p>
+    <w:p>
+      <w:pPr>
+        <w:spacing w:after="0"/>
+        <w:ind w:left="567"/>
+      </w:pPr>
+      <w:r>
+        <w:t>CONSTRAINT uq_fact_vuelo_natural UNIQUE (sk_fecha, sk_aerolinea, numero_vuelo,</w:t>
+      </w:r>
+    </w:p>
+    <w:p>
+      <w:pPr>
+        <w:spacing w:after="0"/>
+        <w:ind w:left="1134"/>
+      </w:pPr>
+      <w:r>
+        <w:t>sk_aeropuerto_origen, salida_programada),</w:t>
+      </w:r>
+    </w:p>
+    <w:p>
+      <w:pPr>
+        <w:spacing w:after="0"/>
+        <w:ind w:left="0"/>
+      </w:pPr>
+      <w:r/>
+    </w:p>
+    <w:p>
+      <w:pPr>
+        <w:spacing w:after="0"/>
+        <w:ind w:left="567"/>
+      </w:pPr>
+      <w:r>
+        <w:t>CONSTRAINT fk_fact_vuelo_fecha FOREIGN KEY (sk_fecha) REFERENCES dim_fecha (sk_fecha),</w:t>
+      </w:r>
+    </w:p>
+    <w:p>
+      <w:pPr>
+        <w:spacing w:after="0"/>
+        <w:ind w:left="567"/>
+      </w:pPr>
+      <w:r>
+        <w:t>CONSTRAINT fk_fact_vuelo_hora FOREIGN KEY (sk_hora_salida) REFERENCES dim_hora (sk_hora),</w:t>
+      </w:r>
+    </w:p>
+    <w:p>
+      <w:pPr>
+        <w:spacing w:after="0"/>
+        <w:ind w:left="567"/>
+      </w:pPr>
+      <w:r>
+        <w:t>CONSTRAINT fk_fact_vuelo_aerolinea FOREIGN KEY (sk_aerolinea) REFERENCES dim_aerolinea (sk_aerolinea),</w:t>
+      </w:r>
+    </w:p>
+    <w:p>
+      <w:pPr>
+        <w:spacing w:after="0"/>
+        <w:ind w:left="567"/>
+      </w:pPr>
+      <w:r>
+        <w:t>CONSTRAINT fk_fact_vuelo_origen FOREIGN KEY (sk_aeropuerto_origen) REFERENCES dim_aeropuerto (sk_aeropuerto),</w:t>
+      </w:r>
+    </w:p>
+    <w:p>
+      <w:pPr>
+        <w:spacing w:after="0"/>
+        <w:ind w:left="567"/>
+      </w:pPr>
+      <w:r>
+        <w:t>CONSTRAINT fk_fact_vuelo_destino FOREIGN KEY (sk_aeropuerto_destino) REFERENCES dim_aeropuerto (sk_aeropuerto),</w:t>
+      </w:r>
+    </w:p>
+    <w:p>
+      <w:pPr>
+        <w:spacing w:after="0"/>
+        <w:ind w:left="567"/>
+      </w:pPr>
+      <w:r>
+        <w:t>CONSTRAINT fk_fact_vuelo_motivo FOREIGN KEY (sk_motivo_cancelacion) REFERENCES dim_motivo_cancelacion (sk_motivo_cancelacion),</w:t>
+      </w:r>
+    </w:p>
+    <w:p>
+      <w:pPr>
+        <w:spacing w:after="0"/>
+        <w:ind w:left="0"/>
+      </w:pPr>
+      <w:r/>
+    </w:p>
+    <w:p>
+      <w:pPr>
+        <w:spacing w:after="0"/>
+        <w:ind w:left="567"/>
+      </w:pPr>
+      <w:r>
+        <w:t>CONSTRAINT ck_fact_vuelo_numero CHECK (numero_vuelo &gt; 0),</w:t>
+      </w:r>
+    </w:p>
+    <w:p>
+      <w:pPr>
+        <w:spacing w:after="0"/>
+        <w:ind w:left="567"/>
+      </w:pPr>
+      <w:r>
+        <w:t>CONSTRAINT ck_fact_vuelo_distancia CHECK (distancia_millas &gt; 0),</w:t>
+      </w:r>
+    </w:p>
+    <w:p>
+      <w:pPr>
+        <w:spacing w:after="0"/>
+        <w:ind w:left="567"/>
+      </w:pPr>
+      <w:r>
+        <w:t>CONSTRAINT ck_fact_vuelo_taxi CHECK (taxi_salida_min &gt;= 0 AND taxi_llegada_min &gt;= 0),</w:t>
+      </w:r>
+    </w:p>
+    <w:p>
+      <w:pPr>
+        <w:spacing w:after="0"/>
+        <w:ind w:left="567"/>
+      </w:pPr>
+      <w:r>
+        <w:t>CONSTRAINT ck_fact_vuelo_tiempos CHECK (tiempo_programado_min &gt; 0 AND tiempo_real_min &gt; 0 AND tiempo_aire_min &gt; 0),</w:t>
+      </w:r>
+    </w:p>
+    <w:p>
+      <w:pPr>
+        <w:spacing w:after="0"/>
+        <w:ind w:left="567"/>
+      </w:pPr>
+      <w:r>
+        <w:t>CONSTRAINT ck_fact_vuelo_causas CHECK (</w:t>
+      </w:r>
+    </w:p>
+    <w:p>
+      <w:pPr>
+        <w:spacing w:after="0"/>
+        <w:ind w:left="1134"/>
+      </w:pPr>
+      <w:r>
+        <w:t>retraso_aerolinea_min &gt;= 0 AND retraso_clima_min &gt;= 0 AND retraso_sistema_aereo_min &gt;= 0 AND</w:t>
+      </w:r>
+    </w:p>
+    <w:p>
+      <w:pPr>
+        <w:spacing w:after="0"/>
+        <w:ind w:left="1134"/>
+      </w:pPr>
+      <w:r>
+        <w:t>retraso_seguridad_min &gt;= 0 AND retraso_avion_tardio_min &gt;= 0),</w:t>
+      </w:r>
+    </w:p>
+    <w:p>
+      <w:pPr>
+        <w:spacing w:after="0"/>
+        <w:ind w:left="567"/>
+      </w:pPr>
+      <w:r>
+        <w:t>CONSTRAINT ck_fact_vuelo_ruta CHECK (sk_aeropuerto_origen &lt;&gt; sk_aeropuerto_destino OR sk_aeropuerto_origen = -1),</w:t>
+      </w:r>
+    </w:p>
+    <w:p>
+      <w:pPr>
+        <w:spacing w:after="0"/>
+        <w:ind w:left="0"/>
+      </w:pPr>
+      <w:r/>
+    </w:p>
+    <w:p>
+      <w:pPr>
+        <w:spacing w:after="0"/>
+        <w:ind w:left="567"/>
+      </w:pPr>
+      <w:r>
+        <w:t>CONSTRAINT ck_fact_vuelo_indicadores CHECK (</w:t>
+      </w:r>
+    </w:p>
+    <w:p>
+      <w:pPr>
+        <w:spacing w:after="0"/>
+        <w:ind w:left="1134"/>
+      </w:pPr>
+      <w:r>
+        <w:t>es_cancelado IN (0, 1) AND es_desviado IN (0, 1) AND es_retrasado IN (0, 1) AND es_puntual IN (0, 1)),</w:t>
+      </w:r>
+    </w:p>
+    <w:p>
+      <w:pPr>
+        <w:spacing w:after="0"/>
+        <w:ind w:left="567"/>
+      </w:pPr>
+      <w:r>
+        <w:t>CONSTRAINT ck_fact_vuelo_un_estado CHECK (es_cancelado + es_desviado + es_retrasado + es_puntual &lt;= 1),</w:t>
+      </w:r>
+    </w:p>
+    <w:p>
+      <w:pPr>
+        <w:spacing w:after="0"/>
+        <w:ind w:left="567"/>
+      </w:pPr>
+      <w:r>
+        <w:t>CONSTRAINT ck_fact_vuelo_cancelado CHECK ((es_cancelado = 1) = (sk_motivo_cancelacion &lt;&gt; 0)),</w:t>
+      </w:r>
+    </w:p>
+    <w:p>
+      <w:pPr>
+        <w:spacing w:after="0"/>
+        <w:ind w:left="567"/>
+      </w:pPr>
+      <w:r>
+        <w:t>CONSTRAINT ck_fact_vuelo_cancelado_sin_llegada CHECK (es_cancelado = 0 OR retraso_llegada_min IS NULL),</w:t>
+      </w:r>
+    </w:p>
+    <w:p>
+      <w:pPr>
+        <w:spacing w:after="0"/>
+        <w:ind w:left="567"/>
+      </w:pPr>
+      <w:r>
+        <w:t>CONSTRAINT ck_fact_vuelo_retrasado CHECK ((es_retrasado = 1) = (COALESCE(retraso_llegada_min, -1) &gt;= 15)),</w:t>
+      </w:r>
+    </w:p>
+    <w:p>
+      <w:pPr>
+        <w:spacing w:after="0"/>
+        <w:ind w:left="567"/>
+      </w:pPr>
+      <w:r>
+        <w:t>CONSTRAINT ck_fact_vuelo_puntual CHECK ((es_puntual = 1) = (COALESCE(retraso_llegada_min, 15) &lt; 15))</w:t>
+      </w:r>
+    </w:p>
+    <w:p>
+      <w:pPr>
+        <w:spacing w:after="0"/>
+        <w:ind w:left="0"/>
+      </w:pPr>
+      <w:r>
+        <w:t>);</w:t>
+      </w:r>
+    </w:p>
+    <w:p>
+      <w:pPr>
+        <w:spacing w:after="0"/>
+        <w:ind w:left="0"/>
+      </w:pPr>
+      <w:r/>
+    </w:p>
+    <w:p>
+      <w:pPr>
+        <w:spacing w:after="0"/>
+        <w:ind w:left="0"/>
+      </w:pPr>
+      <w:r/>
+    </w:p>
+    <w:p>
+      <w:pPr>
+        <w:spacing w:after="0"/>
+        <w:ind w:left="0"/>
+      </w:pPr>
+      <w:r>
+        <w:t>SET search_path TO dw_vuelos;</w:t>
+      </w:r>
+    </w:p>
+    <w:p>
+      <w:pPr>
+        <w:spacing w:after="0"/>
+        <w:ind w:left="0"/>
+      </w:pPr>
+      <w:r/>
+    </w:p>
+    <w:p>
+      <w:pPr>
+        <w:spacing w:after="0"/>
+        <w:ind w:left="0"/>
+      </w:pPr>
+      <w:r>
+        <w:t>CREATE INDEX ix_fact_vuelo_hora ON fact_vuelo (sk_hora_salida);</w:t>
+      </w:r>
+    </w:p>
+    <w:p>
+      <w:pPr>
+        <w:spacing w:after="0"/>
+        <w:ind w:left="0"/>
+      </w:pPr>
+      <w:r>
+        <w:t>CREATE INDEX ix_fact_vuelo_destino ON fact_vuelo (sk_aeropuerto_destino);</w:t>
+      </w:r>
+    </w:p>
+    <w:p>
+      <w:pPr>
+        <w:spacing w:after="0"/>
+        <w:ind w:left="0"/>
+      </w:pPr>
+      <w:r>
+        <w:t>CREATE INDEX ix_fact_vuelo_motivo ON fact_vuelo (sk_motivo_cancelacion);</w:t>
+      </w:r>
+    </w:p>
+    <w:p>
+      <w:pPr>
+        <w:spacing w:after="0"/>
+        <w:ind w:left="0"/>
+      </w:pPr>
+      <w:r/>
+    </w:p>
+    <w:p>
+      <w:pPr>
+        <w:spacing w:after="0"/>
+        <w:ind w:left="0"/>
+      </w:pPr>
+      <w:r>
+        <w:t>CREATE INDEX ix_fact_vuelo_aerolinea_fecha ON fact_vuelo (sk_aerolinea, sk_fecha);</w:t>
+      </w:r>
+    </w:p>
+    <w:p>
+      <w:pPr>
+        <w:spacing w:after="0"/>
+        <w:ind w:left="0"/>
+      </w:pPr>
+      <w:r>
+        <w:t>CREATE INDEX ix_fact_vuelo_ruta ON fact_vuelo (sk_aeropuerto_origen, sk_aeropuerto_destino);</w:t>
+      </w:r>
+    </w:p>
+    <w:p>
+      <w:pPr>
+        <w:spacing w:after="0"/>
+        <w:ind w:left="0"/>
+      </w:pPr>
+      <w:r/>
+    </w:p>
+    <w:p>
+      <w:pPr>
+        <w:spacing w:after="0"/>
+        <w:ind w:left="0"/>
+      </w:pPr>
+      <w:r>
+        <w:t>CREATE INDEX ix_fact_vuelo_cancelados ON fact_vuelo (sk_aerolinea, sk_motivo_cancelacion)</w:t>
+      </w:r>
+    </w:p>
+    <w:p>
+      <w:pPr>
+        <w:spacing w:after="0"/>
+        <w:ind w:left="567"/>
+      </w:pPr>
+      <w:r>
+        <w:t>WHERE es_cancelado = 1;</w:t>
+      </w:r>
+    </w:p>
+    <w:p>
+      <w:pPr>
+        <w:spacing w:after="0"/>
+        <w:ind w:left="0"/>
+      </w:pPr>
+      <w:r/>
+    </w:p>
+    <w:p>
+      <w:pPr>
+        <w:spacing w:after="0"/>
+        <w:ind w:left="0"/>
+      </w:pPr>
+      <w:r>
+        <w:t>CREATE INDEX ix_dim_fecha_anio_mes ON dim_fecha (anio, mes);</w:t>
+      </w:r>
+    </w:p>
+    <w:p>
+      <w:pPr>
+        <w:spacing w:after="0"/>
+        <w:ind w:left="0"/>
+      </w:pPr>
+      <w:r>
+        <w:t>CREATE INDEX ix_dim_fecha_dia_semana ON dim_fecha (dia_semana);</w:t>
+      </w:r>
+    </w:p>
+    <w:p>
+      <w:pPr>
+        <w:spacing w:after="0"/>
+        <w:ind w:left="0"/>
+      </w:pPr>
+      <w:r>
+        <w:t>CREATE INDEX ix_dim_hora_franja ON dim_hora (franja_horaria);</w:t>
+      </w:r>
+    </w:p>
+    <w:p>
+      <w:pPr>
+        <w:spacing w:after="0"/>
+        <w:ind w:left="0"/>
+      </w:pPr>
+      <w:r>
+        <w:t>CREATE INDEX ix_dim_aeropuerto_region ON dim_aeropuerto (region, estado);</w:t>
+      </w:r>
+    </w:p>
+    <w:p>
+      <w:pPr>
+        <w:spacing w:after="0"/>
+        <w:ind w:left="0"/>
+      </w:pPr>
+      <w:r>
+        <w:t>CREATE INDEX ix_dim_aeropuerto_ciudad ON dim_aeropuerto (ciudad);</w:t>
+      </w:r>
+    </w:p>
     <w:sectPr>
       <w:pgSz w:w="11906" w:h="16838"/>
       <w:pgMar w:top="1417" w:right="1417" w:bottom="1417" w:left="1417" w:header="720" w:footer="720" w:gutter="0"/>

</xml_diff>

<commit_message>
Agregar los diagramas conceptual y lógico y revisar el documento
Los puntos 3 y 4 incluyen ahora el diagrama del modelo conceptual (hecho,
dimensiones y jerarquías) y el del modelo lógico (tablas, atributos,
claves y relaciones); el físico pasa a ser la Figura 3. Se completan las
listas de atributos del modelo lógico, los indicadores indican cómo se
miden y se nombran los reportes y el cuadro de mando previstos.

Co-Authored-By: Claude Opus 5.5 <noreply@anthropic.com>
Claude-Session: https://claude.ai/code/session_01UrpbqW5jvhcx6qo3xxD3vZ
</commit_message>
<xml_diff>
--- a/proyecto-dw-vuelos/docs/Primera_Presentacion_DW_Vuelos.docx
+++ b/proyecto-dw-vuelos/docs/Primera_Presentacion_DW_Vuelos.docx
@@ -90,7 +90,7 @@
         <w:rPr>
           <w:b w:val="0"/>
         </w:rPr>
-        <w:t xml:space="preserve"> cada vuelo es un evento medible con métricas numéricas (minutos de retraso, tiempos, distancia) y con descriptores que forman dimensiones con jerarquías: fecha → mes → trimestre, hora → franja horaria y aeropuerto → ciudad → estado → región. El volumen y los problemas de calidad (horas en formato hhmm, valores vacíos en vuelos cancelados o desviados, aeropuertos con códigos numéricos en lugar del código IATA en octubre) justifican un Data Warehouse y un proceso ETL.</w:t>
+        <w:t xml:space="preserve"> cada vuelo es un evento medible con métricas numéricas (minutos de retraso, tiempos, distancia) y con descriptores que forman dimensiones con jerarquías: año → trimestre → mes → fecha, franja horaria → hora y región → estado → ciudad → aeropuerto. El volumen y los problemas de calidad (horas en formato hhmm, valores vacíos en vuelos cancelados o desviados, aeropuertos con códigos numéricos en lugar del código IATA en octubre) justifican un Data Warehouse y un proceso ETL.</w:t>
       </w:r>
     </w:p>
     <w:p>
@@ -107,7 +107,7 @@
         <w:rPr>
           <w:b w:val="0"/>
         </w:rPr>
-        <w:t xml:space="preserve"> según la BTS, un vuelo está retrasado si llega 15 minutos o más después de lo programado, y las aerolíneas informan la causa (la propia aerolínea, el clima, el sistema aéreo nacional, la seguridad o la llegada tardía del avión). Los datos están en un solo archivo plano, útil para registrar vuelos pero no para analizarlos. La necesidad es </w:t>
+        <w:t xml:space="preserve"> según la BTS, un vuelo está retrasado si llega 15 minutos o más después de lo programado, y las aerolíneas informan la causa (la propia aerolínea, el clima, el sistema aéreo nacional, la seguridad o la llegada tardía del avión). Los vuelos están en un único archivo plano (flights.csv), útil para registrarlos pero no para analizarlos. La necesidad es </w:t>
       </w:r>
       <w:r>
         <w:rPr>
@@ -165,7 +165,7 @@
         <w:rPr>
           <w:b w:val="0"/>
         </w:rPr>
-        <w:t xml:space="preserve"> (medibles con el indicador indicado):</w:t>
+        <w:t xml:space="preserve"> (cada uno se mide con el indicador indicado y se responde con una consulta SQL):</w:t>
       </w:r>
     </w:p>
     <w:tbl>
@@ -177,8 +177,8 @@
       </w:tblPr>
       <w:tblGrid>
         <w:gridCol w:w="794"/>
-        <w:gridCol w:w="5329"/>
-        <w:gridCol w:w="2948"/>
+        <w:gridCol w:w="4649"/>
+        <w:gridCol w:w="3628"/>
       </w:tblGrid>
       <w:tr>
         <w:trPr>
@@ -202,7 +202,7 @@
         </w:tc>
         <w:tc>
           <w:tcPr>
-            <w:tcW w:type="dxa" w:w="5329"/>
+            <w:tcW w:type="dxa" w:w="4649"/>
           </w:tcPr>
           <w:p>
             <w:pPr>
@@ -218,7 +218,7 @@
         </w:tc>
         <w:tc>
           <w:tcPr>
-            <w:tcW w:type="dxa" w:w="2948"/>
+            <w:tcW w:type="dxa" w:w="3628"/>
           </w:tcPr>
           <w:p>
             <w:pPr>
@@ -228,7 +228,7 @@
               <w:rPr>
                 <w:b/>
               </w:rPr>
-              <w:t>Indicador</w:t>
+              <w:t>Indicador (cómo se mide)</w:t>
             </w:r>
           </w:p>
         </w:tc>
@@ -255,7 +255,7 @@
         </w:tc>
         <w:tc>
           <w:tcPr>
-            <w:tcW w:type="dxa" w:w="5329"/>
+            <w:tcW w:type="dxa" w:w="4649"/>
           </w:tcPr>
           <w:p>
             <w:pPr>
@@ -271,7 +271,7 @@
         </w:tc>
         <w:tc>
           <w:tcPr>
-            <w:tcW w:type="dxa" w:w="2948"/>
+            <w:tcW w:type="dxa" w:w="3628"/>
           </w:tcPr>
           <w:p>
             <w:pPr>
@@ -281,7 +281,7 @@
               <w:rPr>
                 <w:b w:val="0"/>
               </w:rPr>
-              <w:t>% de vuelos puntuales</w:t>
+              <w:t>% puntuales = vuelos con menos de 15 min de retraso / vuelos completados</w:t>
             </w:r>
           </w:p>
         </w:tc>
@@ -308,7 +308,7 @@
         </w:tc>
         <w:tc>
           <w:tcPr>
-            <w:tcW w:type="dxa" w:w="5329"/>
+            <w:tcW w:type="dxa" w:w="4649"/>
           </w:tcPr>
           <w:p>
             <w:pPr>
@@ -324,7 +324,7 @@
         </w:tc>
         <w:tc>
           <w:tcPr>
-            <w:tcW w:type="dxa" w:w="2948"/>
+            <w:tcW w:type="dxa" w:w="3628"/>
           </w:tcPr>
           <w:p>
             <w:pPr>
@@ -334,7 +334,7 @@
               <w:rPr>
                 <w:b w:val="0"/>
               </w:rPr>
-              <w:t>% de cancelación y de desvío</w:t>
+              <w:t>% cancelados y % desviados sobre los vuelos programados</w:t>
             </w:r>
           </w:p>
         </w:tc>
@@ -361,7 +361,7 @@
         </w:tc>
         <w:tc>
           <w:tcPr>
-            <w:tcW w:type="dxa" w:w="5329"/>
+            <w:tcW w:type="dxa" w:w="4649"/>
           </w:tcPr>
           <w:p>
             <w:pPr>
@@ -377,7 +377,7 @@
         </w:tc>
         <w:tc>
           <w:tcPr>
-            <w:tcW w:type="dxa" w:w="2948"/>
+            <w:tcW w:type="dxa" w:w="3628"/>
           </w:tcPr>
           <w:p>
             <w:pPr>
@@ -387,7 +387,7 @@
               <w:rPr>
                 <w:b w:val="0"/>
               </w:rPr>
-              <w:t>% de minutos por causa</w:t>
+              <w:t>% de los minutos de retraso de cada causa</w:t>
             </w:r>
           </w:p>
         </w:tc>
@@ -414,7 +414,7 @@
         </w:tc>
         <w:tc>
           <w:tcPr>
-            <w:tcW w:type="dxa" w:w="5329"/>
+            <w:tcW w:type="dxa" w:w="4649"/>
           </w:tcPr>
           <w:p>
             <w:pPr>
@@ -430,7 +430,7 @@
         </w:tc>
         <w:tc>
           <w:tcPr>
-            <w:tcW w:type="dxa" w:w="2948"/>
+            <w:tcW w:type="dxa" w:w="3628"/>
           </w:tcPr>
           <w:p>
             <w:pPr>
@@ -440,7 +440,7 @@
               <w:rPr>
                 <w:b w:val="0"/>
               </w:rPr>
-              <w:t>Retraso promedio de llegada</w:t>
+              <w:t>Promedio de minutos de retraso de llegada por ruta</w:t>
             </w:r>
           </w:p>
         </w:tc>
@@ -467,7 +467,7 @@
         </w:tc>
         <w:tc>
           <w:tcPr>
-            <w:tcW w:type="dxa" w:w="5329"/>
+            <w:tcW w:type="dxa" w:w="4649"/>
           </w:tcPr>
           <w:p>
             <w:pPr>
@@ -483,7 +483,7 @@
         </w:tc>
         <w:tc>
           <w:tcPr>
-            <w:tcW w:type="dxa" w:w="2948"/>
+            <w:tcW w:type="dxa" w:w="3628"/>
           </w:tcPr>
           <w:p>
             <w:pPr>
@@ -493,7 +493,7 @@
               <w:rPr>
                 <w:b w:val="0"/>
               </w:rPr>
-              <w:t>Retraso promedio de salida</w:t>
+              <w:t>Promedio de minutos de retraso de salida por franja y día</w:t>
             </w:r>
           </w:p>
         </w:tc>
@@ -520,7 +520,7 @@
         </w:tc>
         <w:tc>
           <w:tcPr>
-            <w:tcW w:type="dxa" w:w="5329"/>
+            <w:tcW w:type="dxa" w:w="4649"/>
           </w:tcPr>
           <w:p>
             <w:pPr>
@@ -536,7 +536,7 @@
         </w:tc>
         <w:tc>
           <w:tcPr>
-            <w:tcW w:type="dxa" w:w="2948"/>
+            <w:tcW w:type="dxa" w:w="3628"/>
           </w:tcPr>
           <w:p>
             <w:pPr>
@@ -546,7 +546,7 @@
               <w:rPr>
                 <w:b w:val="0"/>
               </w:rPr>
-              <w:t>Tiempo promedio de rodaje</w:t>
+              <w:t>Promedio de minutos de rodaje antes del despegue</w:t>
             </w:r>
           </w:p>
         </w:tc>
@@ -565,7 +565,7 @@
         <w:rPr>
           <w:b w:val="0"/>
         </w:rPr>
-        <w:t>Estos objetivos definen el hecho (vuelo), las dimensiones (fecha, hora, aerolínea, aeropuerto y motivo de cancelación), las métricas, la granularidad y los reportes y cuadros de mando de la segunda presentación.</w:t>
+        <w:t>Estos objetivos son la base del diseño: definen el hecho (vuelo) y su granularidad (un vuelo), las dimensiones (fecha, hora, aerolínea, aeropuerto y motivo de cancelación) y las métricas (minutos de retraso, tiempos, distancia e indicadores). En la segunda presentación cada objetivo tendrá su reporte (puntualidad por aerolínea, cancelaciones por motivo, causas de retraso, rutas y aeropuertos con más retraso, y retrasos por horario) y los indicadores se reunirán en un cuadro de mando de puntualidad con filtros por aerolínea, aeropuerto y mes.</w:t>
       </w:r>
     </w:p>
     <w:p>
@@ -691,7 +691,7 @@
         <w:rPr>
           <w:b w:val="0"/>
         </w:rPr>
-        <w:t>; dimensiones con sus jerarquías: Fecha (año → trimestre → mes → fecha, y día de la semana), Hora de salida (franja horaria → hora), Aerolínea, Aeropuerto (región → estado → ciudad → aeropuerto), que se usa dos veces, como origen y como destino, y Motivo de cancelación.</w:t>
+        <w:t>; dimensiones con sus jerarquías: Fecha (año → trimestre → mes → fecha, y día de la semana), Hora de salida (franja horaria → hora), Aerolínea, Aeropuerto (región → estado → ciudad → aeropuerto), que se usa dos veces, como origen y como destino, y Motivo de cancelación (Figura 1).</w:t>
       </w:r>
     </w:p>
     <w:p>
@@ -726,6 +726,63 @@
     <w:p>
       <w:pPr>
         <w:keepNext/>
+        <w:jc w:val="center"/>
+      </w:pPr>
+      <w:r>
+        <w:drawing>
+          <wp:inline xmlns:a="http://schemas.openxmlformats.org/drawingml/2006/main" xmlns:pic="http://schemas.openxmlformats.org/drawingml/2006/picture">
+            <wp:extent cx="5580000" cy="3627000"/>
+            <wp:docPr id="1" name="Picture 1"/>
+            <wp:cNvGraphicFramePr>
+              <a:graphicFrameLocks noChangeAspect="1"/>
+            </wp:cNvGraphicFramePr>
+            <a:graphic>
+              <a:graphicData uri="http://schemas.openxmlformats.org/drawingml/2006/picture">
+                <pic:pic>
+                  <pic:nvPicPr>
+                    <pic:cNvPr id="0" name="modelo_conceptual.png"/>
+                    <pic:cNvPicPr/>
+                  </pic:nvPicPr>
+                  <pic:blipFill>
+                    <a:blip r:embed="rId9"/>
+                    <a:stretch>
+                      <a:fillRect/>
+                    </a:stretch>
+                  </pic:blipFill>
+                  <pic:spPr>
+                    <a:xfrm>
+                      <a:off x="0" y="0"/>
+                      <a:ext cx="5580000" cy="3627000"/>
+                    </a:xfrm>
+                    <a:prstGeom prst="rect"/>
+                  </pic:spPr>
+                </pic:pic>
+              </a:graphicData>
+            </a:graphic>
+          </wp:inline>
+        </w:drawing>
+      </w:r>
+    </w:p>
+    <w:p>
+      <w:pPr>
+        <w:jc w:val="center"/>
+      </w:pPr>
+      <w:r>
+        <w:rPr>
+          <w:b/>
+        </w:rPr>
+        <w:t>Figura 1.</w:t>
+      </w:r>
+      <w:r>
+        <w:rPr>
+          <w:b w:val="0"/>
+        </w:rPr>
+        <w:t xml:space="preserve"> Modelo conceptual del DataMart Puntualidad de Vuelos: hecho, dimensiones y jerarquías.</w:t>
+      </w:r>
+    </w:p>
+    <w:p>
+      <w:pPr>
+        <w:keepNext/>
         <w:spacing w:before="120"/>
       </w:pPr>
       <w:r>
@@ -743,7 +800,7 @@
         <w:rPr>
           <w:b w:val="0"/>
         </w:rPr>
-        <w:t>Esquema en estrella. Cada dimensión se relaciona 1:N con la tabla de hechos mediante su clave sustituta (PK) y la clave foránea (FK) correspondiente:</w:t>
+        <w:t>Esquema en estrella (Figura 2). Cada dimensión se relaciona 1:N con la tabla de hechos mediante su clave sustituta (PK) y la clave foránea (FK) correspondiente:</w:t>
       </w:r>
     </w:p>
     <w:tbl>
@@ -826,7 +883,7 @@
               <w:rPr>
                 <w:b w:val="0"/>
               </w:rPr>
-              <w:t>PK sk_vuelo; FK sk_fecha, sk_hora_salida, sk_aerolinea, sk_aeropuerto_origen, sk_aeropuerto_destino, sk_motivo_cancelacion; numero_vuelo, matricula_avion, salida_programada; métricas en minutos: retraso_salida_min, retraso_llegada_min, taxi_salida_min, taxi_llegada_min, tiempo_aire_min, retraso por causa (aerolínea, clima, sistema aéreo, seguridad, avión tardío); distancia_millas; indicadores 0/1: es_cancelado, es_desviado, es_retrasado, es_puntual</w:t>
+              <w:t>PK sk_vuelo; FK sk_fecha, sk_hora_salida, sk_aerolinea, sk_aeropuerto_origen, sk_aeropuerto_destino, sk_motivo_cancelacion; dimensiones degeneradas: numero_vuelo, matricula_avion, salida_programada; métricas en minutos: retraso_salida_min, retraso_llegada_min, taxi_salida_min, taxi_llegada_min, tiempo_programado_min, tiempo_real_min, tiempo_aire_min, retraso_aerolinea_min, retraso_clima_min, retraso_sistema_aereo_min, retraso_seguridad_min, retraso_avion_tardio_min; distancia_millas; indicadores 0/1: es_cancelado, es_desviado, es_retrasado, es_puntual; fecha_carga (auditoría)</w:t>
             </w:r>
           </w:p>
         </w:tc>
@@ -863,7 +920,7 @@
               <w:rPr>
                 <w:b w:val="0"/>
               </w:rPr>
-              <w:t>PK sk_fecha (AAAAMMDD); fecha, dia_semana, es_fin_de_semana, mes, trimestre, anio</w:t>
+              <w:t>PK sk_fecha (AAAAMMDD); fecha, dia, dia_semana, nombre_dia, es_fin_de_semana, mes, nombre_mes, trimestre, anio</w:t>
             </w:r>
           </w:p>
         </w:tc>
@@ -974,7 +1031,7 @@
               <w:rPr>
                 <w:b w:val="0"/>
               </w:rPr>
-              <w:t>PK sk_aeropuerto; codigo_iata, nombre_aeropuerto, ciudad, estado, region, latitud, longitud</w:t>
+              <w:t>PK sk_aeropuerto; codigo_iata, nombre_aeropuerto, ciudad, estado, region, pais, latitud, longitud</w:t>
             </w:r>
           </w:p>
         </w:tc>
@@ -1117,6 +1174,94 @@
     </w:p>
     <w:p>
       <w:pPr>
+        <w:sectPr>
+          <w:pgSz w:w="11906" w:h="16838"/>
+          <w:pgMar w:top="1417" w:right="1417" w:bottom="1417" w:left="1417" w:header="720" w:footer="720" w:gutter="0"/>
+          <w:cols w:space="720"/>
+          <w:docGrid w:linePitch="360"/>
+        </w:sectPr>
+      </w:pPr>
+    </w:p>
+    <w:p>
+      <w:pPr>
+        <w:keepNext/>
+        <w:jc w:val="center"/>
+      </w:pPr>
+      <w:r>
+        <w:drawing>
+          <wp:inline xmlns:a="http://schemas.openxmlformats.org/drawingml/2006/main" xmlns:pic="http://schemas.openxmlformats.org/drawingml/2006/picture">
+            <wp:extent cx="9540000" cy="4569660"/>
+            <wp:docPr id="2" name="Picture 2"/>
+            <wp:cNvGraphicFramePr>
+              <a:graphicFrameLocks noChangeAspect="1"/>
+            </wp:cNvGraphicFramePr>
+            <a:graphic>
+              <a:graphicData uri="http://schemas.openxmlformats.org/drawingml/2006/picture">
+                <pic:pic>
+                  <pic:nvPicPr>
+                    <pic:cNvPr id="0" name="modelo_logico.png"/>
+                    <pic:cNvPicPr/>
+                  </pic:nvPicPr>
+                  <pic:blipFill>
+                    <a:blip r:embed="rId10"/>
+                    <a:stretch>
+                      <a:fillRect/>
+                    </a:stretch>
+                  </pic:blipFill>
+                  <pic:spPr>
+                    <a:xfrm>
+                      <a:off x="0" y="0"/>
+                      <a:ext cx="9540000" cy="4569660"/>
+                    </a:xfrm>
+                    <a:prstGeom prst="rect"/>
+                  </pic:spPr>
+                </pic:pic>
+              </a:graphicData>
+            </a:graphic>
+          </wp:inline>
+        </w:drawing>
+      </w:r>
+    </w:p>
+    <w:p>
+      <w:pPr>
+        <w:jc w:val="center"/>
+      </w:pPr>
+      <w:r>
+        <w:rPr>
+          <w:b/>
+        </w:rPr>
+        <w:t>Figura 2.</w:t>
+      </w:r>
+      <w:r>
+        <w:rPr>
+          <w:b w:val="0"/>
+        </w:rPr>
+        <w:t xml:space="preserve"> Modelo lógico del DataMart Puntualidad de Vuelos (esquema en estrella).</w:t>
+      </w:r>
+    </w:p>
+    <w:p>
+      <w:pPr>
+        <w:jc w:val="center"/>
+      </w:pPr>
+      <w:r>
+        <w:rPr>
+          <w:b w:val="0"/>
+        </w:rPr>
+        <w:t>PK = clave primaria (sustituta); FK = clave foránea, con la tabla a la que apunta; NK = clave natural única; DD = dimensión degenerada; ‖──&lt; = relación 1:N. dim_aeropuerto se relaciona dos veces con fact_vuelo (origen y destino).</w:t>
+      </w:r>
+    </w:p>
+    <w:p>
+      <w:pPr>
+        <w:sectPr>
+          <w:pgSz w:w="16838" w:h="11906" w:orient="landscape"/>
+          <w:pgMar w:top="1134" w:right="850" w:bottom="1134" w:left="850" w:header="720" w:footer="720" w:gutter="0"/>
+          <w:cols w:space="720"/>
+          <w:docGrid w:linePitch="360"/>
+        </w:sectPr>
+      </w:pPr>
+    </w:p>
+    <w:p>
+      <w:pPr>
         <w:keepNext/>
         <w:spacing w:before="120"/>
       </w:pPr>
@@ -1185,7 +1330,7 @@
         <w:rPr>
           <w:b w:val="0"/>
         </w:rPr>
-        <w:t xml:space="preserve"> PK en todas las tablas, UNIQUE en los códigos IATA y en la clave natural del vuelo, seis FK obligatorias (dos hacia dim_aeropuerto) y reglas CHECK (distancia &gt; 0, un vuelo cancelado debe tener motivo, es_retrasado = 1 solo si llegó con 15 minutos o más de retraso). Se probó que el DBMS rechaza aerolíneas inexistentes, vuelos duplicados y el borrado de aeropuertos con vuelos.</w:t>
+        <w:t xml:space="preserve"> PK en todas las tablas, UNIQUE en los códigos IATA y en la clave natural del vuelo, seis FK obligatorias (dos hacia dim_aeropuerto) y reglas CHECK (distancia &gt; 0, un vuelo cancelado debe tener motivo, es_retrasado = 1 solo si llegó con 15 minutos o más de retraso). Se probó que el DBMS rechaza aerolíneas inexistentes, vuelos cancelados sin motivo, vuelos duplicados, distancias negativas y el borrado de aeropuertos con vuelos.</w:t>
       </w:r>
     </w:p>
     <w:p>
@@ -1215,7 +1360,7 @@
         <w:rPr>
           <w:b w:val="0"/>
         </w:rPr>
-        <w:t>La Figura 1 muestra el modelo físico implementado, obtenido del catálogo de PostgreSQL: cada tabla con sus columnas, tipos de datos, claves y columnas obligatorias. El script de creación completo está en el Anexo.</w:t>
+        <w:t>La Figura 3 muestra el modelo físico implementado, obtenido del catálogo de PostgreSQL: cada tabla con sus columnas, tipos de datos, claves y columnas obligatorias. El script de creación completo está en el Anexo.</w:t>
       </w:r>
     </w:p>
     <w:p>
@@ -1230,13 +1375,14 @@
     </w:p>
     <w:p>
       <w:pPr>
+        <w:keepNext/>
         <w:jc w:val="center"/>
       </w:pPr>
       <w:r>
         <w:drawing>
           <wp:inline xmlns:a="http://schemas.openxmlformats.org/drawingml/2006/main" xmlns:pic="http://schemas.openxmlformats.org/drawingml/2006/picture">
             <wp:extent cx="9540000" cy="4569660"/>
-            <wp:docPr id="1" name="Picture 1"/>
+            <wp:docPr id="3" name="Picture 3"/>
             <wp:cNvGraphicFramePr>
               <a:graphicFrameLocks noChangeAspect="1"/>
             </wp:cNvGraphicFramePr>
@@ -1248,7 +1394,7 @@
                     <pic:cNvPicPr/>
                   </pic:nvPicPr>
                   <pic:blipFill>
-                    <a:blip r:embed="rId9"/>
+                    <a:blip r:embed="rId11"/>
                     <a:stretch>
                       <a:fillRect/>
                     </a:stretch>
@@ -1275,7 +1421,7 @@
         <w:rPr>
           <w:b/>
         </w:rPr>
-        <w:t>Figura 1.</w:t>
+        <w:t>Figura 3.</w:t>
       </w:r>
       <w:r>
         <w:rPr>

</xml_diff>

<commit_message>
Quitar el anexo del script y agregar el enlace del dataset
El documento ya no incluye el script SQL como anexo (queda en la carpeta
sql/) y el punto 1 muestra el enlace del dataset en Kaggle.

Co-Authored-By: Claude Opus 5.5 <noreply@anthropic.com>
Claude-Session: https://claude.ai/code/session_01UrpbqW5jvhcx6qo3xxD3vZ
</commit_message>
<xml_diff>
--- a/proyecto-dw-vuelos/docs/Primera_Presentacion_DW_Vuelos.docx
+++ b/proyecto-dw-vuelos/docs/Primera_Presentacion_DW_Vuelos.docx
@@ -74,6 +74,23 @@
           <w:b w:val="0"/>
         </w:rPr>
         <w:t xml:space="preserve"> «2015 Flight Delays and Cancellations» de Kaggle, publicado por el Departamento de Transporte de EE. UU. con datos de la Oficina de Estadísticas de Transporte (BTS). Tiene tres archivos CSV: flights.csv (≈ 5,8 millones de vuelos con fecha, aerolínea, número de vuelo, aeropuertos de origen y destino, horarios programados y reales, retrasos, tiempos de rodaje y de vuelo, distancia, cancelación, desvío y minutos de retraso por causa), airlines.csv (14 aerolíneas) y airports.csv (322 aeropuertos con ciudad, estado y coordenadas).</w:t>
+      </w:r>
+    </w:p>
+    <w:p>
+      <w:pPr>
+        <w:jc w:val="both"/>
+      </w:pPr>
+      <w:r>
+        <w:rPr>
+          <w:b/>
+        </w:rPr>
+        <w:t>Enlace del conjunto de datos:</w:t>
+      </w:r>
+      <w:r>
+        <w:rPr>
+          <w:b w:val="0"/>
+        </w:rPr>
+        <w:t xml:space="preserve"> https://www.kaggle.com/datasets/usdot/flight-delays</w:t>
       </w:r>
     </w:p>
     <w:p>
@@ -1360,7 +1377,7 @@
         <w:rPr>
           <w:b w:val="0"/>
         </w:rPr>
-        <w:t>La Figura 3 muestra el modelo físico implementado, obtenido del catálogo de PostgreSQL: cada tabla con sus columnas, tipos de datos, claves y columnas obligatorias. El script de creación completo está en el Anexo.</w:t>
+        <w:t>La Figura 3 muestra el modelo físico implementado, obtenido del catálogo de PostgreSQL: cada tabla con sus columnas, tipos de datos, claves y columnas obligatorias. Los scripts SQL de creación se entregan junto con el proyecto.</w:t>
       </w:r>
     </w:p>
     <w:p>
@@ -1441,1340 +1458,9 @@
         <w:t>PK = clave primaria; FK = clave foránea; UK = forma parte de una restricción UNIQUE; NN = NOT NULL; IDENTITY = valor generado por el DBMS; ‖──&lt; = relación 1:N. dim_aeropuerto se relaciona dos veces con fact_vuelo (origen y destino).</w:t>
       </w:r>
     </w:p>
-    <w:p>
-      <w:pPr>
-        <w:sectPr>
-          <w:pgSz w:w="16838" w:h="11906" w:orient="landscape"/>
-          <w:pgMar w:top="1134" w:right="850" w:bottom="1134" w:left="850" w:header="720" w:footer="720" w:gutter="0"/>
-          <w:cols w:space="720"/>
-          <w:docGrid w:linePitch="360"/>
-        </w:sectPr>
-      </w:pPr>
-    </w:p>
-    <w:p>
-      <w:pPr>
-        <w:keepNext/>
-        <w:spacing w:before="120"/>
-      </w:pPr>
-      <w:r>
-        <w:rPr>
-          <w:b/>
-        </w:rPr>
-        <w:t>Anexo. Script del modelo físico (PostgreSQL 16)</w:t>
-      </w:r>
-    </w:p>
-    <w:p>
-      <w:pPr>
-        <w:jc w:val="both"/>
-      </w:pPr>
-      <w:r>
-        <w:rPr>
-          <w:b w:val="0"/>
-        </w:rPr>
-        <w:t>Scripts 01_crear_esquema_y_tablas.sql y 02_crear_indices.sql, sin los comentarios:</w:t>
-      </w:r>
-    </w:p>
-    <w:p>
-      <w:pPr>
-        <w:spacing w:after="0"/>
-        <w:ind w:left="0"/>
-      </w:pPr>
-      <w:r>
-        <w:t>DROP SCHEMA IF EXISTS dw_vuelos CASCADE;</w:t>
-      </w:r>
-    </w:p>
-    <w:p>
-      <w:pPr>
-        <w:spacing w:after="0"/>
-        <w:ind w:left="0"/>
-      </w:pPr>
-      <w:r>
-        <w:t>CREATE SCHEMA dw_vuelos;</w:t>
-      </w:r>
-    </w:p>
-    <w:p>
-      <w:pPr>
-        <w:spacing w:after="0"/>
-        <w:ind w:left="0"/>
-      </w:pPr>
-      <w:r/>
-    </w:p>
-    <w:p>
-      <w:pPr>
-        <w:spacing w:after="0"/>
-        <w:ind w:left="0"/>
-      </w:pPr>
-      <w:r>
-        <w:t>SET search_path TO dw_vuelos;</w:t>
-      </w:r>
-    </w:p>
-    <w:p>
-      <w:pPr>
-        <w:spacing w:after="0"/>
-        <w:ind w:left="0"/>
-      </w:pPr>
-      <w:r/>
-    </w:p>
-    <w:p>
-      <w:pPr>
-        <w:spacing w:after="0"/>
-        <w:ind w:left="0"/>
-      </w:pPr>
-      <w:r>
-        <w:t>CREATE TABLE dim_fecha (</w:t>
-      </w:r>
-    </w:p>
-    <w:p>
-      <w:pPr>
-        <w:spacing w:after="0"/>
-        <w:ind w:left="567"/>
-      </w:pPr>
-      <w:r>
-        <w:t>sk_fecha INTEGER NOT NULL,</w:t>
-      </w:r>
-    </w:p>
-    <w:p>
-      <w:pPr>
-        <w:spacing w:after="0"/>
-        <w:ind w:left="567"/>
-      </w:pPr>
-      <w:r>
-        <w:t>fecha DATE NOT NULL,</w:t>
-      </w:r>
-    </w:p>
-    <w:p>
-      <w:pPr>
-        <w:spacing w:after="0"/>
-        <w:ind w:left="567"/>
-      </w:pPr>
-      <w:r>
-        <w:t>dia SMALLINT NOT NULL,</w:t>
-      </w:r>
-    </w:p>
-    <w:p>
-      <w:pPr>
-        <w:spacing w:after="0"/>
-        <w:ind w:left="567"/>
-      </w:pPr>
-      <w:r>
-        <w:t>dia_semana SMALLINT NOT NULL,</w:t>
-      </w:r>
-    </w:p>
-    <w:p>
-      <w:pPr>
-        <w:spacing w:after="0"/>
-        <w:ind w:left="567"/>
-      </w:pPr>
-      <w:r>
-        <w:t>nombre_dia VARCHAR(10) NOT NULL,</w:t>
-      </w:r>
-    </w:p>
-    <w:p>
-      <w:pPr>
-        <w:spacing w:after="0"/>
-        <w:ind w:left="567"/>
-      </w:pPr>
-      <w:r>
-        <w:t>es_fin_de_semana BOOLEAN NOT NULL,</w:t>
-      </w:r>
-    </w:p>
-    <w:p>
-      <w:pPr>
-        <w:spacing w:after="0"/>
-        <w:ind w:left="567"/>
-      </w:pPr>
-      <w:r>
-        <w:t>mes SMALLINT NOT NULL,</w:t>
-      </w:r>
-    </w:p>
-    <w:p>
-      <w:pPr>
-        <w:spacing w:after="0"/>
-        <w:ind w:left="567"/>
-      </w:pPr>
-      <w:r>
-        <w:t>nombre_mes VARCHAR(10) NOT NULL,</w:t>
-      </w:r>
-    </w:p>
-    <w:p>
-      <w:pPr>
-        <w:spacing w:after="0"/>
-        <w:ind w:left="567"/>
-      </w:pPr>
-      <w:r>
-        <w:t>trimestre SMALLINT NOT NULL,</w:t>
-      </w:r>
-    </w:p>
-    <w:p>
-      <w:pPr>
-        <w:spacing w:after="0"/>
-        <w:ind w:left="567"/>
-      </w:pPr>
-      <w:r>
-        <w:t>anio SMALLINT NOT NULL,</w:t>
-      </w:r>
-    </w:p>
-    <w:p>
-      <w:pPr>
-        <w:spacing w:after="0"/>
-        <w:ind w:left="567"/>
-      </w:pPr>
-      <w:r>
-        <w:t>CONSTRAINT pk_dim_fecha PRIMARY KEY (sk_fecha),</w:t>
-      </w:r>
-    </w:p>
-    <w:p>
-      <w:pPr>
-        <w:spacing w:after="0"/>
-        <w:ind w:left="567"/>
-      </w:pPr>
-      <w:r>
-        <w:t>CONSTRAINT uq_dim_fecha_fecha UNIQUE (fecha),</w:t>
-      </w:r>
-    </w:p>
-    <w:p>
-      <w:pPr>
-        <w:spacing w:after="0"/>
-        <w:ind w:left="567"/>
-      </w:pPr>
-      <w:r>
-        <w:t>CONSTRAINT ck_dim_fecha_sk CHECK (sk_fecha = EXTRACT(YEAR FROM fecha) * 10000</w:t>
-      </w:r>
-    </w:p>
-    <w:p>
-      <w:pPr>
-        <w:spacing w:after="0"/>
-        <w:ind w:left="1134"/>
-      </w:pPr>
-      <w:r>
-        <w:t>+ EXTRACT(MONTH FROM fecha) * 100</w:t>
-      </w:r>
-    </w:p>
-    <w:p>
-      <w:pPr>
-        <w:spacing w:after="0"/>
-        <w:ind w:left="1134"/>
-      </w:pPr>
-      <w:r>
-        <w:t>+ EXTRACT(DAY FROM fecha)),</w:t>
-      </w:r>
-    </w:p>
-    <w:p>
-      <w:pPr>
-        <w:spacing w:after="0"/>
-        <w:ind w:left="567"/>
-      </w:pPr>
-      <w:r>
-        <w:t>CONSTRAINT ck_dim_fecha_dia CHECK (dia BETWEEN 1 AND 31),</w:t>
-      </w:r>
-    </w:p>
-    <w:p>
-      <w:pPr>
-        <w:spacing w:after="0"/>
-        <w:ind w:left="567"/>
-      </w:pPr>
-      <w:r>
-        <w:t>CONSTRAINT ck_dim_fecha_dia_semana CHECK (dia_semana BETWEEN 1 AND 7),</w:t>
-      </w:r>
-    </w:p>
-    <w:p>
-      <w:pPr>
-        <w:spacing w:after="0"/>
-        <w:ind w:left="567"/>
-      </w:pPr>
-      <w:r>
-        <w:t>CONSTRAINT ck_dim_fecha_mes CHECK (mes BETWEEN 1 AND 12),</w:t>
-      </w:r>
-    </w:p>
-    <w:p>
-      <w:pPr>
-        <w:spacing w:after="0"/>
-        <w:ind w:left="567"/>
-      </w:pPr>
-      <w:r>
-        <w:t>CONSTRAINT ck_dim_fecha_trimestre CHECK (trimestre BETWEEN 1 AND 4)</w:t>
-      </w:r>
-    </w:p>
-    <w:p>
-      <w:pPr>
-        <w:spacing w:after="0"/>
-        <w:ind w:left="0"/>
-      </w:pPr>
-      <w:r>
-        <w:t>);</w:t>
-      </w:r>
-    </w:p>
-    <w:p>
-      <w:pPr>
-        <w:spacing w:after="0"/>
-        <w:ind w:left="0"/>
-      </w:pPr>
-      <w:r/>
-    </w:p>
-    <w:p>
-      <w:pPr>
-        <w:spacing w:after="0"/>
-        <w:ind w:left="0"/>
-      </w:pPr>
-      <w:r>
-        <w:t>CREATE TABLE dim_hora (</w:t>
-      </w:r>
-    </w:p>
-    <w:p>
-      <w:pPr>
-        <w:spacing w:after="0"/>
-        <w:ind w:left="567"/>
-      </w:pPr>
-      <w:r>
-        <w:t>sk_hora SMALLINT NOT NULL,</w:t>
-      </w:r>
-    </w:p>
-    <w:p>
-      <w:pPr>
-        <w:spacing w:after="0"/>
-        <w:ind w:left="567"/>
-      </w:pPr>
-      <w:r>
-        <w:t>hora_texto CHAR(5) NOT NULL,</w:t>
-      </w:r>
-    </w:p>
-    <w:p>
-      <w:pPr>
-        <w:spacing w:after="0"/>
-        <w:ind w:left="567"/>
-      </w:pPr>
-      <w:r>
-        <w:t>franja_horaria VARCHAR(10) NOT NULL,</w:t>
-      </w:r>
-    </w:p>
-    <w:p>
-      <w:pPr>
-        <w:spacing w:after="0"/>
-        <w:ind w:left="567"/>
-      </w:pPr>
-      <w:r>
-        <w:t>CONSTRAINT pk_dim_hora PRIMARY KEY (sk_hora),</w:t>
-      </w:r>
-    </w:p>
-    <w:p>
-      <w:pPr>
-        <w:spacing w:after="0"/>
-        <w:ind w:left="567"/>
-      </w:pPr>
-      <w:r>
-        <w:t>CONSTRAINT ck_dim_hora CHECK (sk_hora BETWEEN 0 AND 23),</w:t>
-      </w:r>
-    </w:p>
-    <w:p>
-      <w:pPr>
-        <w:spacing w:after="0"/>
-        <w:ind w:left="567"/>
-      </w:pPr>
-      <w:r>
-        <w:t>CONSTRAINT ck_dim_hora_franja CHECK (franja_horaria IN ('Madrugada', 'Mañana', 'Tarde', 'Noche'))</w:t>
-      </w:r>
-    </w:p>
-    <w:p>
-      <w:pPr>
-        <w:spacing w:after="0"/>
-        <w:ind w:left="0"/>
-      </w:pPr>
-      <w:r>
-        <w:t>);</w:t>
-      </w:r>
-    </w:p>
-    <w:p>
-      <w:pPr>
-        <w:spacing w:after="0"/>
-        <w:ind w:left="0"/>
-      </w:pPr>
-      <w:r/>
-    </w:p>
-    <w:p>
-      <w:pPr>
-        <w:spacing w:after="0"/>
-        <w:ind w:left="0"/>
-      </w:pPr>
-      <w:r>
-        <w:t>CREATE TABLE dim_aerolinea (</w:t>
-      </w:r>
-    </w:p>
-    <w:p>
-      <w:pPr>
-        <w:spacing w:after="0"/>
-        <w:ind w:left="567"/>
-      </w:pPr>
-      <w:r>
-        <w:t>sk_aerolinea INTEGER GENERATED BY DEFAULT AS IDENTITY,</w:t>
-      </w:r>
-    </w:p>
-    <w:p>
-      <w:pPr>
-        <w:spacing w:after="0"/>
-        <w:ind w:left="567"/>
-      </w:pPr>
-      <w:r>
-        <w:t>codigo_iata VARCHAR(3) NOT NULL,</w:t>
-      </w:r>
-    </w:p>
-    <w:p>
-      <w:pPr>
-        <w:spacing w:after="0"/>
-        <w:ind w:left="567"/>
-      </w:pPr>
-      <w:r>
-        <w:t>nombre_aerolinea VARCHAR(100) NOT NULL,</w:t>
-      </w:r>
-    </w:p>
-    <w:p>
-      <w:pPr>
-        <w:spacing w:after="0"/>
-        <w:ind w:left="567"/>
-      </w:pPr>
-      <w:r>
-        <w:t>CONSTRAINT pk_dim_aerolinea PRIMARY KEY (sk_aerolinea),</w:t>
-      </w:r>
-    </w:p>
-    <w:p>
-      <w:pPr>
-        <w:spacing w:after="0"/>
-        <w:ind w:left="567"/>
-      </w:pPr>
-      <w:r>
-        <w:t>CONSTRAINT uq_dim_aerolinea_codigo UNIQUE (codigo_iata)</w:t>
-      </w:r>
-    </w:p>
-    <w:p>
-      <w:pPr>
-        <w:spacing w:after="0"/>
-        <w:ind w:left="0"/>
-      </w:pPr>
-      <w:r>
-        <w:t>);</w:t>
-      </w:r>
-    </w:p>
-    <w:p>
-      <w:pPr>
-        <w:spacing w:after="0"/>
-        <w:ind w:left="0"/>
-      </w:pPr>
-      <w:r/>
-    </w:p>
-    <w:p>
-      <w:pPr>
-        <w:spacing w:after="0"/>
-        <w:ind w:left="0"/>
-      </w:pPr>
-      <w:r>
-        <w:t>CREATE TABLE dim_aeropuerto (</w:t>
-      </w:r>
-    </w:p>
-    <w:p>
-      <w:pPr>
-        <w:spacing w:after="0"/>
-        <w:ind w:left="567"/>
-      </w:pPr>
-      <w:r>
-        <w:t>sk_aeropuerto INTEGER GENERATED BY DEFAULT AS IDENTITY,</w:t>
-      </w:r>
-    </w:p>
-    <w:p>
-      <w:pPr>
-        <w:spacing w:after="0"/>
-        <w:ind w:left="567"/>
-      </w:pPr>
-      <w:r>
-        <w:t>codigo_iata VARCHAR(3) NOT NULL,</w:t>
-      </w:r>
-    </w:p>
-    <w:p>
-      <w:pPr>
-        <w:spacing w:after="0"/>
-        <w:ind w:left="567"/>
-      </w:pPr>
-      <w:r>
-        <w:t>nombre_aeropuerto VARCHAR(150) NOT NULL,</w:t>
-      </w:r>
-    </w:p>
-    <w:p>
-      <w:pPr>
-        <w:spacing w:after="0"/>
-        <w:ind w:left="567"/>
-      </w:pPr>
-      <w:r>
-        <w:t>ciudad VARCHAR(80) NOT NULL,</w:t>
-      </w:r>
-    </w:p>
-    <w:p>
-      <w:pPr>
-        <w:spacing w:after="0"/>
-        <w:ind w:left="567"/>
-      </w:pPr>
-      <w:r>
-        <w:t>estado CHAR(2) NOT NULL,</w:t>
-      </w:r>
-    </w:p>
-    <w:p>
-      <w:pPr>
-        <w:spacing w:after="0"/>
-        <w:ind w:left="567"/>
-      </w:pPr>
-      <w:r>
-        <w:t>region VARCHAR(15) NOT NULL,</w:t>
-      </w:r>
-    </w:p>
-    <w:p>
-      <w:pPr>
-        <w:spacing w:after="0"/>
-        <w:ind w:left="567"/>
-      </w:pPr>
-      <w:r>
-        <w:t>pais VARCHAR(30) NOT NULL,</w:t>
-      </w:r>
-    </w:p>
-    <w:p>
-      <w:pPr>
-        <w:spacing w:after="0"/>
-        <w:ind w:left="567"/>
-      </w:pPr>
-      <w:r>
-        <w:t>latitud NUMERIC(9,6) NULL,</w:t>
-      </w:r>
-    </w:p>
-    <w:p>
-      <w:pPr>
-        <w:spacing w:after="0"/>
-        <w:ind w:left="567"/>
-      </w:pPr>
-      <w:r>
-        <w:t>longitud NUMERIC(9,6) NULL,</w:t>
-      </w:r>
-    </w:p>
-    <w:p>
-      <w:pPr>
-        <w:spacing w:after="0"/>
-        <w:ind w:left="567"/>
-      </w:pPr>
-      <w:r>
-        <w:t>CONSTRAINT pk_dim_aeropuerto PRIMARY KEY (sk_aeropuerto),</w:t>
-      </w:r>
-    </w:p>
-    <w:p>
-      <w:pPr>
-        <w:spacing w:after="0"/>
-        <w:ind w:left="567"/>
-      </w:pPr>
-      <w:r>
-        <w:t>CONSTRAINT uq_dim_aeropuerto_codigo UNIQUE (codigo_iata),</w:t>
-      </w:r>
-    </w:p>
-    <w:p>
-      <w:pPr>
-        <w:spacing w:after="0"/>
-        <w:ind w:left="567"/>
-      </w:pPr>
-      <w:r>
-        <w:t>CONSTRAINT ck_dim_aeropuerto_region CHECK (region IN</w:t>
-      </w:r>
-    </w:p>
-    <w:p>
-      <w:pPr>
-        <w:spacing w:after="0"/>
-        <w:ind w:left="1134"/>
-      </w:pPr>
-      <w:r>
-        <w:t>('Noreste', 'Medio Oeste', 'Sur', 'Oeste', 'Territorios', 'Desconocida')),</w:t>
-      </w:r>
-    </w:p>
-    <w:p>
-      <w:pPr>
-        <w:spacing w:after="0"/>
-        <w:ind w:left="567"/>
-      </w:pPr>
-      <w:r>
-        <w:t>CONSTRAINT ck_dim_aeropuerto_latitud CHECK (latitud BETWEEN -90 AND 90),</w:t>
-      </w:r>
-    </w:p>
-    <w:p>
-      <w:pPr>
-        <w:spacing w:after="0"/>
-        <w:ind w:left="567"/>
-      </w:pPr>
-      <w:r>
-        <w:t>CONSTRAINT ck_dim_aeropuerto_longitud CHECK (longitud BETWEEN -180 AND 180)</w:t>
-      </w:r>
-    </w:p>
-    <w:p>
-      <w:pPr>
-        <w:spacing w:after="0"/>
-        <w:ind w:left="0"/>
-      </w:pPr>
-      <w:r>
-        <w:t>);</w:t>
-      </w:r>
-    </w:p>
-    <w:p>
-      <w:pPr>
-        <w:spacing w:after="0"/>
-        <w:ind w:left="0"/>
-      </w:pPr>
-      <w:r/>
-    </w:p>
-    <w:p>
-      <w:pPr>
-        <w:spacing w:after="0"/>
-        <w:ind w:left="0"/>
-      </w:pPr>
-      <w:r>
-        <w:t>CREATE TABLE dim_motivo_cancelacion (</w:t>
-      </w:r>
-    </w:p>
-    <w:p>
-      <w:pPr>
-        <w:spacing w:after="0"/>
-        <w:ind w:left="567"/>
-      </w:pPr>
-      <w:r>
-        <w:t>sk_motivo_cancelacion SMALLINT NOT NULL,</w:t>
-      </w:r>
-    </w:p>
-    <w:p>
-      <w:pPr>
-        <w:spacing w:after="0"/>
-        <w:ind w:left="567"/>
-      </w:pPr>
-      <w:r>
-        <w:t>codigo_motivo CHAR(1) NOT NULL,</w:t>
-      </w:r>
-    </w:p>
-    <w:p>
-      <w:pPr>
-        <w:spacing w:after="0"/>
-        <w:ind w:left="567"/>
-      </w:pPr>
-      <w:r>
-        <w:t>descripcion VARCHAR(40) NOT NULL,</w:t>
-      </w:r>
-    </w:p>
-    <w:p>
-      <w:pPr>
-        <w:spacing w:after="0"/>
-        <w:ind w:left="567"/>
-      </w:pPr>
-      <w:r>
-        <w:t>CONSTRAINT pk_dim_motivo_cancelacion PRIMARY KEY (sk_motivo_cancelacion),</w:t>
-      </w:r>
-    </w:p>
-    <w:p>
-      <w:pPr>
-        <w:spacing w:after="0"/>
-        <w:ind w:left="567"/>
-      </w:pPr>
-      <w:r>
-        <w:t>CONSTRAINT uq_dim_motivo_cancelacion_codigo UNIQUE (codigo_motivo),</w:t>
-      </w:r>
-    </w:p>
-    <w:p>
-      <w:pPr>
-        <w:spacing w:after="0"/>
-        <w:ind w:left="567"/>
-      </w:pPr>
-      <w:r>
-        <w:t>CONSTRAINT ck_dim_motivo_cancelacion_codigo CHECK (codigo_motivo IN ('N', 'A', 'B', 'C', 'D'))</w:t>
-      </w:r>
-    </w:p>
-    <w:p>
-      <w:pPr>
-        <w:spacing w:after="0"/>
-        <w:ind w:left="0"/>
-      </w:pPr>
-      <w:r>
-        <w:t>);</w:t>
-      </w:r>
-    </w:p>
-    <w:p>
-      <w:pPr>
-        <w:spacing w:after="0"/>
-        <w:ind w:left="0"/>
-      </w:pPr>
-      <w:r/>
-    </w:p>
-    <w:p>
-      <w:pPr>
-        <w:spacing w:after="0"/>
-        <w:ind w:left="0"/>
-      </w:pPr>
-      <w:r>
-        <w:t>CREATE TABLE fact_vuelo (</w:t>
-      </w:r>
-    </w:p>
-    <w:p>
-      <w:pPr>
-        <w:spacing w:after="0"/>
-        <w:ind w:left="567"/>
-      </w:pPr>
-      <w:r>
-        <w:t>sk_vuelo BIGINT GENERATED BY DEFAULT AS IDENTITY,</w:t>
-      </w:r>
-    </w:p>
-    <w:p>
-      <w:pPr>
-        <w:spacing w:after="0"/>
-        <w:ind w:left="567"/>
-      </w:pPr>
-      <w:r>
-        <w:t>sk_fecha INTEGER NOT NULL,</w:t>
-      </w:r>
-    </w:p>
-    <w:p>
-      <w:pPr>
-        <w:spacing w:after="0"/>
-        <w:ind w:left="567"/>
-      </w:pPr>
-      <w:r>
-        <w:t>sk_hora_salida SMALLINT NOT NULL,</w:t>
-      </w:r>
-    </w:p>
-    <w:p>
-      <w:pPr>
-        <w:spacing w:after="0"/>
-        <w:ind w:left="567"/>
-      </w:pPr>
-      <w:r>
-        <w:t>sk_aerolinea INTEGER NOT NULL,</w:t>
-      </w:r>
-    </w:p>
-    <w:p>
-      <w:pPr>
-        <w:spacing w:after="0"/>
-        <w:ind w:left="567"/>
-      </w:pPr>
-      <w:r>
-        <w:t>sk_aeropuerto_origen INTEGER NOT NULL,</w:t>
-      </w:r>
-    </w:p>
-    <w:p>
-      <w:pPr>
-        <w:spacing w:after="0"/>
-        <w:ind w:left="567"/>
-      </w:pPr>
-      <w:r>
-        <w:t>sk_aeropuerto_destino INTEGER NOT NULL,</w:t>
-      </w:r>
-    </w:p>
-    <w:p>
-      <w:pPr>
-        <w:spacing w:after="0"/>
-        <w:ind w:left="567"/>
-      </w:pPr>
-      <w:r>
-        <w:t>sk_motivo_cancelacion SMALLINT NOT NULL,</w:t>
-      </w:r>
-    </w:p>
-    <w:p>
-      <w:pPr>
-        <w:spacing w:after="0"/>
-        <w:ind w:left="567"/>
-      </w:pPr>
-      <w:r>
-        <w:t>numero_vuelo INTEGER NOT NULL,</w:t>
-      </w:r>
-    </w:p>
-    <w:p>
-      <w:pPr>
-        <w:spacing w:after="0"/>
-        <w:ind w:left="567"/>
-      </w:pPr>
-      <w:r>
-        <w:t>matricula_avion VARCHAR(10) NULL,</w:t>
-      </w:r>
-    </w:p>
-    <w:p>
-      <w:pPr>
-        <w:spacing w:after="0"/>
-        <w:ind w:left="567"/>
-      </w:pPr>
-      <w:r>
-        <w:t>salida_programada TIME NOT NULL,</w:t>
-      </w:r>
-    </w:p>
-    <w:p>
-      <w:pPr>
-        <w:spacing w:after="0"/>
-        <w:ind w:left="567"/>
-      </w:pPr>
-      <w:r>
-        <w:t>retraso_salida_min SMALLINT NULL,</w:t>
-      </w:r>
-    </w:p>
-    <w:p>
-      <w:pPr>
-        <w:spacing w:after="0"/>
-        <w:ind w:left="567"/>
-      </w:pPr>
-      <w:r>
-        <w:t>retraso_llegada_min SMALLINT NULL,</w:t>
-      </w:r>
-    </w:p>
-    <w:p>
-      <w:pPr>
-        <w:spacing w:after="0"/>
-        <w:ind w:left="567"/>
-      </w:pPr>
-      <w:r>
-        <w:t>taxi_salida_min SMALLINT NULL,</w:t>
-      </w:r>
-    </w:p>
-    <w:p>
-      <w:pPr>
-        <w:spacing w:after="0"/>
-        <w:ind w:left="567"/>
-      </w:pPr>
-      <w:r>
-        <w:t>taxi_llegada_min SMALLINT NULL,</w:t>
-      </w:r>
-    </w:p>
-    <w:p>
-      <w:pPr>
-        <w:spacing w:after="0"/>
-        <w:ind w:left="567"/>
-      </w:pPr>
-      <w:r>
-        <w:t>tiempo_programado_min SMALLINT NULL,</w:t>
-      </w:r>
-    </w:p>
-    <w:p>
-      <w:pPr>
-        <w:spacing w:after="0"/>
-        <w:ind w:left="567"/>
-      </w:pPr>
-      <w:r>
-        <w:t>tiempo_real_min SMALLINT NULL,</w:t>
-      </w:r>
-    </w:p>
-    <w:p>
-      <w:pPr>
-        <w:spacing w:after="0"/>
-        <w:ind w:left="567"/>
-      </w:pPr>
-      <w:r>
-        <w:t>tiempo_aire_min SMALLINT NULL,</w:t>
-      </w:r>
-    </w:p>
-    <w:p>
-      <w:pPr>
-        <w:spacing w:after="0"/>
-        <w:ind w:left="567"/>
-      </w:pPr>
-      <w:r>
-        <w:t>distancia_millas SMALLINT NOT NULL,</w:t>
-      </w:r>
-    </w:p>
-    <w:p>
-      <w:pPr>
-        <w:spacing w:after="0"/>
-        <w:ind w:left="567"/>
-      </w:pPr>
-      <w:r>
-        <w:t>retraso_aerolinea_min SMALLINT NOT NULL DEFAULT 0,</w:t>
-      </w:r>
-    </w:p>
-    <w:p>
-      <w:pPr>
-        <w:spacing w:after="0"/>
-        <w:ind w:left="567"/>
-      </w:pPr>
-      <w:r>
-        <w:t>retraso_clima_min SMALLINT NOT NULL DEFAULT 0,</w:t>
-      </w:r>
-    </w:p>
-    <w:p>
-      <w:pPr>
-        <w:spacing w:after="0"/>
-        <w:ind w:left="567"/>
-      </w:pPr>
-      <w:r>
-        <w:t>retraso_sistema_aereo_min SMALLINT NOT NULL DEFAULT 0,</w:t>
-      </w:r>
-    </w:p>
-    <w:p>
-      <w:pPr>
-        <w:spacing w:after="0"/>
-        <w:ind w:left="567"/>
-      </w:pPr>
-      <w:r>
-        <w:t>retraso_seguridad_min SMALLINT NOT NULL DEFAULT 0,</w:t>
-      </w:r>
-    </w:p>
-    <w:p>
-      <w:pPr>
-        <w:spacing w:after="0"/>
-        <w:ind w:left="567"/>
-      </w:pPr>
-      <w:r>
-        <w:t>retraso_avion_tardio_min SMALLINT NOT NULL DEFAULT 0,</w:t>
-      </w:r>
-    </w:p>
-    <w:p>
-      <w:pPr>
-        <w:spacing w:after="0"/>
-        <w:ind w:left="567"/>
-      </w:pPr>
-      <w:r>
-        <w:t>es_cancelado SMALLINT NOT NULL DEFAULT 0,</w:t>
-      </w:r>
-    </w:p>
-    <w:p>
-      <w:pPr>
-        <w:spacing w:after="0"/>
-        <w:ind w:left="567"/>
-      </w:pPr>
-      <w:r>
-        <w:t>es_desviado SMALLINT NOT NULL DEFAULT 0,</w:t>
-      </w:r>
-    </w:p>
-    <w:p>
-      <w:pPr>
-        <w:spacing w:after="0"/>
-        <w:ind w:left="567"/>
-      </w:pPr>
-      <w:r>
-        <w:t>es_retrasado SMALLINT NOT NULL DEFAULT 0,</w:t>
-      </w:r>
-    </w:p>
-    <w:p>
-      <w:pPr>
-        <w:spacing w:after="0"/>
-        <w:ind w:left="567"/>
-      </w:pPr>
-      <w:r>
-        <w:t>es_puntual SMALLINT NOT NULL DEFAULT 0,</w:t>
-      </w:r>
-    </w:p>
-    <w:p>
-      <w:pPr>
-        <w:spacing w:after="0"/>
-        <w:ind w:left="567"/>
-      </w:pPr>
-      <w:r>
-        <w:t>fecha_carga TIMESTAMP NOT NULL DEFAULT CURRENT_TIMESTAMP,</w:t>
-      </w:r>
-    </w:p>
-    <w:p>
-      <w:pPr>
-        <w:spacing w:after="0"/>
-        <w:ind w:left="0"/>
-      </w:pPr>
-      <w:r/>
-    </w:p>
-    <w:p>
-      <w:pPr>
-        <w:spacing w:after="0"/>
-        <w:ind w:left="567"/>
-      </w:pPr>
-      <w:r>
-        <w:t>CONSTRAINT pk_fact_vuelo PRIMARY KEY (sk_vuelo),</w:t>
-      </w:r>
-    </w:p>
-    <w:p>
-      <w:pPr>
-        <w:spacing w:after="0"/>
-        <w:ind w:left="567"/>
-      </w:pPr>
-      <w:r>
-        <w:t>CONSTRAINT uq_fact_vuelo_natural UNIQUE (sk_fecha, sk_aerolinea, numero_vuelo,</w:t>
-      </w:r>
-    </w:p>
-    <w:p>
-      <w:pPr>
-        <w:spacing w:after="0"/>
-        <w:ind w:left="1134"/>
-      </w:pPr>
-      <w:r>
-        <w:t>sk_aeropuerto_origen, salida_programada),</w:t>
-      </w:r>
-    </w:p>
-    <w:p>
-      <w:pPr>
-        <w:spacing w:after="0"/>
-        <w:ind w:left="0"/>
-      </w:pPr>
-      <w:r/>
-    </w:p>
-    <w:p>
-      <w:pPr>
-        <w:spacing w:after="0"/>
-        <w:ind w:left="567"/>
-      </w:pPr>
-      <w:r>
-        <w:t>CONSTRAINT fk_fact_vuelo_fecha FOREIGN KEY (sk_fecha) REFERENCES dim_fecha (sk_fecha),</w:t>
-      </w:r>
-    </w:p>
-    <w:p>
-      <w:pPr>
-        <w:spacing w:after="0"/>
-        <w:ind w:left="567"/>
-      </w:pPr>
-      <w:r>
-        <w:t>CONSTRAINT fk_fact_vuelo_hora FOREIGN KEY (sk_hora_salida) REFERENCES dim_hora (sk_hora),</w:t>
-      </w:r>
-    </w:p>
-    <w:p>
-      <w:pPr>
-        <w:spacing w:after="0"/>
-        <w:ind w:left="567"/>
-      </w:pPr>
-      <w:r>
-        <w:t>CONSTRAINT fk_fact_vuelo_aerolinea FOREIGN KEY (sk_aerolinea) REFERENCES dim_aerolinea (sk_aerolinea),</w:t>
-      </w:r>
-    </w:p>
-    <w:p>
-      <w:pPr>
-        <w:spacing w:after="0"/>
-        <w:ind w:left="567"/>
-      </w:pPr>
-      <w:r>
-        <w:t>CONSTRAINT fk_fact_vuelo_origen FOREIGN KEY (sk_aeropuerto_origen) REFERENCES dim_aeropuerto (sk_aeropuerto),</w:t>
-      </w:r>
-    </w:p>
-    <w:p>
-      <w:pPr>
-        <w:spacing w:after="0"/>
-        <w:ind w:left="567"/>
-      </w:pPr>
-      <w:r>
-        <w:t>CONSTRAINT fk_fact_vuelo_destino FOREIGN KEY (sk_aeropuerto_destino) REFERENCES dim_aeropuerto (sk_aeropuerto),</w:t>
-      </w:r>
-    </w:p>
-    <w:p>
-      <w:pPr>
-        <w:spacing w:after="0"/>
-        <w:ind w:left="567"/>
-      </w:pPr>
-      <w:r>
-        <w:t>CONSTRAINT fk_fact_vuelo_motivo FOREIGN KEY (sk_motivo_cancelacion) REFERENCES dim_motivo_cancelacion (sk_motivo_cancelacion),</w:t>
-      </w:r>
-    </w:p>
-    <w:p>
-      <w:pPr>
-        <w:spacing w:after="0"/>
-        <w:ind w:left="0"/>
-      </w:pPr>
-      <w:r/>
-    </w:p>
-    <w:p>
-      <w:pPr>
-        <w:spacing w:after="0"/>
-        <w:ind w:left="567"/>
-      </w:pPr>
-      <w:r>
-        <w:t>CONSTRAINT ck_fact_vuelo_numero CHECK (numero_vuelo &gt; 0),</w:t>
-      </w:r>
-    </w:p>
-    <w:p>
-      <w:pPr>
-        <w:spacing w:after="0"/>
-        <w:ind w:left="567"/>
-      </w:pPr>
-      <w:r>
-        <w:t>CONSTRAINT ck_fact_vuelo_distancia CHECK (distancia_millas &gt; 0),</w:t>
-      </w:r>
-    </w:p>
-    <w:p>
-      <w:pPr>
-        <w:spacing w:after="0"/>
-        <w:ind w:left="567"/>
-      </w:pPr>
-      <w:r>
-        <w:t>CONSTRAINT ck_fact_vuelo_taxi CHECK (taxi_salida_min &gt;= 0 AND taxi_llegada_min &gt;= 0),</w:t>
-      </w:r>
-    </w:p>
-    <w:p>
-      <w:pPr>
-        <w:spacing w:after="0"/>
-        <w:ind w:left="567"/>
-      </w:pPr>
-      <w:r>
-        <w:t>CONSTRAINT ck_fact_vuelo_tiempos CHECK (tiempo_programado_min &gt; 0 AND tiempo_real_min &gt; 0 AND tiempo_aire_min &gt; 0),</w:t>
-      </w:r>
-    </w:p>
-    <w:p>
-      <w:pPr>
-        <w:spacing w:after="0"/>
-        <w:ind w:left="567"/>
-      </w:pPr>
-      <w:r>
-        <w:t>CONSTRAINT ck_fact_vuelo_causas CHECK (</w:t>
-      </w:r>
-    </w:p>
-    <w:p>
-      <w:pPr>
-        <w:spacing w:after="0"/>
-        <w:ind w:left="1134"/>
-      </w:pPr>
-      <w:r>
-        <w:t>retraso_aerolinea_min &gt;= 0 AND retraso_clima_min &gt;= 0 AND retraso_sistema_aereo_min &gt;= 0 AND</w:t>
-      </w:r>
-    </w:p>
-    <w:p>
-      <w:pPr>
-        <w:spacing w:after="0"/>
-        <w:ind w:left="1134"/>
-      </w:pPr>
-      <w:r>
-        <w:t>retraso_seguridad_min &gt;= 0 AND retraso_avion_tardio_min &gt;= 0),</w:t>
-      </w:r>
-    </w:p>
-    <w:p>
-      <w:pPr>
-        <w:spacing w:after="0"/>
-        <w:ind w:left="567"/>
-      </w:pPr>
-      <w:r>
-        <w:t>CONSTRAINT ck_fact_vuelo_ruta CHECK (sk_aeropuerto_origen &lt;&gt; sk_aeropuerto_destino OR sk_aeropuerto_origen = -1),</w:t>
-      </w:r>
-    </w:p>
-    <w:p>
-      <w:pPr>
-        <w:spacing w:after="0"/>
-        <w:ind w:left="0"/>
-      </w:pPr>
-      <w:r/>
-    </w:p>
-    <w:p>
-      <w:pPr>
-        <w:spacing w:after="0"/>
-        <w:ind w:left="567"/>
-      </w:pPr>
-      <w:r>
-        <w:t>CONSTRAINT ck_fact_vuelo_indicadores CHECK (</w:t>
-      </w:r>
-    </w:p>
-    <w:p>
-      <w:pPr>
-        <w:spacing w:after="0"/>
-        <w:ind w:left="1134"/>
-      </w:pPr>
-      <w:r>
-        <w:t>es_cancelado IN (0, 1) AND es_desviado IN (0, 1) AND es_retrasado IN (0, 1) AND es_puntual IN (0, 1)),</w:t>
-      </w:r>
-    </w:p>
-    <w:p>
-      <w:pPr>
-        <w:spacing w:after="0"/>
-        <w:ind w:left="567"/>
-      </w:pPr>
-      <w:r>
-        <w:t>CONSTRAINT ck_fact_vuelo_un_estado CHECK (es_cancelado + es_desviado + es_retrasado + es_puntual &lt;= 1),</w:t>
-      </w:r>
-    </w:p>
-    <w:p>
-      <w:pPr>
-        <w:spacing w:after="0"/>
-        <w:ind w:left="567"/>
-      </w:pPr>
-      <w:r>
-        <w:t>CONSTRAINT ck_fact_vuelo_cancelado CHECK ((es_cancelado = 1) = (sk_motivo_cancelacion &lt;&gt; 0)),</w:t>
-      </w:r>
-    </w:p>
-    <w:p>
-      <w:pPr>
-        <w:spacing w:after="0"/>
-        <w:ind w:left="567"/>
-      </w:pPr>
-      <w:r>
-        <w:t>CONSTRAINT ck_fact_vuelo_cancelado_sin_llegada CHECK (es_cancelado = 0 OR retraso_llegada_min IS NULL),</w:t>
-      </w:r>
-    </w:p>
-    <w:p>
-      <w:pPr>
-        <w:spacing w:after="0"/>
-        <w:ind w:left="567"/>
-      </w:pPr>
-      <w:r>
-        <w:t>CONSTRAINT ck_fact_vuelo_retrasado CHECK ((es_retrasado = 1) = (COALESCE(retraso_llegada_min, -1) &gt;= 15)),</w:t>
-      </w:r>
-    </w:p>
-    <w:p>
-      <w:pPr>
-        <w:spacing w:after="0"/>
-        <w:ind w:left="567"/>
-      </w:pPr>
-      <w:r>
-        <w:t>CONSTRAINT ck_fact_vuelo_puntual CHECK ((es_puntual = 1) = (COALESCE(retraso_llegada_min, 15) &lt; 15))</w:t>
-      </w:r>
-    </w:p>
-    <w:p>
-      <w:pPr>
-        <w:spacing w:after="0"/>
-        <w:ind w:left="0"/>
-      </w:pPr>
-      <w:r>
-        <w:t>);</w:t>
-      </w:r>
-    </w:p>
-    <w:p>
-      <w:pPr>
-        <w:spacing w:after="0"/>
-        <w:ind w:left="0"/>
-      </w:pPr>
-      <w:r/>
-    </w:p>
-    <w:p>
-      <w:pPr>
-        <w:spacing w:after="0"/>
-        <w:ind w:left="0"/>
-      </w:pPr>
-      <w:r/>
-    </w:p>
-    <w:p>
-      <w:pPr>
-        <w:spacing w:after="0"/>
-        <w:ind w:left="0"/>
-      </w:pPr>
-      <w:r>
-        <w:t>SET search_path TO dw_vuelos;</w:t>
-      </w:r>
-    </w:p>
-    <w:p>
-      <w:pPr>
-        <w:spacing w:after="0"/>
-        <w:ind w:left="0"/>
-      </w:pPr>
-      <w:r/>
-    </w:p>
-    <w:p>
-      <w:pPr>
-        <w:spacing w:after="0"/>
-        <w:ind w:left="0"/>
-      </w:pPr>
-      <w:r>
-        <w:t>CREATE INDEX ix_fact_vuelo_hora ON fact_vuelo (sk_hora_salida);</w:t>
-      </w:r>
-    </w:p>
-    <w:p>
-      <w:pPr>
-        <w:spacing w:after="0"/>
-        <w:ind w:left="0"/>
-      </w:pPr>
-      <w:r>
-        <w:t>CREATE INDEX ix_fact_vuelo_destino ON fact_vuelo (sk_aeropuerto_destino);</w:t>
-      </w:r>
-    </w:p>
-    <w:p>
-      <w:pPr>
-        <w:spacing w:after="0"/>
-        <w:ind w:left="0"/>
-      </w:pPr>
-      <w:r>
-        <w:t>CREATE INDEX ix_fact_vuelo_motivo ON fact_vuelo (sk_motivo_cancelacion);</w:t>
-      </w:r>
-    </w:p>
-    <w:p>
-      <w:pPr>
-        <w:spacing w:after="0"/>
-        <w:ind w:left="0"/>
-      </w:pPr>
-      <w:r/>
-    </w:p>
-    <w:p>
-      <w:pPr>
-        <w:spacing w:after="0"/>
-        <w:ind w:left="0"/>
-      </w:pPr>
-      <w:r>
-        <w:t>CREATE INDEX ix_fact_vuelo_aerolinea_fecha ON fact_vuelo (sk_aerolinea, sk_fecha);</w:t>
-      </w:r>
-    </w:p>
-    <w:p>
-      <w:pPr>
-        <w:spacing w:after="0"/>
-        <w:ind w:left="0"/>
-      </w:pPr>
-      <w:r>
-        <w:t>CREATE INDEX ix_fact_vuelo_ruta ON fact_vuelo (sk_aeropuerto_origen, sk_aeropuerto_destino);</w:t>
-      </w:r>
-    </w:p>
-    <w:p>
-      <w:pPr>
-        <w:spacing w:after="0"/>
-        <w:ind w:left="0"/>
-      </w:pPr>
-      <w:r/>
-    </w:p>
-    <w:p>
-      <w:pPr>
-        <w:spacing w:after="0"/>
-        <w:ind w:left="0"/>
-      </w:pPr>
-      <w:r>
-        <w:t>CREATE INDEX ix_fact_vuelo_cancelados ON fact_vuelo (sk_aerolinea, sk_motivo_cancelacion)</w:t>
-      </w:r>
-    </w:p>
-    <w:p>
-      <w:pPr>
-        <w:spacing w:after="0"/>
-        <w:ind w:left="567"/>
-      </w:pPr>
-      <w:r>
-        <w:t>WHERE es_cancelado = 1;</w:t>
-      </w:r>
-    </w:p>
-    <w:p>
-      <w:pPr>
-        <w:spacing w:after="0"/>
-        <w:ind w:left="0"/>
-      </w:pPr>
-      <w:r/>
-    </w:p>
-    <w:p>
-      <w:pPr>
-        <w:spacing w:after="0"/>
-        <w:ind w:left="0"/>
-      </w:pPr>
-      <w:r>
-        <w:t>CREATE INDEX ix_dim_fecha_anio_mes ON dim_fecha (anio, mes);</w:t>
-      </w:r>
-    </w:p>
-    <w:p>
-      <w:pPr>
-        <w:spacing w:after="0"/>
-        <w:ind w:left="0"/>
-      </w:pPr>
-      <w:r>
-        <w:t>CREATE INDEX ix_dim_fecha_dia_semana ON dim_fecha (dia_semana);</w:t>
-      </w:r>
-    </w:p>
-    <w:p>
-      <w:pPr>
-        <w:spacing w:after="0"/>
-        <w:ind w:left="0"/>
-      </w:pPr>
-      <w:r>
-        <w:t>CREATE INDEX ix_dim_hora_franja ON dim_hora (franja_horaria);</w:t>
-      </w:r>
-    </w:p>
-    <w:p>
-      <w:pPr>
-        <w:spacing w:after="0"/>
-        <w:ind w:left="0"/>
-      </w:pPr>
-      <w:r>
-        <w:t>CREATE INDEX ix_dim_aeropuerto_region ON dim_aeropuerto (region, estado);</w:t>
-      </w:r>
-    </w:p>
-    <w:p>
-      <w:pPr>
-        <w:spacing w:after="0"/>
-        <w:ind w:left="0"/>
-      </w:pPr>
-      <w:r>
-        <w:t>CREATE INDEX ix_dim_aeropuerto_ciudad ON dim_aeropuerto (ciudad);</w:t>
-      </w:r>
-    </w:p>
     <w:sectPr>
-      <w:pgSz w:w="11906" w:h="16838"/>
-      <w:pgMar w:top="1417" w:right="1417" w:bottom="1417" w:left="1417" w:header="720" w:footer="720" w:gutter="0"/>
+      <w:pgSz w:w="16838" w:h="11906" w:orient="landscape"/>
+      <w:pgMar w:top="1134" w:right="850" w:bottom="1134" w:left="850" w:header="720" w:footer="720" w:gutter="0"/>
       <w:cols w:space="720"/>
       <w:docGrid w:linePitch="360"/>
     </w:sectPr>

</xml_diff>

<commit_message>
Agregar la estructura del dataset y su uso en el DataMart
El punto 4 incluye una tabla con cada columna de flights.csv,
airlines.csv y airports.csv y la dimensión, métrica o indicador del
DataMart al que se carga.

Co-Authored-By: Claude Opus 5.5 <noreply@anthropic.com>
Claude-Session: https://claude.ai/code/session_01UrpbqW5jvhcx6qo3xxD3vZ
</commit_message>
<xml_diff>
--- a/proyecto-dw-vuelos/docs/Primera_Presentacion_DW_Vuelos.docx
+++ b/proyecto-dw-vuelos/docs/Primera_Presentacion_DW_Vuelos.docx
@@ -1098,6 +1098,1024 @@
     </w:p>
     <w:p>
       <w:pPr>
+        <w:jc w:val="both"/>
+      </w:pPr>
+      <w:r>
+        <w:rPr>
+          <w:b/>
+        </w:rPr>
+        <w:t>Estructura del dataset y su uso en el DataMart:</w:t>
+      </w:r>
+      <w:r>
+        <w:rPr>
+          <w:b w:val="0"/>
+        </w:rPr>
+        <w:t xml:space="preserve"> cada columna de los archivos CSV se carga en una dimensión, una métrica o un indicador de la tabla de hechos:</w:t>
+      </w:r>
+    </w:p>
+    <w:tbl>
+      <w:tblPr>
+        <w:tblStyle w:val="TableGrid"/>
+        <w:tblW w:type="auto" w:w="0"/>
+        <w:tblLayout w:type="fixed"/>
+        <w:tblLook w:firstColumn="1" w:firstRow="1" w:lastColumn="0" w:lastRow="0" w:noHBand="0" w:noVBand="1" w:val="04A0"/>
+      </w:tblPr>
+      <w:tblGrid>
+        <w:gridCol w:w="3515"/>
+        <w:gridCol w:w="2154"/>
+        <w:gridCol w:w="3402"/>
+      </w:tblGrid>
+      <w:tr>
+        <w:trPr>
+          <w:cantSplit w:val="true"/>
+        </w:trPr>
+        <w:tc>
+          <w:tcPr>
+            <w:tcW w:type="dxa" w:w="3515"/>
+          </w:tcPr>
+          <w:p>
+            <w:pPr>
+              <w:spacing w:after="0"/>
+            </w:pPr>
+            <w:r>
+              <w:rPr>
+                <w:b/>
+              </w:rPr>
+              <w:t>Columna del dataset</w:t>
+            </w:r>
+          </w:p>
+        </w:tc>
+        <w:tc>
+          <w:tcPr>
+            <w:tcW w:type="dxa" w:w="2154"/>
+          </w:tcPr>
+          <w:p>
+            <w:pPr>
+              <w:spacing w:after="0"/>
+            </w:pPr>
+            <w:r>
+              <w:rPr>
+                <w:b/>
+              </w:rPr>
+              <w:t>Significado</w:t>
+            </w:r>
+          </w:p>
+        </w:tc>
+        <w:tc>
+          <w:tcPr>
+            <w:tcW w:type="dxa" w:w="3402"/>
+          </w:tcPr>
+          <w:p>
+            <w:pPr>
+              <w:spacing w:after="0"/>
+            </w:pPr>
+            <w:r>
+              <w:rPr>
+                <w:b/>
+              </w:rPr>
+              <w:t>En el DataMart (uso)</w:t>
+            </w:r>
+          </w:p>
+        </w:tc>
+      </w:tr>
+      <w:tr>
+        <w:trPr>
+          <w:cantSplit w:val="true"/>
+        </w:trPr>
+        <w:tc>
+          <w:tcPr>
+            <w:tcW w:type="dxa" w:w="3515"/>
+          </w:tcPr>
+          <w:p>
+            <w:pPr>
+              <w:spacing w:after="0"/>
+            </w:pPr>
+            <w:r>
+              <w:rPr>
+                <w:b w:val="0"/>
+              </w:rPr>
+              <w:t>YEAR</w:t>
+              <w:br/>
+              <w:t>MONTH</w:t>
+              <w:br/>
+              <w:t>DAY</w:t>
+              <w:br/>
+              <w:t>DAY_OF_WEEK</w:t>
+            </w:r>
+          </w:p>
+        </w:tc>
+        <w:tc>
+          <w:tcPr>
+            <w:tcW w:type="dxa" w:w="2154"/>
+          </w:tcPr>
+          <w:p>
+            <w:pPr>
+              <w:spacing w:after="0"/>
+            </w:pPr>
+            <w:r>
+              <w:rPr>
+                <w:b w:val="0"/>
+              </w:rPr>
+              <w:t>Fecha del vuelo y día de la semana</w:t>
+            </w:r>
+          </w:p>
+        </w:tc>
+        <w:tc>
+          <w:tcPr>
+            <w:tcW w:type="dxa" w:w="3402"/>
+          </w:tcPr>
+          <w:p>
+            <w:pPr>
+              <w:spacing w:after="0"/>
+            </w:pPr>
+            <w:r>
+              <w:rPr>
+                <w:b w:val="0"/>
+              </w:rPr>
+              <w:t>dim_fecha</w:t>
+              <w:br/>
+              <w:t>(dimensión)</w:t>
+            </w:r>
+          </w:p>
+        </w:tc>
+      </w:tr>
+      <w:tr>
+        <w:trPr>
+          <w:cantSplit w:val="true"/>
+        </w:trPr>
+        <w:tc>
+          <w:tcPr>
+            <w:tcW w:type="dxa" w:w="3515"/>
+          </w:tcPr>
+          <w:p>
+            <w:pPr>
+              <w:spacing w:after="0"/>
+            </w:pPr>
+            <w:r>
+              <w:rPr>
+                <w:b w:val="0"/>
+              </w:rPr>
+              <w:t>AIRLINE</w:t>
+            </w:r>
+          </w:p>
+        </w:tc>
+        <w:tc>
+          <w:tcPr>
+            <w:tcW w:type="dxa" w:w="2154"/>
+          </w:tcPr>
+          <w:p>
+            <w:pPr>
+              <w:spacing w:after="0"/>
+            </w:pPr>
+            <w:r>
+              <w:rPr>
+                <w:b w:val="0"/>
+              </w:rPr>
+              <w:t>Código de la aerolínea</w:t>
+            </w:r>
+          </w:p>
+        </w:tc>
+        <w:tc>
+          <w:tcPr>
+            <w:tcW w:type="dxa" w:w="3402"/>
+          </w:tcPr>
+          <w:p>
+            <w:pPr>
+              <w:spacing w:after="0"/>
+            </w:pPr>
+            <w:r>
+              <w:rPr>
+                <w:b w:val="0"/>
+              </w:rPr>
+              <w:t>dim_aerolinea</w:t>
+              <w:br/>
+              <w:t>(dimensión)</w:t>
+            </w:r>
+          </w:p>
+        </w:tc>
+      </w:tr>
+      <w:tr>
+        <w:trPr>
+          <w:cantSplit w:val="true"/>
+        </w:trPr>
+        <w:tc>
+          <w:tcPr>
+            <w:tcW w:type="dxa" w:w="3515"/>
+          </w:tcPr>
+          <w:p>
+            <w:pPr>
+              <w:spacing w:after="0"/>
+            </w:pPr>
+            <w:r>
+              <w:rPr>
+                <w:b w:val="0"/>
+              </w:rPr>
+              <w:t>ORIGIN_AIRPORT</w:t>
+              <w:br/>
+              <w:t>DESTINATION_AIRPORT</w:t>
+            </w:r>
+          </w:p>
+        </w:tc>
+        <w:tc>
+          <w:tcPr>
+            <w:tcW w:type="dxa" w:w="2154"/>
+          </w:tcPr>
+          <w:p>
+            <w:pPr>
+              <w:spacing w:after="0"/>
+            </w:pPr>
+            <w:r>
+              <w:rPr>
+                <w:b w:val="0"/>
+              </w:rPr>
+              <w:t>Aeropuertos de origen y destino</w:t>
+            </w:r>
+          </w:p>
+        </w:tc>
+        <w:tc>
+          <w:tcPr>
+            <w:tcW w:type="dxa" w:w="3402"/>
+          </w:tcPr>
+          <w:p>
+            <w:pPr>
+              <w:spacing w:after="0"/>
+            </w:pPr>
+            <w:r>
+              <w:rPr>
+                <w:b w:val="0"/>
+              </w:rPr>
+              <w:t>dim_aeropuerto, en dos roles</w:t>
+              <w:br/>
+              <w:t>(dimensión)</w:t>
+            </w:r>
+          </w:p>
+        </w:tc>
+      </w:tr>
+      <w:tr>
+        <w:trPr>
+          <w:cantSplit w:val="true"/>
+        </w:trPr>
+        <w:tc>
+          <w:tcPr>
+            <w:tcW w:type="dxa" w:w="3515"/>
+          </w:tcPr>
+          <w:p>
+            <w:pPr>
+              <w:spacing w:after="0"/>
+            </w:pPr>
+            <w:r>
+              <w:rPr>
+                <w:b w:val="0"/>
+              </w:rPr>
+              <w:t>SCHEDULED_DEPARTURE</w:t>
+            </w:r>
+          </w:p>
+        </w:tc>
+        <w:tc>
+          <w:tcPr>
+            <w:tcW w:type="dxa" w:w="2154"/>
+          </w:tcPr>
+          <w:p>
+            <w:pPr>
+              <w:spacing w:after="0"/>
+            </w:pPr>
+            <w:r>
+              <w:rPr>
+                <w:b w:val="0"/>
+              </w:rPr>
+              <w:t>Hora programada de salida (hhmm)</w:t>
+            </w:r>
+          </w:p>
+        </w:tc>
+        <w:tc>
+          <w:tcPr>
+            <w:tcW w:type="dxa" w:w="3402"/>
+          </w:tcPr>
+          <w:p>
+            <w:pPr>
+              <w:spacing w:after="0"/>
+            </w:pPr>
+            <w:r>
+              <w:rPr>
+                <w:b w:val="0"/>
+              </w:rPr>
+              <w:t>salida_programada (degenerada)</w:t>
+              <w:br/>
+              <w:t>dim_hora (dimensión)</w:t>
+            </w:r>
+          </w:p>
+        </w:tc>
+      </w:tr>
+      <w:tr>
+        <w:trPr>
+          <w:cantSplit w:val="true"/>
+        </w:trPr>
+        <w:tc>
+          <w:tcPr>
+            <w:tcW w:type="dxa" w:w="3515"/>
+          </w:tcPr>
+          <w:p>
+            <w:pPr>
+              <w:spacing w:after="0"/>
+            </w:pPr>
+            <w:r>
+              <w:rPr>
+                <w:b w:val="0"/>
+              </w:rPr>
+              <w:t>CANCELLATION_REASON</w:t>
+            </w:r>
+          </w:p>
+        </w:tc>
+        <w:tc>
+          <w:tcPr>
+            <w:tcW w:type="dxa" w:w="2154"/>
+          </w:tcPr>
+          <w:p>
+            <w:pPr>
+              <w:spacing w:after="0"/>
+            </w:pPr>
+            <w:r>
+              <w:rPr>
+                <w:b w:val="0"/>
+              </w:rPr>
+              <w:t>Motivo: A, B, C o D</w:t>
+            </w:r>
+          </w:p>
+        </w:tc>
+        <w:tc>
+          <w:tcPr>
+            <w:tcW w:type="dxa" w:w="3402"/>
+          </w:tcPr>
+          <w:p>
+            <w:pPr>
+              <w:spacing w:after="0"/>
+            </w:pPr>
+            <w:r>
+              <w:rPr>
+                <w:b w:val="0"/>
+              </w:rPr>
+              <w:t>dim_motivo_cancelacion</w:t>
+              <w:br/>
+              <w:t>(dimensión)</w:t>
+            </w:r>
+          </w:p>
+        </w:tc>
+      </w:tr>
+      <w:tr>
+        <w:trPr>
+          <w:cantSplit w:val="true"/>
+        </w:trPr>
+        <w:tc>
+          <w:tcPr>
+            <w:tcW w:type="dxa" w:w="3515"/>
+          </w:tcPr>
+          <w:p>
+            <w:pPr>
+              <w:spacing w:after="0"/>
+            </w:pPr>
+            <w:r>
+              <w:rPr>
+                <w:b w:val="0"/>
+              </w:rPr>
+              <w:t>FLIGHT_NUMBER</w:t>
+              <w:br/>
+              <w:t>TAIL_NUMBER</w:t>
+            </w:r>
+          </w:p>
+        </w:tc>
+        <w:tc>
+          <w:tcPr>
+            <w:tcW w:type="dxa" w:w="2154"/>
+          </w:tcPr>
+          <w:p>
+            <w:pPr>
+              <w:spacing w:after="0"/>
+            </w:pPr>
+            <w:r>
+              <w:rPr>
+                <w:b w:val="0"/>
+              </w:rPr>
+              <w:t>Número de vuelo y matrícula del avión</w:t>
+            </w:r>
+          </w:p>
+        </w:tc>
+        <w:tc>
+          <w:tcPr>
+            <w:tcW w:type="dxa" w:w="3402"/>
+          </w:tcPr>
+          <w:p>
+            <w:pPr>
+              <w:spacing w:after="0"/>
+            </w:pPr>
+            <w:r>
+              <w:rPr>
+                <w:b w:val="0"/>
+              </w:rPr>
+              <w:t>numero_vuelo</w:t>
+              <w:br/>
+              <w:t>matricula_avion</w:t>
+              <w:br/>
+              <w:t>(dimensiones degeneradas)</w:t>
+            </w:r>
+          </w:p>
+        </w:tc>
+      </w:tr>
+      <w:tr>
+        <w:trPr>
+          <w:cantSplit w:val="true"/>
+        </w:trPr>
+        <w:tc>
+          <w:tcPr>
+            <w:tcW w:type="dxa" w:w="3515"/>
+          </w:tcPr>
+          <w:p>
+            <w:pPr>
+              <w:spacing w:after="0"/>
+            </w:pPr>
+            <w:r>
+              <w:rPr>
+                <w:b w:val="0"/>
+              </w:rPr>
+              <w:t>DEPARTURE_DELAY</w:t>
+            </w:r>
+          </w:p>
+        </w:tc>
+        <w:tc>
+          <w:tcPr>
+            <w:tcW w:type="dxa" w:w="2154"/>
+          </w:tcPr>
+          <w:p>
+            <w:pPr>
+              <w:spacing w:after="0"/>
+            </w:pPr>
+            <w:r>
+              <w:rPr>
+                <w:b w:val="0"/>
+              </w:rPr>
+              <w:t>Minutos de retraso en la salida</w:t>
+            </w:r>
+          </w:p>
+        </w:tc>
+        <w:tc>
+          <w:tcPr>
+            <w:tcW w:type="dxa" w:w="3402"/>
+          </w:tcPr>
+          <w:p>
+            <w:pPr>
+              <w:spacing w:after="0"/>
+            </w:pPr>
+            <w:r>
+              <w:rPr>
+                <w:b w:val="0"/>
+              </w:rPr>
+              <w:t>retraso_salida_min</w:t>
+              <w:br/>
+              <w:t>(métrica aditiva)</w:t>
+            </w:r>
+          </w:p>
+        </w:tc>
+      </w:tr>
+      <w:tr>
+        <w:trPr>
+          <w:cantSplit w:val="true"/>
+        </w:trPr>
+        <w:tc>
+          <w:tcPr>
+            <w:tcW w:type="dxa" w:w="3515"/>
+          </w:tcPr>
+          <w:p>
+            <w:pPr>
+              <w:spacing w:after="0"/>
+            </w:pPr>
+            <w:r>
+              <w:rPr>
+                <w:b w:val="0"/>
+              </w:rPr>
+              <w:t>ARRIVAL_DELAY</w:t>
+            </w:r>
+          </w:p>
+        </w:tc>
+        <w:tc>
+          <w:tcPr>
+            <w:tcW w:type="dxa" w:w="2154"/>
+          </w:tcPr>
+          <w:p>
+            <w:pPr>
+              <w:spacing w:after="0"/>
+            </w:pPr>
+            <w:r>
+              <w:rPr>
+                <w:b w:val="0"/>
+              </w:rPr>
+              <w:t>Minutos de retraso en la llegada</w:t>
+            </w:r>
+          </w:p>
+        </w:tc>
+        <w:tc>
+          <w:tcPr>
+            <w:tcW w:type="dxa" w:w="3402"/>
+          </w:tcPr>
+          <w:p>
+            <w:pPr>
+              <w:spacing w:after="0"/>
+            </w:pPr>
+            <w:r>
+              <w:rPr>
+                <w:b w:val="0"/>
+              </w:rPr>
+              <w:t>retraso_llegada_min (métrica aditiva)</w:t>
+              <w:br/>
+              <w:t>es_retrasado, es_puntual (indicadores)</w:t>
+            </w:r>
+          </w:p>
+        </w:tc>
+      </w:tr>
+      <w:tr>
+        <w:trPr>
+          <w:cantSplit w:val="true"/>
+        </w:trPr>
+        <w:tc>
+          <w:tcPr>
+            <w:tcW w:type="dxa" w:w="3515"/>
+          </w:tcPr>
+          <w:p>
+            <w:pPr>
+              <w:spacing w:after="0"/>
+            </w:pPr>
+            <w:r>
+              <w:rPr>
+                <w:b w:val="0"/>
+              </w:rPr>
+              <w:t>TAXI_OUT</w:t>
+              <w:br/>
+              <w:t>TAXI_IN</w:t>
+            </w:r>
+          </w:p>
+        </w:tc>
+        <w:tc>
+          <w:tcPr>
+            <w:tcW w:type="dxa" w:w="2154"/>
+          </w:tcPr>
+          <w:p>
+            <w:pPr>
+              <w:spacing w:after="0"/>
+            </w:pPr>
+            <w:r>
+              <w:rPr>
+                <w:b w:val="0"/>
+              </w:rPr>
+              <w:t>Minutos de rodaje antes del despegue y después del aterrizaje</w:t>
+            </w:r>
+          </w:p>
+        </w:tc>
+        <w:tc>
+          <w:tcPr>
+            <w:tcW w:type="dxa" w:w="3402"/>
+          </w:tcPr>
+          <w:p>
+            <w:pPr>
+              <w:spacing w:after="0"/>
+            </w:pPr>
+            <w:r>
+              <w:rPr>
+                <w:b w:val="0"/>
+              </w:rPr>
+              <w:t>taxi_salida_min</w:t>
+              <w:br/>
+              <w:t>taxi_llegada_min</w:t>
+              <w:br/>
+              <w:t>(métricas aditivas)</w:t>
+            </w:r>
+          </w:p>
+        </w:tc>
+      </w:tr>
+      <w:tr>
+        <w:trPr>
+          <w:cantSplit w:val="true"/>
+        </w:trPr>
+        <w:tc>
+          <w:tcPr>
+            <w:tcW w:type="dxa" w:w="3515"/>
+          </w:tcPr>
+          <w:p>
+            <w:pPr>
+              <w:spacing w:after="0"/>
+            </w:pPr>
+            <w:r>
+              <w:rPr>
+                <w:b w:val="0"/>
+              </w:rPr>
+              <w:t>SCHEDULED_TIME</w:t>
+              <w:br/>
+              <w:t>ELAPSED_TIME</w:t>
+              <w:br/>
+              <w:t>AIR_TIME</w:t>
+            </w:r>
+          </w:p>
+        </w:tc>
+        <w:tc>
+          <w:tcPr>
+            <w:tcW w:type="dxa" w:w="2154"/>
+          </w:tcPr>
+          <w:p>
+            <w:pPr>
+              <w:spacing w:after="0"/>
+            </w:pPr>
+            <w:r>
+              <w:rPr>
+                <w:b w:val="0"/>
+              </w:rPr>
+              <w:t>Duración programada, real y en el aire</w:t>
+            </w:r>
+          </w:p>
+        </w:tc>
+        <w:tc>
+          <w:tcPr>
+            <w:tcW w:type="dxa" w:w="3402"/>
+          </w:tcPr>
+          <w:p>
+            <w:pPr>
+              <w:spacing w:after="0"/>
+            </w:pPr>
+            <w:r>
+              <w:rPr>
+                <w:b w:val="0"/>
+              </w:rPr>
+              <w:t>tiempo_programado_min</w:t>
+              <w:br/>
+              <w:t>tiempo_real_min</w:t>
+              <w:br/>
+              <w:t>tiempo_aire_min</w:t>
+              <w:br/>
+              <w:t>(métricas aditivas)</w:t>
+            </w:r>
+          </w:p>
+        </w:tc>
+      </w:tr>
+      <w:tr>
+        <w:trPr>
+          <w:cantSplit w:val="true"/>
+        </w:trPr>
+        <w:tc>
+          <w:tcPr>
+            <w:tcW w:type="dxa" w:w="3515"/>
+          </w:tcPr>
+          <w:p>
+            <w:pPr>
+              <w:spacing w:after="0"/>
+            </w:pPr>
+            <w:r>
+              <w:rPr>
+                <w:b w:val="0"/>
+              </w:rPr>
+              <w:t>DISTANCE</w:t>
+            </w:r>
+          </w:p>
+        </w:tc>
+        <w:tc>
+          <w:tcPr>
+            <w:tcW w:type="dxa" w:w="2154"/>
+          </w:tcPr>
+          <w:p>
+            <w:pPr>
+              <w:spacing w:after="0"/>
+            </w:pPr>
+            <w:r>
+              <w:rPr>
+                <w:b w:val="0"/>
+              </w:rPr>
+              <w:t>Distancia en millas</w:t>
+            </w:r>
+          </w:p>
+        </w:tc>
+        <w:tc>
+          <w:tcPr>
+            <w:tcW w:type="dxa" w:w="3402"/>
+          </w:tcPr>
+          <w:p>
+            <w:pPr>
+              <w:spacing w:after="0"/>
+            </w:pPr>
+            <w:r>
+              <w:rPr>
+                <w:b w:val="0"/>
+              </w:rPr>
+              <w:t>distancia_millas</w:t>
+              <w:br/>
+              <w:t>(métrica aditiva)</w:t>
+            </w:r>
+          </w:p>
+        </w:tc>
+      </w:tr>
+      <w:tr>
+        <w:trPr>
+          <w:cantSplit w:val="true"/>
+        </w:trPr>
+        <w:tc>
+          <w:tcPr>
+            <w:tcW w:type="dxa" w:w="3515"/>
+          </w:tcPr>
+          <w:p>
+            <w:pPr>
+              <w:spacing w:after="0"/>
+            </w:pPr>
+            <w:r>
+              <w:rPr>
+                <w:b w:val="0"/>
+              </w:rPr>
+              <w:t>AIRLINE_DELAY</w:t>
+              <w:br/>
+              <w:t>WEATHER_DELAY</w:t>
+              <w:br/>
+              <w:t>AIR_SYSTEM_DELAY</w:t>
+              <w:br/>
+              <w:t>SECURITY_DELAY</w:t>
+              <w:br/>
+              <w:t>LATE_AIRCRAFT_DELAY</w:t>
+            </w:r>
+          </w:p>
+        </w:tc>
+        <w:tc>
+          <w:tcPr>
+            <w:tcW w:type="dxa" w:w="2154"/>
+          </w:tcPr>
+          <w:p>
+            <w:pPr>
+              <w:spacing w:after="0"/>
+            </w:pPr>
+            <w:r>
+              <w:rPr>
+                <w:b w:val="0"/>
+              </w:rPr>
+              <w:t>Minutos de retraso por causa: aerolínea, clima, sistema aéreo, seguridad y avión tardío</w:t>
+            </w:r>
+          </w:p>
+        </w:tc>
+        <w:tc>
+          <w:tcPr>
+            <w:tcW w:type="dxa" w:w="3402"/>
+          </w:tcPr>
+          <w:p>
+            <w:pPr>
+              <w:spacing w:after="0"/>
+            </w:pPr>
+            <w:r>
+              <w:rPr>
+                <w:b w:val="0"/>
+              </w:rPr>
+              <w:t>retraso_aerolinea_min</w:t>
+              <w:br/>
+              <w:t>retraso_clima_min</w:t>
+              <w:br/>
+              <w:t>retraso_sistema_aereo_min</w:t>
+              <w:br/>
+              <w:t>retraso_seguridad_min</w:t>
+              <w:br/>
+              <w:t>retraso_avion_tardio_min</w:t>
+              <w:br/>
+              <w:t>(métricas aditivas)</w:t>
+            </w:r>
+          </w:p>
+        </w:tc>
+      </w:tr>
+      <w:tr>
+        <w:trPr>
+          <w:cantSplit w:val="true"/>
+        </w:trPr>
+        <w:tc>
+          <w:tcPr>
+            <w:tcW w:type="dxa" w:w="3515"/>
+          </w:tcPr>
+          <w:p>
+            <w:pPr>
+              <w:spacing w:after="0"/>
+            </w:pPr>
+            <w:r>
+              <w:rPr>
+                <w:b w:val="0"/>
+              </w:rPr>
+              <w:t>CANCELLED</w:t>
+              <w:br/>
+              <w:t>DIVERTED</w:t>
+            </w:r>
+          </w:p>
+        </w:tc>
+        <w:tc>
+          <w:tcPr>
+            <w:tcW w:type="dxa" w:w="2154"/>
+          </w:tcPr>
+          <w:p>
+            <w:pPr>
+              <w:spacing w:after="0"/>
+            </w:pPr>
+            <w:r>
+              <w:rPr>
+                <w:b w:val="0"/>
+              </w:rPr>
+              <w:t>1 si el vuelo fue cancelado o desviado</w:t>
+            </w:r>
+          </w:p>
+        </w:tc>
+        <w:tc>
+          <w:tcPr>
+            <w:tcW w:type="dxa" w:w="3402"/>
+          </w:tcPr>
+          <w:p>
+            <w:pPr>
+              <w:spacing w:after="0"/>
+            </w:pPr>
+            <w:r>
+              <w:rPr>
+                <w:b w:val="0"/>
+              </w:rPr>
+              <w:t>es_cancelado</w:t>
+              <w:br/>
+              <w:t>es_desviado</w:t>
+              <w:br/>
+              <w:t>(indicadores 0/1)</w:t>
+            </w:r>
+          </w:p>
+        </w:tc>
+      </w:tr>
+      <w:tr>
+        <w:trPr>
+          <w:cantSplit w:val="true"/>
+        </w:trPr>
+        <w:tc>
+          <w:tcPr>
+            <w:tcW w:type="dxa" w:w="3515"/>
+          </w:tcPr>
+          <w:p>
+            <w:pPr>
+              <w:spacing w:after="0"/>
+            </w:pPr>
+            <w:r>
+              <w:rPr>
+                <w:b w:val="0"/>
+              </w:rPr>
+              <w:t>DEPARTURE_TIME</w:t>
+              <w:br/>
+              <w:t>WHEELS_OFF</w:t>
+              <w:br/>
+              <w:t>WHEELS_ON</w:t>
+              <w:br/>
+              <w:t>SCHEDULED_ARRIVAL</w:t>
+              <w:br/>
+              <w:t>ARRIVAL_TIME</w:t>
+            </w:r>
+          </w:p>
+        </w:tc>
+        <w:tc>
+          <w:tcPr>
+            <w:tcW w:type="dxa" w:w="2154"/>
+          </w:tcPr>
+          <w:p>
+            <w:pPr>
+              <w:spacing w:after="0"/>
+            </w:pPr>
+            <w:r>
+              <w:rPr>
+                <w:b w:val="0"/>
+              </w:rPr>
+              <w:t>Horas reales y programadas de cada etapa del vuelo</w:t>
+            </w:r>
+          </w:p>
+        </w:tc>
+        <w:tc>
+          <w:tcPr>
+            <w:tcW w:type="dxa" w:w="3402"/>
+          </w:tcPr>
+          <w:p>
+            <w:pPr>
+              <w:spacing w:after="0"/>
+            </w:pPr>
+            <w:r>
+              <w:rPr>
+                <w:b w:val="0"/>
+              </w:rPr>
+              <w:t>No se cargan: lo necesario ya está en los retrasos y los tiempos</w:t>
+            </w:r>
+          </w:p>
+        </w:tc>
+      </w:tr>
+      <w:tr>
+        <w:trPr>
+          <w:cantSplit w:val="true"/>
+        </w:trPr>
+        <w:tc>
+          <w:tcPr>
+            <w:tcW w:type="dxa" w:w="3515"/>
+          </w:tcPr>
+          <w:p>
+            <w:pPr>
+              <w:spacing w:after="0"/>
+            </w:pPr>
+            <w:r>
+              <w:rPr>
+                <w:b w:val="0"/>
+              </w:rPr>
+              <w:t>airlines.csv: IATA_CODE, AIRLINE</w:t>
+            </w:r>
+          </w:p>
+        </w:tc>
+        <w:tc>
+          <w:tcPr>
+            <w:tcW w:type="dxa" w:w="2154"/>
+          </w:tcPr>
+          <w:p>
+            <w:pPr>
+              <w:spacing w:after="0"/>
+            </w:pPr>
+            <w:r>
+              <w:rPr>
+                <w:b w:val="0"/>
+              </w:rPr>
+              <w:t>Código y nombre de la aerolínea</w:t>
+            </w:r>
+          </w:p>
+        </w:tc>
+        <w:tc>
+          <w:tcPr>
+            <w:tcW w:type="dxa" w:w="3402"/>
+          </w:tcPr>
+          <w:p>
+            <w:pPr>
+              <w:spacing w:after="0"/>
+            </w:pPr>
+            <w:r>
+              <w:rPr>
+                <w:b w:val="0"/>
+              </w:rPr>
+              <w:t>dim_aerolinea</w:t>
+              <w:br/>
+              <w:t>(dimensión)</w:t>
+            </w:r>
+          </w:p>
+        </w:tc>
+      </w:tr>
+      <w:tr>
+        <w:trPr>
+          <w:cantSplit w:val="true"/>
+        </w:trPr>
+        <w:tc>
+          <w:tcPr>
+            <w:tcW w:type="dxa" w:w="3515"/>
+          </w:tcPr>
+          <w:p>
+            <w:pPr>
+              <w:spacing w:after="0"/>
+            </w:pPr>
+            <w:r>
+              <w:rPr>
+                <w:b w:val="0"/>
+              </w:rPr>
+              <w:t>airports.csv: IATA_CODE, AIRPORT, CITY, STATE, COUNTRY, LATITUDE, LONGITUDE</w:t>
+            </w:r>
+          </w:p>
+        </w:tc>
+        <w:tc>
+          <w:tcPr>
+            <w:tcW w:type="dxa" w:w="2154"/>
+          </w:tcPr>
+          <w:p>
+            <w:pPr>
+              <w:spacing w:after="0"/>
+            </w:pPr>
+            <w:r>
+              <w:rPr>
+                <w:b w:val="0"/>
+              </w:rPr>
+              <w:t>Datos de cada aeropuerto</w:t>
+            </w:r>
+          </w:p>
+        </w:tc>
+        <w:tc>
+          <w:tcPr>
+            <w:tcW w:type="dxa" w:w="3402"/>
+          </w:tcPr>
+          <w:p>
+            <w:pPr>
+              <w:spacing w:after="0"/>
+            </w:pPr>
+            <w:r>
+              <w:rPr>
+                <w:b w:val="0"/>
+              </w:rPr>
+              <w:t>dim_aeropuerto; la región se deriva del estado</w:t>
+              <w:br/>
+              <w:t>(dimensión)</w:t>
+            </w:r>
+          </w:p>
+        </w:tc>
+      </w:tr>
+    </w:tbl>
+    <w:p>
+      <w:pPr>
+        <w:spacing w:after="0"/>
+      </w:pPr>
+    </w:p>
+    <w:p>
+      <w:pPr>
         <w:pStyle w:val="ListBullet"/>
         <w:spacing w:after="20"/>
         <w:jc w:val="both"/>

</xml_diff>

<commit_message>
Agregar la carátula de la Universidad NUR
La primera página es ahora la carátula con el logo de la universidad,
la materia, el docente, los integrantes y el proyecto; reemplaza el
encabezado con datos pendientes.

Co-Authored-By: Claude Opus 5.5 <noreply@anthropic.com>
Claude-Session: https://claude.ai/code/session_01UrpbqW5jvhcx6qo3xxD3vZ
</commit_message>
<xml_diff>
--- a/proyecto-dw-vuelos/docs/Primera_Presentacion_DW_Vuelos.docx
+++ b/proyecto-dw-vuelos/docs/Primera_Presentacion_DW_Vuelos.docx
@@ -4,35 +4,235 @@
   <w:body>
     <w:p>
       <w:pPr>
+        <w:spacing w:before="360" w:after="1200"/>
         <w:jc w:val="center"/>
       </w:pPr>
       <w:r>
-        <w:rPr>
-          <w:b/>
-        </w:rPr>
-        <w:t>[Universidad] – Base de Datos III – Proyecto: Implementación de un Data Warehouse</w:t>
+        <w:drawing>
+          <wp:inline xmlns:a="http://schemas.openxmlformats.org/drawingml/2006/main" xmlns:pic="http://schemas.openxmlformats.org/drawingml/2006/picture">
+            <wp:extent cx="5220000" cy="3725311"/>
+            <wp:docPr id="1" name="Picture 1"/>
+            <wp:cNvGraphicFramePr>
+              <a:graphicFrameLocks noChangeAspect="1"/>
+            </wp:cNvGraphicFramePr>
+            <a:graphic>
+              <a:graphicData uri="http://schemas.openxmlformats.org/drawingml/2006/picture">
+                <pic:pic>
+                  <pic:nvPicPr>
+                    <pic:cNvPr id="0" name="logo_nur.png"/>
+                    <pic:cNvPicPr/>
+                  </pic:nvPicPr>
+                  <pic:blipFill>
+                    <a:blip r:embed="rId9"/>
+                    <a:stretch>
+                      <a:fillRect/>
+                    </a:stretch>
+                  </pic:blipFill>
+                  <pic:spPr>
+                    <a:xfrm>
+                      <a:off x="0" y="0"/>
+                      <a:ext cx="5220000" cy="3725311"/>
+                    </a:xfrm>
+                    <a:prstGeom prst="rect"/>
+                  </pic:spPr>
+                </pic:pic>
+              </a:graphicData>
+            </a:graphic>
+          </wp:inline>
+        </w:drawing>
       </w:r>
     </w:p>
+    <w:tbl>
+      <w:tblPr>
+        <w:tblW w:type="auto" w:w="0"/>
+        <w:tblLayout w:type="fixed"/>
+        <w:tblLook w:firstColumn="1" w:firstRow="1" w:lastColumn="0" w:lastRow="0" w:noHBand="0" w:noVBand="1" w:val="04A0"/>
+      </w:tblPr>
+      <w:tblGrid>
+        <w:gridCol w:w="3175"/>
+        <w:gridCol w:w="5896"/>
+      </w:tblGrid>
+      <w:tr>
+        <w:tc>
+          <w:tcPr>
+            <w:tcW w:type="dxa" w:w="3175"/>
+          </w:tcPr>
+          <w:p>
+            <w:pPr>
+              <w:spacing w:after="360"/>
+            </w:pPr>
+            <w:r>
+              <w:rPr>
+                <w:rFonts w:ascii="Times New Roman" w:hAnsi="Times New Roman" w:eastAsia="Times New Roman" w:cs="Times New Roman"/>
+                <w:b/>
+                <w:sz w:val="24"/>
+              </w:rPr>
+              <w:t>Materia / Asignatura:</w:t>
+            </w:r>
+          </w:p>
+        </w:tc>
+        <w:tc>
+          <w:tcPr>
+            <w:tcW w:type="dxa" w:w="5896"/>
+          </w:tcPr>
+          <w:p>
+            <w:pPr>
+              <w:spacing w:line="480" w:lineRule="auto" w:after="360"/>
+            </w:pPr>
+            <w:r>
+              <w:rPr>
+                <w:rFonts w:ascii="Times New Roman" w:hAnsi="Times New Roman" w:eastAsia="Times New Roman" w:cs="Times New Roman"/>
+                <w:b w:val="0"/>
+                <w:sz w:val="24"/>
+              </w:rPr>
+              <w:t>Base de Datos III</w:t>
+            </w:r>
+          </w:p>
+        </w:tc>
+      </w:tr>
+      <w:tr>
+        <w:tc>
+          <w:tcPr>
+            <w:tcW w:type="dxa" w:w="3175"/>
+          </w:tcPr>
+          <w:p>
+            <w:pPr>
+              <w:spacing w:after="360"/>
+            </w:pPr>
+            <w:r>
+              <w:rPr>
+                <w:rFonts w:ascii="Times New Roman" w:hAnsi="Times New Roman" w:eastAsia="Times New Roman" w:cs="Times New Roman"/>
+                <w:b/>
+                <w:sz w:val="24"/>
+              </w:rPr>
+              <w:t>Docente / Profesor:</w:t>
+            </w:r>
+          </w:p>
+        </w:tc>
+        <w:tc>
+          <w:tcPr>
+            <w:tcW w:type="dxa" w:w="5896"/>
+          </w:tcPr>
+          <w:p>
+            <w:pPr>
+              <w:spacing w:line="480" w:lineRule="auto" w:after="360"/>
+            </w:pPr>
+            <w:r>
+              <w:rPr>
+                <w:rFonts w:ascii="Times New Roman" w:hAnsi="Times New Roman" w:eastAsia="Times New Roman" w:cs="Times New Roman"/>
+                <w:b w:val="0"/>
+                <w:sz w:val="24"/>
+              </w:rPr>
+              <w:t>Rodnie Montaño Aguilera</w:t>
+            </w:r>
+          </w:p>
+        </w:tc>
+      </w:tr>
+      <w:tr>
+        <w:tc>
+          <w:tcPr>
+            <w:tcW w:type="dxa" w:w="3175"/>
+          </w:tcPr>
+          <w:p>
+            <w:pPr>
+              <w:spacing w:after="360"/>
+            </w:pPr>
+            <w:r>
+              <w:rPr>
+                <w:rFonts w:ascii="Times New Roman" w:hAnsi="Times New Roman" w:eastAsia="Times New Roman" w:cs="Times New Roman"/>
+                <w:b/>
+                <w:sz w:val="24"/>
+              </w:rPr>
+              <w:t>Estudiante / Integrantes:</w:t>
+            </w:r>
+          </w:p>
+        </w:tc>
+        <w:tc>
+          <w:tcPr>
+            <w:tcW w:type="dxa" w:w="5896"/>
+          </w:tcPr>
+          <w:p>
+            <w:pPr>
+              <w:tabs>
+                <w:tab w:pos="680" w:val="left"/>
+              </w:tabs>
+              <w:spacing w:line="480" w:lineRule="auto" w:after="0"/>
+              <w:ind w:left="680" w:hanging="340"/>
+            </w:pPr>
+            <w:r>
+              <w:rPr>
+                <w:rFonts w:ascii="Times New Roman" w:hAnsi="Times New Roman" w:eastAsia="Times New Roman" w:cs="Times New Roman"/>
+                <w:b w:val="0"/>
+                <w:sz w:val="24"/>
+              </w:rPr>
+              <w:t>•</w:t>
+              <w:tab/>
+              <w:t>Jhonatan Moisés Villca</w:t>
+            </w:r>
+          </w:p>
+          <w:p>
+            <w:pPr>
+              <w:tabs>
+                <w:tab w:pos="680" w:val="left"/>
+              </w:tabs>
+              <w:spacing w:line="480" w:lineRule="auto" w:after="360"/>
+              <w:ind w:left="680" w:hanging="340"/>
+            </w:pPr>
+            <w:r>
+              <w:rPr>
+                <w:rFonts w:ascii="Times New Roman" w:hAnsi="Times New Roman" w:eastAsia="Times New Roman" w:cs="Times New Roman"/>
+                <w:b w:val="0"/>
+                <w:sz w:val="24"/>
+              </w:rPr>
+              <w:t>•</w:t>
+              <w:tab/>
+              <w:t>Pedro Visir Valda</w:t>
+            </w:r>
+          </w:p>
+        </w:tc>
+      </w:tr>
+      <w:tr>
+        <w:tc>
+          <w:tcPr>
+            <w:tcW w:type="dxa" w:w="3175"/>
+          </w:tcPr>
+          <w:p>
+            <w:pPr>
+              <w:spacing w:after="360"/>
+            </w:pPr>
+            <w:r>
+              <w:rPr>
+                <w:rFonts w:ascii="Times New Roman" w:hAnsi="Times New Roman" w:eastAsia="Times New Roman" w:cs="Times New Roman"/>
+                <w:b/>
+                <w:sz w:val="24"/>
+              </w:rPr>
+              <w:t>Proyecto:</w:t>
+            </w:r>
+          </w:p>
+        </w:tc>
+        <w:tc>
+          <w:tcPr>
+            <w:tcW w:type="dxa" w:w="5896"/>
+          </w:tcPr>
+          <w:p>
+            <w:pPr>
+              <w:spacing w:line="480" w:lineRule="auto" w:after="360"/>
+            </w:pPr>
+            <w:r>
+              <w:rPr>
+                <w:rFonts w:ascii="Times New Roman" w:hAnsi="Times New Roman" w:eastAsia="Times New Roman" w:cs="Times New Roman"/>
+                <w:b w:val="0"/>
+                <w:sz w:val="24"/>
+              </w:rPr>
+              <w:t>Análisis de la puntualidad, los retrasos y las cancelaciones de los vuelos comerciales nacionales de Estados Unidos en 2015</w:t>
+            </w:r>
+          </w:p>
+        </w:tc>
+      </w:tr>
+    </w:tbl>
     <w:p>
-      <w:pPr>
-        <w:jc w:val="center"/>
-      </w:pPr>
       <w:r>
-        <w:rPr>
-          <w:b/>
-        </w:rPr>
-        <w:t>Primera Presentación (puntos 1 a 5): Data Warehouse de puntualidad de vuelos en EE. UU. (2015)</w:t>
-      </w:r>
-    </w:p>
-    <w:p>
-      <w:pPr>
-        <w:jc w:val="center"/>
-      </w:pPr>
-      <w:r>
-        <w:rPr>
-          <w:b w:val="0"/>
-        </w:rPr>
-        <w:t>Integrantes: Jhonatan Moisés Villca, [Integrante 2], [Integrante 3] – Docente: Rodnie Montaño Aguilera</w:t>
+        <w:br w:type="page"/>
       </w:r>
     </w:p>
     <w:p>
@@ -749,7 +949,7 @@
         <w:drawing>
           <wp:inline xmlns:a="http://schemas.openxmlformats.org/drawingml/2006/main" xmlns:pic="http://schemas.openxmlformats.org/drawingml/2006/picture">
             <wp:extent cx="5580000" cy="3627000"/>
-            <wp:docPr id="1" name="Picture 1"/>
+            <wp:docPr id="2" name="Picture 2"/>
             <wp:cNvGraphicFramePr>
               <a:graphicFrameLocks noChangeAspect="1"/>
             </wp:cNvGraphicFramePr>
@@ -761,7 +961,7 @@
                     <pic:cNvPicPr/>
                   </pic:nvPicPr>
                   <pic:blipFill>
-                    <a:blip r:embed="rId9"/>
+                    <a:blip r:embed="rId10"/>
                     <a:stretch>
                       <a:fillRect/>
                     </a:stretch>
@@ -2226,7 +2426,7 @@
         <w:drawing>
           <wp:inline xmlns:a="http://schemas.openxmlformats.org/drawingml/2006/main" xmlns:pic="http://schemas.openxmlformats.org/drawingml/2006/picture">
             <wp:extent cx="9540000" cy="4569660"/>
-            <wp:docPr id="2" name="Picture 2"/>
+            <wp:docPr id="3" name="Picture 3"/>
             <wp:cNvGraphicFramePr>
               <a:graphicFrameLocks noChangeAspect="1"/>
             </wp:cNvGraphicFramePr>
@@ -2238,7 +2438,7 @@
                     <pic:cNvPicPr/>
                   </pic:nvPicPr>
                   <pic:blipFill>
-                    <a:blip r:embed="rId10"/>
+                    <a:blip r:embed="rId11"/>
                     <a:stretch>
                       <a:fillRect/>
                     </a:stretch>
@@ -2417,7 +2617,7 @@
         <w:drawing>
           <wp:inline xmlns:a="http://schemas.openxmlformats.org/drawingml/2006/main" xmlns:pic="http://schemas.openxmlformats.org/drawingml/2006/picture">
             <wp:extent cx="9540000" cy="4569660"/>
-            <wp:docPr id="3" name="Picture 3"/>
+            <wp:docPr id="4" name="Picture 4"/>
             <wp:cNvGraphicFramePr>
               <a:graphicFrameLocks noChangeAspect="1"/>
             </wp:cNvGraphicFramePr>
@@ -2429,7 +2629,7 @@
                     <pic:cNvPicPr/>
                   </pic:nvPicPr>
                   <pic:blipFill>
-                    <a:blip r:embed="rId11"/>
+                    <a:blip r:embed="rId12"/>
                     <a:stretch>
                       <a:fillRect/>
                     </a:stretch>

</xml_diff>

<commit_message>
Reorganizar el documento de la primera presentación
Subtítulos numerados (1.1 a 5.4), tablas y figuras numeradas con su
título, redacción más simple y las figuras ubicadas donde no dejan
páginas medio vacías. La tabla de columnas del dataset ahora muestra
una columna por línea, alineada con su campo en el DataMart.

Co-Authored-By: Claude Opus 5.5 <noreply@anthropic.com>
Claude-Session: https://claude.ai/code/session_01UrpbqW5jvhcx6qo3xxD3vZ
</commit_message>
<xml_diff>
--- a/proyecto-dw-vuelos/docs/Primera_Presentacion_DW_Vuelos.docx
+++ b/proyecto-dw-vuelos/docs/Primera_Presentacion_DW_Vuelos.docx
@@ -238,105 +238,13 @@
     <w:p>
       <w:pPr>
         <w:keepNext/>
-        <w:spacing w:before="120"/>
+        <w:spacing w:before="240" w:after="120"/>
       </w:pPr>
       <w:r>
         <w:rPr>
           <w:b/>
         </w:rPr>
-        <w:t>1. Tema del Proyecto</w:t>
-      </w:r>
-    </w:p>
-    <w:p>
-      <w:pPr>
-        <w:jc w:val="both"/>
-      </w:pPr>
-      <w:r>
-        <w:rPr>
-          <w:b/>
-        </w:rPr>
-        <w:t>Tema:</w:t>
-      </w:r>
-      <w:r>
-        <w:rPr>
-          <w:b w:val="0"/>
-        </w:rPr>
-        <w:t xml:space="preserve"> análisis de la puntualidad, los retrasos y las cancelaciones de los vuelos comerciales nacionales de Estados Unidos en 2015. </w:t>
-      </w:r>
-      <w:r>
-        <w:rPr>
-          <w:b/>
-        </w:rPr>
-        <w:t>Conjunto de datos:</w:t>
-      </w:r>
-      <w:r>
-        <w:rPr>
-          <w:b w:val="0"/>
-        </w:rPr>
-        <w:t xml:space="preserve"> «2015 Flight Delays and Cancellations» de Kaggle, publicado por el Departamento de Transporte de EE. UU. con datos de la Oficina de Estadísticas de Transporte (BTS). Tiene tres archivos CSV: flights.csv (≈ 5,8 millones de vuelos con fecha, aerolínea, número de vuelo, aeropuertos de origen y destino, horarios programados y reales, retrasos, tiempos de rodaje y de vuelo, distancia, cancelación, desvío y minutos de retraso por causa), airlines.csv (14 aerolíneas) y airports.csv (322 aeropuertos con ciudad, estado y coordenadas).</w:t>
-      </w:r>
-    </w:p>
-    <w:p>
-      <w:pPr>
-        <w:jc w:val="both"/>
-      </w:pPr>
-      <w:r>
-        <w:rPr>
-          <w:b/>
-        </w:rPr>
-        <w:t>Enlace del conjunto de datos:</w:t>
-      </w:r>
-      <w:r>
-        <w:rPr>
-          <w:b w:val="0"/>
-        </w:rPr>
-        <w:t xml:space="preserve"> https://www.kaggle.com/datasets/usdot/flight-delays</w:t>
-      </w:r>
-    </w:p>
-    <w:p>
-      <w:pPr>
-        <w:jc w:val="both"/>
-      </w:pPr>
-      <w:r>
-        <w:rPr>
-          <w:b/>
-        </w:rPr>
-        <w:t>Suficiencia de los datos:</w:t>
-      </w:r>
-      <w:r>
-        <w:rPr>
-          <w:b w:val="0"/>
-        </w:rPr>
-        <w:t xml:space="preserve"> cada vuelo es un evento medible con métricas numéricas (minutos de retraso, tiempos, distancia) y con descriptores que forman dimensiones con jerarquías: año → trimestre → mes → fecha, franja horaria → hora y región → estado → ciudad → aeropuerto. El volumen y los problemas de calidad (horas en formato hhmm, valores vacíos en vuelos cancelados o desviados, aeropuertos con códigos numéricos en lugar del código IATA en octubre) justifican un Data Warehouse y un proceso ETL.</w:t>
-      </w:r>
-    </w:p>
-    <w:p>
-      <w:pPr>
-        <w:jc w:val="both"/>
-      </w:pPr>
-      <w:r>
-        <w:rPr>
-          <w:b/>
-        </w:rPr>
-        <w:t>Contexto y necesidad de análisis:</w:t>
-      </w:r>
-      <w:r>
-        <w:rPr>
-          <w:b w:val="0"/>
-        </w:rPr>
-        <w:t xml:space="preserve"> según la BTS, un vuelo está retrasado si llega 15 minutos o más después de lo programado, y las aerolíneas informan la causa (la propia aerolínea, el clima, el sistema aéreo nacional, la seguridad o la llegada tardía del avión). Los vuelos están en un único archivo plano (flights.csv), útil para registrarlos pero no para analizarlos. La necesidad es </w:t>
-      </w:r>
-      <w:r>
-        <w:rPr>
-          <w:b/>
-        </w:rPr>
-        <w:t>saber dónde, cuándo y por qué se producen los retrasos y las cancelaciones</w:t>
-      </w:r>
-      <w:r>
-        <w:rPr>
-          <w:b w:val="0"/>
-        </w:rPr>
-        <w:t xml:space="preserve"> (por aerolínea, aeropuerto, ruta, horario y causa), para que aerolíneas, aeropuertos y pasajeros tomen mejores decisiones. No es un tema de ventas ni de inventario: es el análisis del desempeño operativo de un sistema de transporte.</w:t>
+        <w:t>1. TEMA DEL PROYECTO</w:t>
       </w:r>
     </w:p>
     <w:p>
@@ -348,7 +256,7 @@
         <w:rPr>
           <w:b/>
         </w:rPr>
-        <w:t>2. Objetivos del Data Warehouse</w:t>
+        <w:t>1.1 Tema seleccionado</w:t>
       </w:r>
     </w:p>
     <w:p>
@@ -356,16 +264,19 @@
         <w:jc w:val="both"/>
       </w:pPr>
       <w:r>
+        <w:t>El proyecto analiza la puntualidad de los vuelos comerciales nacionales de Estados Unidos durante el año 2015. Se estudian los retrasos, las cancelaciones y los desvíos de los vuelos según la aerolínea, el aeropuerto, la ruta, la fecha y la hora de salida.</w:t>
+      </w:r>
+    </w:p>
+    <w:p>
+      <w:pPr>
+        <w:keepNext/>
+        <w:spacing w:before="120"/>
+      </w:pPr>
+      <w:r>
         <w:rPr>
           <w:b/>
         </w:rPr>
-        <w:t>Objetivo general:</w:t>
-      </w:r>
-      <w:r>
-        <w:rPr>
-          <w:b w:val="0"/>
-        </w:rPr>
-        <w:t xml:space="preserve"> implementar un Data Warehouse con un DataMart de Puntualidad de Vuelos que integre los vuelos de 2015 para analizar la puntualidad, los retrasos y las cancelaciones por aerolínea, aeropuerto, ruta y período, mediante indicadores, consultas, cubos OLAP, reportes y cuadros de mando.</w:t>
+        <w:t>1.2 Conjunto de datos</w:t>
       </w:r>
     </w:p>
     <w:p>
@@ -373,16 +284,38 @@
         <w:jc w:val="both"/>
       </w:pPr>
       <w:r>
+        <w:t>Los datos se obtuvieron de Kaggle, del conjunto de datos "2015 Flight Delays and Cancellations", publicado por el Departamento de Transporte de los Estados Unidos con información de la Oficina de Estadísticas de Transporte (BTS).</w:t>
+      </w:r>
+    </w:p>
+    <w:p>
+      <w:pPr>
+        <w:jc w:val="both"/>
+      </w:pPr>
+      <w:r>
+        <w:t>Enlace: https://www.kaggle.com/datasets/usdot/flight-delays</w:t>
+      </w:r>
+    </w:p>
+    <w:p>
+      <w:pPr>
+        <w:jc w:val="both"/>
+      </w:pPr>
+      <w:r>
+        <w:t>El conjunto de datos está formado por tres archivos CSV, que se describen en la Tabla 1.</w:t>
+      </w:r>
+    </w:p>
+    <w:p>
+      <w:pPr>
+        <w:keepNext/>
+        <w:spacing w:after="60"/>
+      </w:pPr>
+      <w:r>
         <w:rPr>
           <w:b/>
         </w:rPr>
-        <w:t>Objetivos específicos</w:t>
+        <w:t xml:space="preserve">Tabla 1. </w:t>
       </w:r>
       <w:r>
-        <w:rPr>
-          <w:b w:val="0"/>
-        </w:rPr>
-        <w:t xml:space="preserve"> (cada uno se mide con el indicador indicado y se responde con una consulta SQL):</w:t>
+        <w:t>Archivos del conjunto de datos</w:t>
       </w:r>
     </w:p>
     <w:tbl>
@@ -393,59 +326,63 @@
         <w:tblLook w:firstColumn="1" w:firstRow="1" w:lastColumn="0" w:lastRow="0" w:noHBand="0" w:noVBand="1" w:val="04A0"/>
       </w:tblPr>
       <w:tblGrid>
-        <w:gridCol w:w="794"/>
-        <w:gridCol w:w="4649"/>
-        <w:gridCol w:w="3628"/>
+        <w:gridCol w:w="1814"/>
+        <w:gridCol w:w="5556"/>
+        <w:gridCol w:w="1701"/>
       </w:tblGrid>
       <w:tr>
         <w:trPr>
           <w:cantSplit w:val="true"/>
+          <w:tblHeader w:val="true"/>
         </w:trPr>
         <w:tc>
           <w:tcPr>
-            <w:tcW w:type="dxa" w:w="794"/>
+            <w:tcW w:type="dxa" w:w="1814"/>
+            <w:shd w:val="clear" w:color="auto" w:fill="D9D9D9"/>
           </w:tcPr>
           <w:p>
             <w:pPr>
-              <w:spacing w:after="0"/>
+              <w:spacing w:after="0" w:line="240" w:lineRule="auto"/>
             </w:pPr>
             <w:r>
               <w:rPr>
                 <w:b/>
               </w:rPr>
-              <w:t>Cód.</w:t>
+              <w:t>Archivo</w:t>
             </w:r>
           </w:p>
         </w:tc>
         <w:tc>
           <w:tcPr>
-            <w:tcW w:type="dxa" w:w="4649"/>
+            <w:tcW w:type="dxa" w:w="5556"/>
+            <w:shd w:val="clear" w:color="auto" w:fill="D9D9D9"/>
           </w:tcPr>
           <w:p>
             <w:pPr>
-              <w:spacing w:after="0"/>
+              <w:spacing w:after="0" w:line="240" w:lineRule="auto"/>
             </w:pPr>
             <w:r>
               <w:rPr>
                 <w:b/>
               </w:rPr>
-              <w:t>Objetivo específico</w:t>
+              <w:t>Contenido</w:t>
             </w:r>
           </w:p>
         </w:tc>
         <w:tc>
           <w:tcPr>
-            <w:tcW w:type="dxa" w:w="3628"/>
+            <w:tcW w:type="dxa" w:w="1701"/>
+            <w:shd w:val="clear" w:color="auto" w:fill="D9D9D9"/>
           </w:tcPr>
           <w:p>
             <w:pPr>
-              <w:spacing w:after="0"/>
+              <w:spacing w:after="0" w:line="240" w:lineRule="auto"/>
             </w:pPr>
             <w:r>
               <w:rPr>
                 <w:b/>
               </w:rPr>
-              <w:t>Indicador (cómo se mide)</w:t>
+              <w:t>Registros</w:t>
             </w:r>
           </w:p>
         </w:tc>
@@ -456,49 +393,49 @@
         </w:trPr>
         <w:tc>
           <w:tcPr>
-            <w:tcW w:type="dxa" w:w="794"/>
+            <w:tcW w:type="dxa" w:w="1814"/>
           </w:tcPr>
           <w:p>
             <w:pPr>
-              <w:spacing w:after="0"/>
+              <w:spacing w:after="0" w:line="240" w:lineRule="auto"/>
             </w:pPr>
             <w:r>
               <w:rPr>
                 <w:b w:val="0"/>
               </w:rPr>
-              <w:t>OE1</w:t>
+              <w:t>flights.csv</w:t>
             </w:r>
           </w:p>
         </w:tc>
         <w:tc>
           <w:tcPr>
-            <w:tcW w:type="dxa" w:w="4649"/>
+            <w:tcW w:type="dxa" w:w="5556"/>
           </w:tcPr>
           <w:p>
             <w:pPr>
-              <w:spacing w:after="0"/>
+              <w:spacing w:after="0" w:line="240" w:lineRule="auto"/>
             </w:pPr>
             <w:r>
               <w:rPr>
                 <w:b w:val="0"/>
               </w:rPr>
-              <w:t>Medir la puntualidad de cada aerolínea por mes.</w:t>
+              <w:t>Un registro por vuelo con la fecha, la aerolínea, el número de vuelo, los aeropuertos de origen y destino, los horarios, los retrasos, los tiempos de vuelo, la distancia, la cancelación, el desvío y las causas del retraso.</w:t>
             </w:r>
           </w:p>
         </w:tc>
         <w:tc>
           <w:tcPr>
-            <w:tcW w:type="dxa" w:w="3628"/>
+            <w:tcW w:type="dxa" w:w="1701"/>
           </w:tcPr>
           <w:p>
             <w:pPr>
-              <w:spacing w:after="0"/>
+              <w:spacing w:after="0" w:line="240" w:lineRule="auto"/>
             </w:pPr>
             <w:r>
               <w:rPr>
                 <w:b w:val="0"/>
               </w:rPr>
-              <w:t>% puntuales = vuelos con menos de 15 min de retraso / vuelos completados</w:t>
+              <w:t>Más de 5,8 millones</w:t>
             </w:r>
           </w:p>
         </w:tc>
@@ -509,49 +446,49 @@
         </w:trPr>
         <w:tc>
           <w:tcPr>
-            <w:tcW w:type="dxa" w:w="794"/>
+            <w:tcW w:type="dxa" w:w="1814"/>
           </w:tcPr>
           <w:p>
             <w:pPr>
-              <w:spacing w:after="0"/>
+              <w:spacing w:after="0" w:line="240" w:lineRule="auto"/>
             </w:pPr>
             <w:r>
               <w:rPr>
                 <w:b w:val="0"/>
               </w:rPr>
-              <w:t>OE2</w:t>
+              <w:t>airlines.csv</w:t>
             </w:r>
           </w:p>
         </w:tc>
         <w:tc>
           <w:tcPr>
-            <w:tcW w:type="dxa" w:w="4649"/>
+            <w:tcW w:type="dxa" w:w="5556"/>
           </w:tcPr>
           <w:p>
             <w:pPr>
-              <w:spacing w:after="0"/>
+              <w:spacing w:after="0" w:line="240" w:lineRule="auto"/>
             </w:pPr>
             <w:r>
               <w:rPr>
                 <w:b w:val="0"/>
               </w:rPr>
-              <w:t>Cuantificar las cancelaciones y los desvíos por aerolínea y motivo.</w:t>
+              <w:t>Código y nombre de cada aerolínea.</w:t>
             </w:r>
           </w:p>
         </w:tc>
         <w:tc>
           <w:tcPr>
-            <w:tcW w:type="dxa" w:w="3628"/>
+            <w:tcW w:type="dxa" w:w="1701"/>
           </w:tcPr>
           <w:p>
             <w:pPr>
-              <w:spacing w:after="0"/>
+              <w:spacing w:after="0" w:line="240" w:lineRule="auto"/>
             </w:pPr>
             <w:r>
               <w:rPr>
                 <w:b w:val="0"/>
               </w:rPr>
-              <w:t>% cancelados y % desviados sobre los vuelos programados</w:t>
+              <w:t>14</w:t>
             </w:r>
           </w:p>
         </w:tc>
@@ -562,208 +499,49 @@
         </w:trPr>
         <w:tc>
           <w:tcPr>
-            <w:tcW w:type="dxa" w:w="794"/>
+            <w:tcW w:type="dxa" w:w="1814"/>
           </w:tcPr>
           <w:p>
             <w:pPr>
-              <w:spacing w:after="0"/>
+              <w:spacing w:after="0" w:line="240" w:lineRule="auto"/>
             </w:pPr>
             <w:r>
               <w:rPr>
                 <w:b w:val="0"/>
               </w:rPr>
-              <w:t>OE3</w:t>
+              <w:t>airports.csv</w:t>
             </w:r>
           </w:p>
         </w:tc>
         <w:tc>
           <w:tcPr>
-            <w:tcW w:type="dxa" w:w="4649"/>
+            <w:tcW w:type="dxa" w:w="5556"/>
           </w:tcPr>
           <w:p>
             <w:pPr>
-              <w:spacing w:after="0"/>
+              <w:spacing w:after="0" w:line="240" w:lineRule="auto"/>
             </w:pPr>
             <w:r>
               <w:rPr>
                 <w:b w:val="0"/>
               </w:rPr>
-              <w:t>Identificar qué causas generan más minutos de retraso.</w:t>
+              <w:t>Código, nombre, ciudad, estado, país y coordenadas de cada aeropuerto.</w:t>
             </w:r>
           </w:p>
         </w:tc>
         <w:tc>
           <w:tcPr>
-            <w:tcW w:type="dxa" w:w="3628"/>
+            <w:tcW w:type="dxa" w:w="1701"/>
           </w:tcPr>
           <w:p>
             <w:pPr>
-              <w:spacing w:after="0"/>
+              <w:spacing w:after="0" w:line="240" w:lineRule="auto"/>
             </w:pPr>
             <w:r>
               <w:rPr>
                 <w:b w:val="0"/>
               </w:rPr>
-              <w:t>% de los minutos de retraso de cada causa</w:t>
-            </w:r>
-          </w:p>
-        </w:tc>
-      </w:tr>
-      <w:tr>
-        <w:trPr>
-          <w:cantSplit w:val="true"/>
-        </w:trPr>
-        <w:tc>
-          <w:tcPr>
-            <w:tcW w:type="dxa" w:w="794"/>
-          </w:tcPr>
-          <w:p>
-            <w:pPr>
-              <w:spacing w:after="0"/>
-            </w:pPr>
-            <w:r>
-              <w:rPr>
-                <w:b w:val="0"/>
-              </w:rPr>
-              <w:t>OE4</w:t>
-            </w:r>
-          </w:p>
-        </w:tc>
-        <w:tc>
-          <w:tcPr>
-            <w:tcW w:type="dxa" w:w="4649"/>
-          </w:tcPr>
-          <w:p>
-            <w:pPr>
-              <w:spacing w:after="0"/>
-            </w:pPr>
-            <w:r>
-              <w:rPr>
-                <w:b w:val="0"/>
-              </w:rPr>
-              <w:t>Determinar los aeropuertos y rutas con mayor retraso.</w:t>
-            </w:r>
-          </w:p>
-        </w:tc>
-        <w:tc>
-          <w:tcPr>
-            <w:tcW w:type="dxa" w:w="3628"/>
-          </w:tcPr>
-          <w:p>
-            <w:pPr>
-              <w:spacing w:after="0"/>
-            </w:pPr>
-            <w:r>
-              <w:rPr>
-                <w:b w:val="0"/>
-              </w:rPr>
-              <w:t>Promedio de minutos de retraso de llegada por ruta</w:t>
-            </w:r>
-          </w:p>
-        </w:tc>
-      </w:tr>
-      <w:tr>
-        <w:trPr>
-          <w:cantSplit w:val="true"/>
-        </w:trPr>
-        <w:tc>
-          <w:tcPr>
-            <w:tcW w:type="dxa" w:w="794"/>
-          </w:tcPr>
-          <w:p>
-            <w:pPr>
-              <w:spacing w:after="0"/>
-            </w:pPr>
-            <w:r>
-              <w:rPr>
-                <w:b w:val="0"/>
-              </w:rPr>
-              <w:t>OE5</w:t>
-            </w:r>
-          </w:p>
-        </w:tc>
-        <w:tc>
-          <w:tcPr>
-            <w:tcW w:type="dxa" w:w="4649"/>
-          </w:tcPr>
-          <w:p>
-            <w:pPr>
-              <w:spacing w:after="0"/>
-            </w:pPr>
-            <w:r>
-              <w:rPr>
-                <w:b w:val="0"/>
-              </w:rPr>
-              <w:t>Analizar los retrasos según la franja horaria y el día de la semana.</w:t>
-            </w:r>
-          </w:p>
-        </w:tc>
-        <w:tc>
-          <w:tcPr>
-            <w:tcW w:type="dxa" w:w="3628"/>
-          </w:tcPr>
-          <w:p>
-            <w:pPr>
-              <w:spacing w:after="0"/>
-            </w:pPr>
-            <w:r>
-              <w:rPr>
-                <w:b w:val="0"/>
-              </w:rPr>
-              <w:t>Promedio de minutos de retraso de salida por franja y día</w:t>
-            </w:r>
-          </w:p>
-        </w:tc>
-      </w:tr>
-      <w:tr>
-        <w:trPr>
-          <w:cantSplit w:val="true"/>
-        </w:trPr>
-        <w:tc>
-          <w:tcPr>
-            <w:tcW w:type="dxa" w:w="794"/>
-          </w:tcPr>
-          <w:p>
-            <w:pPr>
-              <w:spacing w:after="0"/>
-            </w:pPr>
-            <w:r>
-              <w:rPr>
-                <w:b w:val="0"/>
-              </w:rPr>
-              <w:t>OE6</w:t>
-            </w:r>
-          </w:p>
-        </w:tc>
-        <w:tc>
-          <w:tcPr>
-            <w:tcW w:type="dxa" w:w="4649"/>
-          </w:tcPr>
-          <w:p>
-            <w:pPr>
-              <w:spacing w:after="0"/>
-            </w:pPr>
-            <w:r>
-              <w:rPr>
-                <w:b w:val="0"/>
-              </w:rPr>
-              <w:t>Evaluar la eficiencia en tierra de cada aeropuerto.</w:t>
-            </w:r>
-          </w:p>
-        </w:tc>
-        <w:tc>
-          <w:tcPr>
-            <w:tcW w:type="dxa" w:w="3628"/>
-          </w:tcPr>
-          <w:p>
-            <w:pPr>
-              <w:spacing w:after="0"/>
-            </w:pPr>
-            <w:r>
-              <w:rPr>
-                <w:b w:val="0"/>
-              </w:rPr>
-              <w:t>Promedio de minutos de rodaje antes del despegue</w:t>
+              <w:t>322</w:t>
             </w:r>
           </w:p>
         </w:tc>
@@ -779,10 +557,7 @@
         <w:jc w:val="both"/>
       </w:pPr>
       <w:r>
-        <w:rPr>
-          <w:b w:val="0"/>
-        </w:rPr>
-        <w:t>Estos objetivos son la base del diseño: definen el hecho (vuelo) y su granularidad (un vuelo), las dimensiones (fecha, hora, aerolínea, aeropuerto y motivo de cancelación) y las métricas (minutos de retraso, tiempos, distancia e indicadores). En la segunda presentación cada objetivo tendrá su reporte (puntualidad por aerolínea, cancelaciones por motivo, causas de retraso, rutas y aeropuertos con más retraso, y retrasos por horario) y los indicadores se reunirán en un cuadro de mando de puntualidad con filtros por aerolínea, aeropuerto y mes.</w:t>
+        <w:t>La información es suficiente para construir un Data Warehouse. Cada vuelo es un hecho que se puede medir (minutos de retraso, tiempos y distancia) y tiene datos descriptivos que sirven como dimensiones, como la fecha, la aerolínea y los aeropuertos. Estas dimensiones tienen jerarquías naturales: las fechas se agrupan en meses, trimestres y años, y los aeropuertos en ciudades, estados y regiones.</w:t>
       </w:r>
     </w:p>
     <w:p>
@@ -794,7 +569,7 @@
         <w:rPr>
           <w:b/>
         </w:rPr>
-        <w:t>3. Modelado Conceptual del DataMart</w:t>
+        <w:t>1.3 Contexto de los datos y necesidad de análisis</w:t>
       </w:r>
     </w:p>
     <w:p>
@@ -802,67 +577,7 @@
         <w:jc w:val="both"/>
       </w:pPr>
       <w:r>
-        <w:rPr>
-          <w:b/>
-        </w:rPr>
-        <w:t>Tres DataMarts posibles:</w:t>
-      </w:r>
-    </w:p>
-    <w:p>
-      <w:pPr>
-        <w:pStyle w:val="ListBullet"/>
-        <w:spacing w:after="20"/>
-        <w:jc w:val="both"/>
-      </w:pPr>
-      <w:r>
-        <w:rPr>
-          <w:b/>
-        </w:rPr>
-        <w:t>DM1 Puntualidad de Vuelos:</w:t>
-      </w:r>
-      <w:r>
-        <w:rPr>
-          <w:b w:val="0"/>
-        </w:rPr>
-        <w:t xml:space="preserve"> cada vuelo con sus retrasos, cancelación y desvío.</w:t>
-      </w:r>
-    </w:p>
-    <w:p>
-      <w:pPr>
-        <w:pStyle w:val="ListBullet"/>
-        <w:spacing w:after="20"/>
-        <w:jc w:val="both"/>
-      </w:pPr>
-      <w:r>
-        <w:rPr>
-          <w:b/>
-        </w:rPr>
-        <w:t>DM2 Causas de Retraso:</w:t>
-      </w:r>
-      <w:r>
-        <w:rPr>
-          <w:b w:val="0"/>
-        </w:rPr>
-        <w:t xml:space="preserve"> minutos de retraso de cada vuelo repartidos por causa.</w:t>
-      </w:r>
-    </w:p>
-    <w:p>
-      <w:pPr>
-        <w:pStyle w:val="ListBullet"/>
-        <w:spacing w:after="20"/>
-        <w:jc w:val="both"/>
-      </w:pPr>
-      <w:r>
-        <w:rPr>
-          <w:b/>
-        </w:rPr>
-        <w:t>DM3 Operaciones Aeroportuarias:</w:t>
-      </w:r>
-      <w:r>
-        <w:rPr>
-          <w:b w:val="0"/>
-        </w:rPr>
-        <w:t xml:space="preserve"> resumen diario de salidas, llegadas y cancelaciones de cada aeropuerto.</w:t>
+        <w:t>En Estados Unidos, la BTS considera que un vuelo está retrasado cuando llega 15 minutos o más después de la hora programada. En ese caso la aerolínea informa la causa del retraso, que puede ser la propia aerolínea, el clima, el sistema nacional de aviación, la seguridad o la llegada tardía del avión desde un vuelo anterior. Los vuelos cancelados también tienen registrado el motivo de la cancelación.</w:t>
       </w:r>
     </w:p>
     <w:p>
@@ -870,16 +585,19 @@
         <w:jc w:val="both"/>
       </w:pPr>
       <w:r>
+        <w:t>Actualmente estos datos están en un archivo plano, que sirve para registrar los vuelos pero no para analizarlos. Por ejemplo, para saber qué aerolínea tuvo más retrasos en diciembre o cuál fue la causa más frecuente, habría que procesar millones de filas en cada consulta. La necesidad de análisis es conocer dónde, cuándo y por qué se producen los retrasos y las cancelaciones, para que las aerolíneas y los aeropuertos puedan mejorar su puntualidad y los pasajeros puedan elegir mejor sus vuelos.</w:t>
+      </w:r>
+    </w:p>
+    <w:p>
+      <w:pPr>
+        <w:keepNext/>
+        <w:spacing w:before="120"/>
+      </w:pPr>
+      <w:r>
         <w:rPr>
           <w:b/>
         </w:rPr>
-        <w:t>DataMart seleccionado: DM1</w:t>
-      </w:r>
-      <w:r>
-        <w:rPr>
-          <w:b w:val="0"/>
-        </w:rPr>
-        <w:t>, porque tiene el detalle de cada vuelo (los otros dos se pueden obtener de él), responde los seis objetivos y sus dimensiones se reutilizan en DM2 y DM3.</w:t>
+        <w:t>1.4 Justificación del tema</w:t>
       </w:r>
     </w:p>
     <w:p>
@@ -887,28 +605,31 @@
         <w:jc w:val="both"/>
       </w:pPr>
       <w:r>
-        <w:rPr>
-          <w:b/>
-        </w:rPr>
-        <w:t>Modelo conceptual:</w:t>
+        <w:t>El tema no pertenece a los casos excluidos en la consigna, como ventas, inventarios, hoteles o restaurantes. Se trata del análisis del desempeño de un sistema de transporte, con un volumen grande de datos, varias causas de retraso y datos que necesitan limpieza antes de cargarse: horas guardadas como números (por ejemplo, 1530 para las 15:30), valores vacíos en los vuelos cancelados y códigos de aeropuerto numéricos en el mes de octubre. Por estas razones se justifica el diseño de un Data Warehouse y de un proceso ETL.</w:t>
       </w:r>
-      <w:r>
-        <w:rPr>
-          <w:b w:val="0"/>
-        </w:rPr>
-        <w:t xml:space="preserve"> proceso de negocio «operación de un vuelo programado»; hecho </w:t>
-      </w:r>
+    </w:p>
+    <w:p>
+      <w:pPr>
+        <w:keepNext/>
+        <w:spacing w:before="240" w:after="120"/>
+      </w:pPr>
       <w:r>
         <w:rPr>
           <w:b/>
         </w:rPr>
-        <w:t>Vuelo</w:t>
+        <w:t>2. OBJETIVOS DEL DATA WAREHOUSE</w:t>
       </w:r>
+    </w:p>
+    <w:p>
+      <w:pPr>
+        <w:keepNext/>
+        <w:spacing w:before="120"/>
+      </w:pPr>
       <w:r>
         <w:rPr>
-          <w:b w:val="0"/>
+          <w:b/>
         </w:rPr>
-        <w:t>; dimensiones con sus jerarquías: Fecha (año → trimestre → mes → fecha, y día de la semana), Hora de salida (franja horaria → hora), Aerolínea, Aeropuerto (región → estado → ciudad → aeropuerto), que se usa dos veces, como origen y como destino, y Motivo de cancelación (Figura 1).</w:t>
+        <w:t>2.1 Objetivo general</w:t>
       </w:r>
     </w:p>
     <w:p>
@@ -916,28 +637,804 @@
         <w:jc w:val="both"/>
       </w:pPr>
       <w:r>
-        <w:rPr>
-          <w:b/>
-        </w:rPr>
-        <w:t>Granularidad:</w:t>
+        <w:t>Diseñar e implementar un Data Warehouse que integre los datos de los vuelos nacionales de Estados Unidos del año 2015, para analizar la puntualidad, los retrasos y las cancelaciones por aerolínea, aeropuerto, ruta y período mediante indicadores, reportes y cuadros de mando.</w:t>
       </w:r>
-      <w:r>
-        <w:rPr>
-          <w:b w:val="0"/>
-        </w:rPr>
-        <w:t xml:space="preserve"> cada registro de la tabla de hechos es </w:t>
-      </w:r>
+    </w:p>
+    <w:p>
+      <w:pPr>
+        <w:keepNext/>
+        <w:spacing w:before="120"/>
+      </w:pPr>
       <w:r>
         <w:rPr>
           <w:b/>
         </w:rPr>
-        <w:t>un vuelo programado de una aerolínea en una fecha</w:t>
+        <w:t>2.2 Objetivos específicos</w:t>
+      </w:r>
+    </w:p>
+    <w:p>
+      <w:pPr>
+        <w:jc w:val="both"/>
+      </w:pPr>
+      <w:r>
+        <w:t>Los objetivos específicos se presentan en la Tabla 2. Cada uno tiene un indicador que permite medirlo con los datos del DataMart.</w:t>
+      </w:r>
+    </w:p>
+    <w:p>
+      <w:pPr>
+        <w:keepNext/>
+        <w:spacing w:after="60"/>
+      </w:pPr>
+      <w:r>
+        <w:rPr>
+          <w:b/>
+        </w:rPr>
+        <w:t xml:space="preserve">Tabla 2. </w:t>
       </w:r>
       <w:r>
+        <w:t>Objetivos específicos e indicadores</w:t>
+      </w:r>
+    </w:p>
+    <w:tbl>
+      <w:tblPr>
+        <w:tblStyle w:val="TableGrid"/>
+        <w:tblW w:type="auto" w:w="0"/>
+        <w:tblLayout w:type="fixed"/>
+        <w:tblLook w:firstColumn="1" w:firstRow="1" w:lastColumn="0" w:lastRow="0" w:noHBand="0" w:noVBand="1" w:val="04A0"/>
+      </w:tblPr>
+      <w:tblGrid>
+        <w:gridCol w:w="794"/>
+        <w:gridCol w:w="4309"/>
+        <w:gridCol w:w="3969"/>
+      </w:tblGrid>
+      <w:tr>
+        <w:trPr>
+          <w:cantSplit w:val="true"/>
+          <w:tblHeader w:val="true"/>
+        </w:trPr>
+        <w:tc>
+          <w:tcPr>
+            <w:tcW w:type="dxa" w:w="794"/>
+            <w:shd w:val="clear" w:color="auto" w:fill="D9D9D9"/>
+          </w:tcPr>
+          <w:p>
+            <w:pPr>
+              <w:spacing w:after="0" w:line="240" w:lineRule="auto"/>
+            </w:pPr>
+            <w:r>
+              <w:rPr>
+                <w:b/>
+              </w:rPr>
+              <w:t>N.º</w:t>
+            </w:r>
+          </w:p>
+        </w:tc>
+        <w:tc>
+          <w:tcPr>
+            <w:tcW w:type="dxa" w:w="4309"/>
+            <w:shd w:val="clear" w:color="auto" w:fill="D9D9D9"/>
+          </w:tcPr>
+          <w:p>
+            <w:pPr>
+              <w:spacing w:after="0" w:line="240" w:lineRule="auto"/>
+            </w:pPr>
+            <w:r>
+              <w:rPr>
+                <w:b/>
+              </w:rPr>
+              <w:t>Objetivo específico</w:t>
+            </w:r>
+          </w:p>
+        </w:tc>
+        <w:tc>
+          <w:tcPr>
+            <w:tcW w:type="dxa" w:w="3969"/>
+            <w:shd w:val="clear" w:color="auto" w:fill="D9D9D9"/>
+          </w:tcPr>
+          <w:p>
+            <w:pPr>
+              <w:spacing w:after="0" w:line="240" w:lineRule="auto"/>
+            </w:pPr>
+            <w:r>
+              <w:rPr>
+                <w:b/>
+              </w:rPr>
+              <w:t>Indicador</w:t>
+            </w:r>
+          </w:p>
+        </w:tc>
+      </w:tr>
+      <w:tr>
+        <w:trPr>
+          <w:cantSplit w:val="true"/>
+        </w:trPr>
+        <w:tc>
+          <w:tcPr>
+            <w:tcW w:type="dxa" w:w="794"/>
+          </w:tcPr>
+          <w:p>
+            <w:pPr>
+              <w:spacing w:after="0" w:line="240" w:lineRule="auto"/>
+            </w:pPr>
+            <w:r>
+              <w:rPr>
+                <w:b w:val="0"/>
+              </w:rPr>
+              <w:t>OE1</w:t>
+            </w:r>
+          </w:p>
+        </w:tc>
+        <w:tc>
+          <w:tcPr>
+            <w:tcW w:type="dxa" w:w="4309"/>
+          </w:tcPr>
+          <w:p>
+            <w:pPr>
+              <w:spacing w:after="0" w:line="240" w:lineRule="auto"/>
+            </w:pPr>
+            <w:r>
+              <w:rPr>
+                <w:b w:val="0"/>
+              </w:rPr>
+              <w:t>Medir la puntualidad de cada aerolínea por mes.</w:t>
+            </w:r>
+          </w:p>
+        </w:tc>
+        <w:tc>
+          <w:tcPr>
+            <w:tcW w:type="dxa" w:w="3969"/>
+          </w:tcPr>
+          <w:p>
+            <w:pPr>
+              <w:spacing w:after="0" w:line="240" w:lineRule="auto"/>
+            </w:pPr>
+            <w:r>
+              <w:rPr>
+                <w:b w:val="0"/>
+              </w:rPr>
+              <w:t>Porcentaje de vuelos que llegan con menos de 15 minutos de retraso.</w:t>
+            </w:r>
+          </w:p>
+        </w:tc>
+      </w:tr>
+      <w:tr>
+        <w:trPr>
+          <w:cantSplit w:val="true"/>
+        </w:trPr>
+        <w:tc>
+          <w:tcPr>
+            <w:tcW w:type="dxa" w:w="794"/>
+          </w:tcPr>
+          <w:p>
+            <w:pPr>
+              <w:spacing w:after="0" w:line="240" w:lineRule="auto"/>
+            </w:pPr>
+            <w:r>
+              <w:rPr>
+                <w:b w:val="0"/>
+              </w:rPr>
+              <w:t>OE2</w:t>
+            </w:r>
+          </w:p>
+        </w:tc>
+        <w:tc>
+          <w:tcPr>
+            <w:tcW w:type="dxa" w:w="4309"/>
+          </w:tcPr>
+          <w:p>
+            <w:pPr>
+              <w:spacing w:after="0" w:line="240" w:lineRule="auto"/>
+            </w:pPr>
+            <w:r>
+              <w:rPr>
+                <w:b w:val="0"/>
+              </w:rPr>
+              <w:t>Cuantificar las cancelaciones y los desvíos por aerolínea y por motivo.</w:t>
+            </w:r>
+          </w:p>
+        </w:tc>
+        <w:tc>
+          <w:tcPr>
+            <w:tcW w:type="dxa" w:w="3969"/>
+          </w:tcPr>
+          <w:p>
+            <w:pPr>
+              <w:spacing w:after="0" w:line="240" w:lineRule="auto"/>
+            </w:pPr>
+            <w:r>
+              <w:rPr>
+                <w:b w:val="0"/>
+              </w:rPr>
+              <w:t>Porcentaje de vuelos cancelados y desviados.</w:t>
+            </w:r>
+          </w:p>
+        </w:tc>
+      </w:tr>
+      <w:tr>
+        <w:trPr>
+          <w:cantSplit w:val="true"/>
+        </w:trPr>
+        <w:tc>
+          <w:tcPr>
+            <w:tcW w:type="dxa" w:w="794"/>
+          </w:tcPr>
+          <w:p>
+            <w:pPr>
+              <w:spacing w:after="0" w:line="240" w:lineRule="auto"/>
+            </w:pPr>
+            <w:r>
+              <w:rPr>
+                <w:b w:val="0"/>
+              </w:rPr>
+              <w:t>OE3</w:t>
+            </w:r>
+          </w:p>
+        </w:tc>
+        <w:tc>
+          <w:tcPr>
+            <w:tcW w:type="dxa" w:w="4309"/>
+          </w:tcPr>
+          <w:p>
+            <w:pPr>
+              <w:spacing w:after="0" w:line="240" w:lineRule="auto"/>
+            </w:pPr>
+            <w:r>
+              <w:rPr>
+                <w:b w:val="0"/>
+              </w:rPr>
+              <w:t>Identificar las causas que generan más minutos de retraso.</w:t>
+            </w:r>
+          </w:p>
+        </w:tc>
+        <w:tc>
+          <w:tcPr>
+            <w:tcW w:type="dxa" w:w="3969"/>
+          </w:tcPr>
+          <w:p>
+            <w:pPr>
+              <w:spacing w:after="0" w:line="240" w:lineRule="auto"/>
+            </w:pPr>
+            <w:r>
+              <w:rPr>
+                <w:b w:val="0"/>
+              </w:rPr>
+              <w:t>Porcentaje de minutos de retraso de cada causa.</w:t>
+            </w:r>
+          </w:p>
+        </w:tc>
+      </w:tr>
+      <w:tr>
+        <w:trPr>
+          <w:cantSplit w:val="true"/>
+        </w:trPr>
+        <w:tc>
+          <w:tcPr>
+            <w:tcW w:type="dxa" w:w="794"/>
+          </w:tcPr>
+          <w:p>
+            <w:pPr>
+              <w:spacing w:after="0" w:line="240" w:lineRule="auto"/>
+            </w:pPr>
+            <w:r>
+              <w:rPr>
+                <w:b w:val="0"/>
+              </w:rPr>
+              <w:t>OE4</w:t>
+            </w:r>
+          </w:p>
+        </w:tc>
+        <w:tc>
+          <w:tcPr>
+            <w:tcW w:type="dxa" w:w="4309"/>
+          </w:tcPr>
+          <w:p>
+            <w:pPr>
+              <w:spacing w:after="0" w:line="240" w:lineRule="auto"/>
+            </w:pPr>
+            <w:r>
+              <w:rPr>
+                <w:b w:val="0"/>
+              </w:rPr>
+              <w:t>Determinar las rutas y los aeropuertos con mayor retraso.</w:t>
+            </w:r>
+          </w:p>
+        </w:tc>
+        <w:tc>
+          <w:tcPr>
+            <w:tcW w:type="dxa" w:w="3969"/>
+          </w:tcPr>
+          <w:p>
+            <w:pPr>
+              <w:spacing w:after="0" w:line="240" w:lineRule="auto"/>
+            </w:pPr>
+            <w:r>
+              <w:rPr>
+                <w:b w:val="0"/>
+              </w:rPr>
+              <w:t>Promedio de minutos de retraso en la llegada.</w:t>
+            </w:r>
+          </w:p>
+        </w:tc>
+      </w:tr>
+      <w:tr>
+        <w:trPr>
+          <w:cantSplit w:val="true"/>
+        </w:trPr>
+        <w:tc>
+          <w:tcPr>
+            <w:tcW w:type="dxa" w:w="794"/>
+          </w:tcPr>
+          <w:p>
+            <w:pPr>
+              <w:spacing w:after="0" w:line="240" w:lineRule="auto"/>
+            </w:pPr>
+            <w:r>
+              <w:rPr>
+                <w:b w:val="0"/>
+              </w:rPr>
+              <w:t>OE5</w:t>
+            </w:r>
+          </w:p>
+        </w:tc>
+        <w:tc>
+          <w:tcPr>
+            <w:tcW w:type="dxa" w:w="4309"/>
+          </w:tcPr>
+          <w:p>
+            <w:pPr>
+              <w:spacing w:after="0" w:line="240" w:lineRule="auto"/>
+            </w:pPr>
+            <w:r>
+              <w:rPr>
+                <w:b w:val="0"/>
+              </w:rPr>
+              <w:t>Analizar los retrasos según la hora de salida y el día de la semana.</w:t>
+            </w:r>
+          </w:p>
+        </w:tc>
+        <w:tc>
+          <w:tcPr>
+            <w:tcW w:type="dxa" w:w="3969"/>
+          </w:tcPr>
+          <w:p>
+            <w:pPr>
+              <w:spacing w:after="0" w:line="240" w:lineRule="auto"/>
+            </w:pPr>
+            <w:r>
+              <w:rPr>
+                <w:b w:val="0"/>
+              </w:rPr>
+              <w:t>Promedio de minutos de retraso en la salida.</w:t>
+            </w:r>
+          </w:p>
+        </w:tc>
+      </w:tr>
+      <w:tr>
+        <w:trPr>
+          <w:cantSplit w:val="true"/>
+        </w:trPr>
+        <w:tc>
+          <w:tcPr>
+            <w:tcW w:type="dxa" w:w="794"/>
+          </w:tcPr>
+          <w:p>
+            <w:pPr>
+              <w:spacing w:after="0" w:line="240" w:lineRule="auto"/>
+            </w:pPr>
+            <w:r>
+              <w:rPr>
+                <w:b w:val="0"/>
+              </w:rPr>
+              <w:t>OE6</w:t>
+            </w:r>
+          </w:p>
+        </w:tc>
+        <w:tc>
+          <w:tcPr>
+            <w:tcW w:type="dxa" w:w="4309"/>
+          </w:tcPr>
+          <w:p>
+            <w:pPr>
+              <w:spacing w:after="0" w:line="240" w:lineRule="auto"/>
+            </w:pPr>
+            <w:r>
+              <w:rPr>
+                <w:b w:val="0"/>
+              </w:rPr>
+              <w:t>Evaluar el tiempo que los aviones pasan en tierra en cada aeropuerto.</w:t>
+            </w:r>
+          </w:p>
+        </w:tc>
+        <w:tc>
+          <w:tcPr>
+            <w:tcW w:type="dxa" w:w="3969"/>
+          </w:tcPr>
+          <w:p>
+            <w:pPr>
+              <w:spacing w:after="0" w:line="240" w:lineRule="auto"/>
+            </w:pPr>
+            <w:r>
+              <w:rPr>
+                <w:b w:val="0"/>
+              </w:rPr>
+              <w:t>Promedio de minutos de rodaje antes del despegue.</w:t>
+            </w:r>
+          </w:p>
+        </w:tc>
+      </w:tr>
+    </w:tbl>
+    <w:p>
+      <w:pPr>
+        <w:spacing w:after="0"/>
+      </w:pPr>
+    </w:p>
+    <w:p>
+      <w:pPr>
+        <w:keepNext/>
+        <w:spacing w:before="120"/>
+      </w:pPr>
+      <w:r>
         <w:rPr>
-          <w:b w:val="0"/>
+          <w:b/>
         </w:rPr>
-        <w:t xml:space="preserve"> (una fila de flights.csv), identificado por la fecha, la aerolínea, el número de vuelo, el aeropuerto de origen y la hora programada de salida; ≈ 5,8 millones de registros.</w:t>
+        <w:t>2.3 Relación de los objetivos con el diseño</w:t>
+      </w:r>
+    </w:p>
+    <w:p>
+      <w:pPr>
+        <w:jc w:val="both"/>
+      </w:pPr>
+      <w:r>
+        <w:t>A partir de estos objetivos se definió el diseño del DataMart. Todos se responden analizando vuelos, por lo que el hecho principal es el vuelo y la granularidad es un vuelo. Las dimensiones necesarias son la fecha, la hora de salida, la aerolínea, el aeropuerto y el motivo de cancelación. Las métricas son los minutos de retraso, los tiempos de vuelo, la distancia y los indicadores de vuelo cancelado, desviado, retrasado o puntual.</w:t>
+      </w:r>
+    </w:p>
+    <w:p>
+      <w:pPr>
+        <w:jc w:val="both"/>
+      </w:pPr>
+      <w:r>
+        <w:t>En la segunda presentación cada objetivo tendrá un reporte, y los indicadores principales se reunirán en un cuadro de mando de puntualidad con filtros por aerolínea, aeropuerto y mes.</w:t>
+      </w:r>
+    </w:p>
+    <w:p>
+      <w:pPr>
+        <w:keepNext/>
+        <w:spacing w:before="240" w:after="120"/>
+      </w:pPr>
+      <w:r>
+        <w:rPr>
+          <w:b/>
+        </w:rPr>
+        <w:t>3. MODELADO CONCEPTUAL DEL DATAMART</w:t>
+      </w:r>
+    </w:p>
+    <w:p>
+      <w:pPr>
+        <w:keepNext/>
+        <w:spacing w:before="120"/>
+      </w:pPr>
+      <w:r>
+        <w:rPr>
+          <w:b/>
+        </w:rPr>
+        <w:t>3.1 DataMarts propuestos</w:t>
+      </w:r>
+    </w:p>
+    <w:p>
+      <w:pPr>
+        <w:jc w:val="both"/>
+      </w:pPr>
+      <w:r>
+        <w:t>Con los datos disponibles se identificaron tres posibles DataMarts, que se muestran en la Tabla 3.</w:t>
+      </w:r>
+    </w:p>
+    <w:p>
+      <w:pPr>
+        <w:keepNext/>
+        <w:spacing w:after="60"/>
+      </w:pPr>
+      <w:r>
+        <w:rPr>
+          <w:b/>
+        </w:rPr>
+        <w:t xml:space="preserve">Tabla 3. </w:t>
+      </w:r>
+      <w:r>
+        <w:t>DataMarts propuestos</w:t>
+      </w:r>
+    </w:p>
+    <w:tbl>
+      <w:tblPr>
+        <w:tblStyle w:val="TableGrid"/>
+        <w:tblW w:type="auto" w:w="0"/>
+        <w:tblLayout w:type="fixed"/>
+        <w:tblLook w:firstColumn="1" w:firstRow="1" w:lastColumn="0" w:lastRow="0" w:noHBand="0" w:noVBand="1" w:val="04A0"/>
+      </w:tblPr>
+      <w:tblGrid>
+        <w:gridCol w:w="2494"/>
+        <w:gridCol w:w="3969"/>
+        <w:gridCol w:w="2608"/>
+      </w:tblGrid>
+      <w:tr>
+        <w:trPr>
+          <w:cantSplit w:val="true"/>
+          <w:tblHeader w:val="true"/>
+        </w:trPr>
+        <w:tc>
+          <w:tcPr>
+            <w:tcW w:type="dxa" w:w="2494"/>
+            <w:shd w:val="clear" w:color="auto" w:fill="D9D9D9"/>
+          </w:tcPr>
+          <w:p>
+            <w:pPr>
+              <w:spacing w:after="0" w:line="240" w:lineRule="auto"/>
+            </w:pPr>
+            <w:r>
+              <w:rPr>
+                <w:b/>
+              </w:rPr>
+              <w:t>DataMart</w:t>
+            </w:r>
+          </w:p>
+        </w:tc>
+        <w:tc>
+          <w:tcPr>
+            <w:tcW w:type="dxa" w:w="3969"/>
+            <w:shd w:val="clear" w:color="auto" w:fill="D9D9D9"/>
+          </w:tcPr>
+          <w:p>
+            <w:pPr>
+              <w:spacing w:after="0" w:line="240" w:lineRule="auto"/>
+            </w:pPr>
+            <w:r>
+              <w:rPr>
+                <w:b/>
+              </w:rPr>
+              <w:t>Qué analiza</w:t>
+            </w:r>
+          </w:p>
+        </w:tc>
+        <w:tc>
+          <w:tcPr>
+            <w:tcW w:type="dxa" w:w="2608"/>
+            <w:shd w:val="clear" w:color="auto" w:fill="D9D9D9"/>
+          </w:tcPr>
+          <w:p>
+            <w:pPr>
+              <w:spacing w:after="0" w:line="240" w:lineRule="auto"/>
+            </w:pPr>
+            <w:r>
+              <w:rPr>
+                <w:b/>
+              </w:rPr>
+              <w:t>Cada registro representa</w:t>
+            </w:r>
+          </w:p>
+        </w:tc>
+      </w:tr>
+      <w:tr>
+        <w:trPr>
+          <w:cantSplit w:val="true"/>
+        </w:trPr>
+        <w:tc>
+          <w:tcPr>
+            <w:tcW w:type="dxa" w:w="2494"/>
+          </w:tcPr>
+          <w:p>
+            <w:pPr>
+              <w:spacing w:after="0" w:line="240" w:lineRule="auto"/>
+            </w:pPr>
+            <w:r>
+              <w:rPr>
+                <w:b w:val="0"/>
+              </w:rPr>
+              <w:t>Puntualidad de Vuelos</w:t>
+            </w:r>
+          </w:p>
+        </w:tc>
+        <w:tc>
+          <w:tcPr>
+            <w:tcW w:type="dxa" w:w="3969"/>
+          </w:tcPr>
+          <w:p>
+            <w:pPr>
+              <w:spacing w:after="0" w:line="240" w:lineRule="auto"/>
+            </w:pPr>
+            <w:r>
+              <w:rPr>
+                <w:b w:val="0"/>
+              </w:rPr>
+              <w:t>La operación de cada vuelo: retrasos, cancelaciones y desvíos.</w:t>
+            </w:r>
+          </w:p>
+        </w:tc>
+        <w:tc>
+          <w:tcPr>
+            <w:tcW w:type="dxa" w:w="2608"/>
+          </w:tcPr>
+          <w:p>
+            <w:pPr>
+              <w:spacing w:after="0" w:line="240" w:lineRule="auto"/>
+            </w:pPr>
+            <w:r>
+              <w:rPr>
+                <w:b w:val="0"/>
+              </w:rPr>
+              <w:t>Un vuelo.</w:t>
+            </w:r>
+          </w:p>
+        </w:tc>
+      </w:tr>
+      <w:tr>
+        <w:trPr>
+          <w:cantSplit w:val="true"/>
+        </w:trPr>
+        <w:tc>
+          <w:tcPr>
+            <w:tcW w:type="dxa" w:w="2494"/>
+          </w:tcPr>
+          <w:p>
+            <w:pPr>
+              <w:spacing w:after="0" w:line="240" w:lineRule="auto"/>
+            </w:pPr>
+            <w:r>
+              <w:rPr>
+                <w:b w:val="0"/>
+              </w:rPr>
+              <w:t>Causas de Retraso</w:t>
+            </w:r>
+          </w:p>
+        </w:tc>
+        <w:tc>
+          <w:tcPr>
+            <w:tcW w:type="dxa" w:w="3969"/>
+          </w:tcPr>
+          <w:p>
+            <w:pPr>
+              <w:spacing w:after="0" w:line="240" w:lineRule="auto"/>
+            </w:pPr>
+            <w:r>
+              <w:rPr>
+                <w:b w:val="0"/>
+              </w:rPr>
+              <w:t>Cómo se reparten los minutos de retraso entre sus causas.</w:t>
+            </w:r>
+          </w:p>
+        </w:tc>
+        <w:tc>
+          <w:tcPr>
+            <w:tcW w:type="dxa" w:w="2608"/>
+          </w:tcPr>
+          <w:p>
+            <w:pPr>
+              <w:spacing w:after="0" w:line="240" w:lineRule="auto"/>
+            </w:pPr>
+            <w:r>
+              <w:rPr>
+                <w:b w:val="0"/>
+              </w:rPr>
+              <w:t>Un vuelo retrasado y una de sus causas.</w:t>
+            </w:r>
+          </w:p>
+        </w:tc>
+      </w:tr>
+      <w:tr>
+        <w:trPr>
+          <w:cantSplit w:val="true"/>
+        </w:trPr>
+        <w:tc>
+          <w:tcPr>
+            <w:tcW w:type="dxa" w:w="2494"/>
+          </w:tcPr>
+          <w:p>
+            <w:pPr>
+              <w:spacing w:after="0" w:line="240" w:lineRule="auto"/>
+            </w:pPr>
+            <w:r>
+              <w:rPr>
+                <w:b w:val="0"/>
+              </w:rPr>
+              <w:t>Operaciones Aeroportuarias</w:t>
+            </w:r>
+          </w:p>
+        </w:tc>
+        <w:tc>
+          <w:tcPr>
+            <w:tcW w:type="dxa" w:w="3969"/>
+          </w:tcPr>
+          <w:p>
+            <w:pPr>
+              <w:spacing w:after="0" w:line="240" w:lineRule="auto"/>
+            </w:pPr>
+            <w:r>
+              <w:rPr>
+                <w:b w:val="0"/>
+              </w:rPr>
+              <w:t>El movimiento diario de cada aeropuerto: salidas, llegadas y cancelaciones.</w:t>
+            </w:r>
+          </w:p>
+        </w:tc>
+        <w:tc>
+          <w:tcPr>
+            <w:tcW w:type="dxa" w:w="2608"/>
+          </w:tcPr>
+          <w:p>
+            <w:pPr>
+              <w:spacing w:after="0" w:line="240" w:lineRule="auto"/>
+            </w:pPr>
+            <w:r>
+              <w:rPr>
+                <w:b w:val="0"/>
+              </w:rPr>
+              <w:t>Un aeropuerto en un día.</w:t>
+            </w:r>
+          </w:p>
+        </w:tc>
+      </w:tr>
+    </w:tbl>
+    <w:p>
+      <w:pPr>
+        <w:spacing w:after="0"/>
+      </w:pPr>
+    </w:p>
+    <w:p>
+      <w:pPr>
+        <w:keepNext/>
+        <w:spacing w:before="120"/>
+      </w:pPr>
+      <w:r>
+        <w:rPr>
+          <w:b/>
+        </w:rPr>
+        <w:t>3.2 DataMart seleccionado</w:t>
+      </w:r>
+    </w:p>
+    <w:p>
+      <w:pPr>
+        <w:jc w:val="both"/>
+      </w:pPr>
+      <w:r>
+        <w:t>Se eligió el DataMart de Puntualidad de Vuelos porque es el que aporta más valor: guarda el detalle de cada vuelo, permite responder los seis objetivos y los otros dos DataMarts se pueden obtener a partir de él, resumiendo sus datos por causa o por aeropuerto y día.</w:t>
+      </w:r>
+    </w:p>
+    <w:p>
+      <w:pPr>
+        <w:keepNext/>
+        <w:spacing w:before="120"/>
+      </w:pPr>
+      <w:r>
+        <w:rPr>
+          <w:b/>
+        </w:rPr>
+        <w:t>3.3 Modelo conceptual</w:t>
+      </w:r>
+    </w:p>
+    <w:p>
+      <w:pPr>
+        <w:jc w:val="both"/>
+      </w:pPr>
+      <w:r>
+        <w:t>El proceso de negocio es la operación de un vuelo programado. El hecho es el vuelo y se describe con seis dimensiones: la fecha, la hora de salida, la aerolínea, el aeropuerto de origen, el aeropuerto de destino y el motivo de cancelación. Los aeropuertos de origen y de destino son la misma dimensión usada en dos roles. La Figura 1 muestra el modelo con las jerarquías de cada dimensión.</w:t>
+      </w:r>
+    </w:p>
+    <w:p>
+      <w:pPr>
+        <w:keepNext/>
+        <w:spacing w:before="120"/>
+      </w:pPr>
+      <w:r>
+        <w:rPr>
+          <w:b/>
+        </w:rPr>
+        <w:t>3.4 Granularidad</w:t>
+      </w:r>
+    </w:p>
+    <w:p>
+      <w:pPr>
+        <w:jc w:val="both"/>
+      </w:pPr>
+      <w:r>
+        <w:t>Cada registro de la tabla de hechos representa un vuelo programado de una aerolínea en una fecha, es decir, una fila del archivo flights.csv. Un vuelo se identifica por su fecha, la aerolínea, el número de vuelo, el aeropuerto de origen y la hora programada de salida. Con esta granularidad, la tabla de hechos tendrá más de 5,8 millones de registros.</w:t>
       </w:r>
     </w:p>
     <w:p>
@@ -948,7 +1445,7 @@
       <w:r>
         <w:drawing>
           <wp:inline xmlns:a="http://schemas.openxmlformats.org/drawingml/2006/main" xmlns:pic="http://schemas.openxmlformats.org/drawingml/2006/picture">
-            <wp:extent cx="5580000" cy="3627000"/>
+            <wp:extent cx="5220000" cy="3393000"/>
             <wp:docPr id="2" name="Picture 2"/>
             <wp:cNvGraphicFramePr>
               <a:graphicFrameLocks noChangeAspect="1"/>
@@ -969,7 +1466,7 @@
                   <pic:spPr>
                     <a:xfrm>
                       <a:off x="0" y="0"/>
-                      <a:ext cx="5580000" cy="3627000"/>
+                      <a:ext cx="5220000" cy="3393000"/>
                     </a:xfrm>
                     <a:prstGeom prst="rect"/>
                   </pic:spPr>
@@ -988,13 +1485,22 @@
         <w:rPr>
           <w:b/>
         </w:rPr>
-        <w:t>Figura 1.</w:t>
+        <w:t xml:space="preserve">Figura 1. </w:t>
       </w:r>
       <w:r>
+        <w:t>Modelo conceptual del DataMart Puntualidad de Vuelos.</w:t>
+      </w:r>
+    </w:p>
+    <w:p>
+      <w:pPr>
+        <w:keepNext/>
+        <w:spacing w:before="240" w:after="120"/>
+      </w:pPr>
+      <w:r>
         <w:rPr>
-          <w:b w:val="0"/>
+          <w:b/>
         </w:rPr>
-        <w:t xml:space="preserve"> Modelo conceptual del DataMart Puntualidad de Vuelos: hecho, dimensiones y jerarquías.</w:t>
+        <w:t>4. MODELADO LÓGICO DEL DATAMART</w:t>
       </w:r>
     </w:p>
     <w:p>
@@ -1006,7 +1512,7 @@
         <w:rPr>
           <w:b/>
         </w:rPr>
-        <w:t>4. Modelado Lógico del DataMart</w:t>
+        <w:t>4.1 Tablas de hechos y dimensiones</w:t>
       </w:r>
     </w:p>
     <w:p>
@@ -1014,10 +1520,22 @@
         <w:jc w:val="both"/>
       </w:pPr>
       <w:r>
+        <w:t>El modelo lógico es un esquema en estrella formado por una tabla de hechos y cinco tablas de dimensiones. La Tabla 4 detalla los atributos de cada tabla y la Figura 2, al final de este punto, muestra el diagrama del modelo.</w:t>
+      </w:r>
+    </w:p>
+    <w:p>
+      <w:pPr>
+        <w:keepNext/>
+        <w:spacing w:after="60"/>
+      </w:pPr>
+      <w:r>
         <w:rPr>
-          <w:b w:val="0"/>
+          <w:b/>
         </w:rPr>
-        <w:t>Esquema en estrella (Figura 2). Cada dimensión se relaciona 1:N con la tabla de hechos mediante su clave sustituta (PK) y la clave foránea (FK) correspondiente:</w:t>
+        <w:t xml:space="preserve">Tabla 4. </w:t>
+      </w:r>
+      <w:r>
+        <w:t>Tablas del modelo lógico</w:t>
       </w:r>
     </w:p>
     <w:tbl>
@@ -1028,20 +1546,22 @@
         <w:tblLook w:firstColumn="1" w:firstRow="1" w:lastColumn="0" w:lastRow="0" w:noHBand="0" w:noVBand="1" w:val="04A0"/>
       </w:tblPr>
       <w:tblGrid>
-        <w:gridCol w:w="3005"/>
-        <w:gridCol w:w="6066"/>
+        <w:gridCol w:w="2438"/>
+        <w:gridCol w:w="6633"/>
       </w:tblGrid>
       <w:tr>
         <w:trPr>
           <w:cantSplit w:val="true"/>
+          <w:tblHeader w:val="true"/>
         </w:trPr>
         <w:tc>
           <w:tcPr>
-            <w:tcW w:type="dxa" w:w="3005"/>
+            <w:tcW w:type="dxa" w:w="2438"/>
+            <w:shd w:val="clear" w:color="auto" w:fill="D9D9D9"/>
           </w:tcPr>
           <w:p>
             <w:pPr>
-              <w:spacing w:after="0"/>
+              <w:spacing w:after="0" w:line="240" w:lineRule="auto"/>
             </w:pPr>
             <w:r>
               <w:rPr>
@@ -1053,11 +1573,12 @@
         </w:tc>
         <w:tc>
           <w:tcPr>
-            <w:tcW w:type="dxa" w:w="6066"/>
+            <w:tcW w:type="dxa" w:w="6633"/>
+            <w:shd w:val="clear" w:color="auto" w:fill="D9D9D9"/>
           </w:tcPr>
           <w:p>
             <w:pPr>
-              <w:spacing w:after="0"/>
+              <w:spacing w:after="0" w:line="240" w:lineRule="auto"/>
             </w:pPr>
             <w:r>
               <w:rPr>
@@ -1074,33 +1595,33 @@
         </w:trPr>
         <w:tc>
           <w:tcPr>
-            <w:tcW w:type="dxa" w:w="3005"/>
+            <w:tcW w:type="dxa" w:w="2438"/>
           </w:tcPr>
           <w:p>
             <w:pPr>
-              <w:spacing w:after="0"/>
+              <w:spacing w:after="0" w:line="240" w:lineRule="auto"/>
             </w:pPr>
             <w:r>
               <w:rPr>
                 <w:b w:val="0"/>
               </w:rPr>
-              <w:t>fact_vuelo</w:t>
+              <w:t>fact_vuelo (hechos)</w:t>
             </w:r>
           </w:p>
         </w:tc>
         <w:tc>
           <w:tcPr>
-            <w:tcW w:type="dxa" w:w="6066"/>
+            <w:tcW w:type="dxa" w:w="6633"/>
           </w:tcPr>
           <w:p>
             <w:pPr>
-              <w:spacing w:after="0"/>
+              <w:spacing w:after="0" w:line="240" w:lineRule="auto"/>
             </w:pPr>
             <w:r>
               <w:rPr>
                 <w:b w:val="0"/>
               </w:rPr>
-              <w:t>PK sk_vuelo; FK sk_fecha, sk_hora_salida, sk_aerolinea, sk_aeropuerto_origen, sk_aeropuerto_destino, sk_motivo_cancelacion; dimensiones degeneradas: numero_vuelo, matricula_avion, salida_programada; métricas en minutos: retraso_salida_min, retraso_llegada_min, taxi_salida_min, taxi_llegada_min, tiempo_programado_min, tiempo_real_min, tiempo_aire_min, retraso_aerolinea_min, retraso_clima_min, retraso_sistema_aereo_min, retraso_seguridad_min, retraso_avion_tardio_min; distancia_millas; indicadores 0/1: es_cancelado, es_desviado, es_retrasado, es_puntual; fecha_carga (auditoría)</w:t>
+              <w:t>sk_vuelo (PK); sk_fecha, sk_hora_salida, sk_aerolinea, sk_aeropuerto_origen, sk_aeropuerto_destino, sk_motivo_cancelacion (FK); numero_vuelo, matricula_avion, salida_programada; retraso_salida_min, retraso_llegada_min, taxi_salida_min, taxi_llegada_min, tiempo_programado_min, tiempo_real_min, tiempo_aire_min, distancia_millas; retraso_aerolinea_min, retraso_clima_min, retraso_sistema_aereo_min, retraso_seguridad_min, retraso_avion_tardio_min; es_cancelado, es_desviado, es_retrasado, es_puntual; fecha_carga</w:t>
             </w:r>
           </w:p>
         </w:tc>
@@ -1111,11 +1632,11 @@
         </w:trPr>
         <w:tc>
           <w:tcPr>
-            <w:tcW w:type="dxa" w:w="3005"/>
+            <w:tcW w:type="dxa" w:w="2438"/>
           </w:tcPr>
           <w:p>
             <w:pPr>
-              <w:spacing w:after="0"/>
+              <w:spacing w:after="0" w:line="240" w:lineRule="auto"/>
             </w:pPr>
             <w:r>
               <w:rPr>
@@ -1127,17 +1648,17 @@
         </w:tc>
         <w:tc>
           <w:tcPr>
-            <w:tcW w:type="dxa" w:w="6066"/>
+            <w:tcW w:type="dxa" w:w="6633"/>
           </w:tcPr>
           <w:p>
             <w:pPr>
-              <w:spacing w:after="0"/>
+              <w:spacing w:after="0" w:line="240" w:lineRule="auto"/>
             </w:pPr>
             <w:r>
               <w:rPr>
                 <w:b w:val="0"/>
               </w:rPr>
-              <w:t>PK sk_fecha (AAAAMMDD); fecha, dia, dia_semana, nombre_dia, es_fin_de_semana, mes, nombre_mes, trimestre, anio</w:t>
+              <w:t>sk_fecha (PK), fecha, dia, dia_semana, nombre_dia, es_fin_de_semana, mes, nombre_mes, trimestre, anio</w:t>
             </w:r>
           </w:p>
         </w:tc>
@@ -1148,11 +1669,11 @@
         </w:trPr>
         <w:tc>
           <w:tcPr>
-            <w:tcW w:type="dxa" w:w="3005"/>
+            <w:tcW w:type="dxa" w:w="2438"/>
           </w:tcPr>
           <w:p>
             <w:pPr>
-              <w:spacing w:after="0"/>
+              <w:spacing w:after="0" w:line="240" w:lineRule="auto"/>
             </w:pPr>
             <w:r>
               <w:rPr>
@@ -1164,17 +1685,17 @@
         </w:tc>
         <w:tc>
           <w:tcPr>
-            <w:tcW w:type="dxa" w:w="6066"/>
+            <w:tcW w:type="dxa" w:w="6633"/>
           </w:tcPr>
           <w:p>
             <w:pPr>
-              <w:spacing w:after="0"/>
+              <w:spacing w:after="0" w:line="240" w:lineRule="auto"/>
             </w:pPr>
             <w:r>
               <w:rPr>
                 <w:b w:val="0"/>
               </w:rPr>
-              <w:t>PK sk_hora (0 a 23); hora_texto, franja_horaria</w:t>
+              <w:t>sk_hora (PK), hora_texto, franja_horaria</w:t>
             </w:r>
           </w:p>
         </w:tc>
@@ -1185,11 +1706,11 @@
         </w:trPr>
         <w:tc>
           <w:tcPr>
-            <w:tcW w:type="dxa" w:w="3005"/>
+            <w:tcW w:type="dxa" w:w="2438"/>
           </w:tcPr>
           <w:p>
             <w:pPr>
-              <w:spacing w:after="0"/>
+              <w:spacing w:after="0" w:line="240" w:lineRule="auto"/>
             </w:pPr>
             <w:r>
               <w:rPr>
@@ -1201,17 +1722,17 @@
         </w:tc>
         <w:tc>
           <w:tcPr>
-            <w:tcW w:type="dxa" w:w="6066"/>
+            <w:tcW w:type="dxa" w:w="6633"/>
           </w:tcPr>
           <w:p>
             <w:pPr>
-              <w:spacing w:after="0"/>
+              <w:spacing w:after="0" w:line="240" w:lineRule="auto"/>
             </w:pPr>
             <w:r>
               <w:rPr>
                 <w:b w:val="0"/>
               </w:rPr>
-              <w:t>PK sk_aerolinea; codigo_iata, nombre_aerolinea</w:t>
+              <w:t>sk_aerolinea (PK), codigo_iata, nombre_aerolinea</w:t>
             </w:r>
           </w:p>
         </w:tc>
@@ -1222,11 +1743,11 @@
         </w:trPr>
         <w:tc>
           <w:tcPr>
-            <w:tcW w:type="dxa" w:w="3005"/>
+            <w:tcW w:type="dxa" w:w="2438"/>
           </w:tcPr>
           <w:p>
             <w:pPr>
-              <w:spacing w:after="0"/>
+              <w:spacing w:after="0" w:line="240" w:lineRule="auto"/>
             </w:pPr>
             <w:r>
               <w:rPr>
@@ -1238,17 +1759,17 @@
         </w:tc>
         <w:tc>
           <w:tcPr>
-            <w:tcW w:type="dxa" w:w="6066"/>
+            <w:tcW w:type="dxa" w:w="6633"/>
           </w:tcPr>
           <w:p>
             <w:pPr>
-              <w:spacing w:after="0"/>
+              <w:spacing w:after="0" w:line="240" w:lineRule="auto"/>
             </w:pPr>
             <w:r>
               <w:rPr>
                 <w:b w:val="0"/>
               </w:rPr>
-              <w:t>PK sk_aeropuerto; codigo_iata, nombre_aeropuerto, ciudad, estado, region, pais, latitud, longitud</w:t>
+              <w:t>sk_aeropuerto (PK), codigo_iata, nombre_aeropuerto, ciudad, estado, region, pais, latitud, longitud</w:t>
             </w:r>
           </w:p>
         </w:tc>
@@ -1259,33 +1780,33 @@
         </w:trPr>
         <w:tc>
           <w:tcPr>
-            <w:tcW w:type="dxa" w:w="3005"/>
+            <w:tcW w:type="dxa" w:w="2438"/>
           </w:tcPr>
           <w:p>
             <w:pPr>
-              <w:spacing w:after="0"/>
+              <w:spacing w:after="0" w:line="240" w:lineRule="auto"/>
             </w:pPr>
             <w:r>
               <w:rPr>
                 <w:b w:val="0"/>
               </w:rPr>
-              <w:t>dim_motivo_cancelacion</w:t>
+              <w:t>dim_motivo_​cancelacion</w:t>
             </w:r>
           </w:p>
         </w:tc>
         <w:tc>
           <w:tcPr>
-            <w:tcW w:type="dxa" w:w="6066"/>
+            <w:tcW w:type="dxa" w:w="6633"/>
           </w:tcPr>
           <w:p>
             <w:pPr>
-              <w:spacing w:after="0"/>
+              <w:spacing w:after="0" w:line="240" w:lineRule="auto"/>
             </w:pPr>
             <w:r>
               <w:rPr>
                 <w:b w:val="0"/>
               </w:rPr>
-              <w:t>PK sk_motivo_cancelacion; codigo_motivo (N, A, B, C, D), descripcion</w:t>
+              <w:t>sk_motivo_cancelacion (PK), codigo_motivo, descripcion</w:t>
             </w:r>
           </w:p>
         </w:tc>
@@ -1298,19 +1819,65 @@
     </w:p>
     <w:p>
       <w:pPr>
-        <w:jc w:val="both"/>
+        <w:keepNext/>
+        <w:spacing w:before="120"/>
       </w:pPr>
       <w:r>
         <w:rPr>
           <w:b/>
         </w:rPr>
-        <w:t>Estructura del dataset y su uso en el DataMart:</w:t>
+        <w:t>4.2 Claves y relaciones</w:t>
+      </w:r>
+    </w:p>
+    <w:p>
+      <w:pPr>
+        <w:jc w:val="both"/>
+      </w:pPr>
+      <w:r>
+        <w:t>Cada dimensión tiene una clave sustituta (sk), que es un número generado por la base de datos y funciona como clave primaria. La tabla de hechos guarda una clave foránea hacia cada dimensión, y todas las relaciones son de uno a muchos: por ejemplo, una aerolínea tiene muchos vuelos, pero cada vuelo pertenece a una sola aerolínea.</w:t>
+      </w:r>
+    </w:p>
+    <w:p>
+      <w:pPr>
+        <w:jc w:val="both"/>
+      </w:pPr>
+      <w:r>
+        <w:t>Los códigos que vienen en los archivos, como el código IATA de aerolíneas y aeropuertos, se guardan como claves naturales y sirven para encontrar la clave sustituta durante la carga. La dimensión aeropuerto se relaciona dos veces con la tabla de hechos, una como origen y otra como destino. El número de vuelo, la matrícula del avión y la hora programada se guardan en la tabla de hechos como dimensiones degeneradas, porque no necesitan una tabla propia.</w:t>
+      </w:r>
+    </w:p>
+    <w:p>
+      <w:pPr>
+        <w:keepNext/>
+        <w:spacing w:before="120"/>
+      </w:pPr>
+      <w:r>
+        <w:rPr>
+          <w:b/>
+        </w:rPr>
+        <w:t>4.3 Origen de los datos</w:t>
+      </w:r>
+    </w:p>
+    <w:p>
+      <w:pPr>
+        <w:jc w:val="both"/>
+      </w:pPr>
+      <w:r>
+        <w:t>La Tabla 5 muestra cómo se usa cada columna de los archivos CSV en el DataMart.</w:t>
+      </w:r>
+    </w:p>
+    <w:p>
+      <w:pPr>
+        <w:keepNext/>
+        <w:spacing w:after="60"/>
+      </w:pPr>
+      <w:r>
+        <w:rPr>
+          <w:b/>
+        </w:rPr>
+        <w:t xml:space="preserve">Tabla 5. </w:t>
       </w:r>
       <w:r>
-        <w:rPr>
-          <w:b w:val="0"/>
-        </w:rPr>
-        <w:t xml:space="preserve"> cada columna de los archivos CSV se carga en una dimensión, una métrica o un indicador de la tabla de hechos:</w:t>
+        <w:t>Columnas del conjunto de datos y su uso en el DataMart</w:t>
       </w:r>
     </w:p>
     <w:tbl>
@@ -1321,21 +1888,23 @@
         <w:tblLook w:firstColumn="1" w:firstRow="1" w:lastColumn="0" w:lastRow="0" w:noHBand="0" w:noVBand="1" w:val="04A0"/>
       </w:tblPr>
       <w:tblGrid>
-        <w:gridCol w:w="3515"/>
-        <w:gridCol w:w="2154"/>
-        <w:gridCol w:w="3402"/>
+        <w:gridCol w:w="3345"/>
+        <w:gridCol w:w="2438"/>
+        <w:gridCol w:w="3288"/>
       </w:tblGrid>
       <w:tr>
         <w:trPr>
           <w:cantSplit w:val="true"/>
+          <w:tblHeader w:val="true"/>
         </w:trPr>
         <w:tc>
           <w:tcPr>
-            <w:tcW w:type="dxa" w:w="3515"/>
+            <w:tcW w:type="dxa" w:w="3345"/>
+            <w:shd w:val="clear" w:color="auto" w:fill="D9D9D9"/>
           </w:tcPr>
           <w:p>
             <w:pPr>
-              <w:spacing w:after="0"/>
+              <w:spacing w:after="0" w:line="240" w:lineRule="auto"/>
             </w:pPr>
             <w:r>
               <w:rPr>
@@ -1347,11 +1916,12 @@
         </w:tc>
         <w:tc>
           <w:tcPr>
-            <w:tcW w:type="dxa" w:w="2154"/>
+            <w:tcW w:type="dxa" w:w="2438"/>
+            <w:shd w:val="clear" w:color="auto" w:fill="D9D9D9"/>
           </w:tcPr>
           <w:p>
             <w:pPr>
-              <w:spacing w:after="0"/>
+              <w:spacing w:after="0" w:line="240" w:lineRule="auto"/>
             </w:pPr>
             <w:r>
               <w:rPr>
@@ -1363,17 +1933,18 @@
         </w:tc>
         <w:tc>
           <w:tcPr>
-            <w:tcW w:type="dxa" w:w="3402"/>
+            <w:tcW w:type="dxa" w:w="3288"/>
+            <w:shd w:val="clear" w:color="auto" w:fill="D9D9D9"/>
           </w:tcPr>
           <w:p>
             <w:pPr>
-              <w:spacing w:after="0"/>
+              <w:spacing w:after="0" w:line="240" w:lineRule="auto"/>
             </w:pPr>
             <w:r>
               <w:rPr>
                 <w:b/>
               </w:rPr>
-              <w:t>En el DataMart (uso)</w:t>
+              <w:t>En el DataMart</w:t>
             </w:r>
           </w:p>
         </w:tc>
@@ -1384,11 +1955,11 @@
         </w:trPr>
         <w:tc>
           <w:tcPr>
-            <w:tcW w:type="dxa" w:w="3515"/>
+            <w:tcW w:type="dxa" w:w="3345"/>
           </w:tcPr>
           <w:p>
             <w:pPr>
-              <w:spacing w:after="0"/>
+              <w:spacing w:after="0" w:line="240" w:lineRule="auto"/>
             </w:pPr>
             <w:r>
               <w:rPr>
@@ -1406,11 +1977,11 @@
         </w:tc>
         <w:tc>
           <w:tcPr>
-            <w:tcW w:type="dxa" w:w="2154"/>
+            <w:tcW w:type="dxa" w:w="2438"/>
           </w:tcPr>
           <w:p>
             <w:pPr>
-              <w:spacing w:after="0"/>
+              <w:spacing w:after="0" w:line="240" w:lineRule="auto"/>
             </w:pPr>
             <w:r>
               <w:rPr>
@@ -1422,19 +1993,17 @@
         </w:tc>
         <w:tc>
           <w:tcPr>
-            <w:tcW w:type="dxa" w:w="3402"/>
+            <w:tcW w:type="dxa" w:w="3288"/>
           </w:tcPr>
           <w:p>
             <w:pPr>
-              <w:spacing w:after="0"/>
+              <w:spacing w:after="0" w:line="240" w:lineRule="auto"/>
             </w:pPr>
             <w:r>
               <w:rPr>
                 <w:b w:val="0"/>
               </w:rPr>
-              <w:t>dim_fecha</w:t>
-              <w:br/>
-              <w:t>(dimensión)</w:t>
+              <w:t>dim_fecha (dimensión)</w:t>
             </w:r>
           </w:p>
         </w:tc>
@@ -1445,11 +2014,11 @@
         </w:trPr>
         <w:tc>
           <w:tcPr>
-            <w:tcW w:type="dxa" w:w="3515"/>
+            <w:tcW w:type="dxa" w:w="3345"/>
           </w:tcPr>
           <w:p>
             <w:pPr>
-              <w:spacing w:after="0"/>
+              <w:spacing w:after="0" w:line="240" w:lineRule="auto"/>
             </w:pPr>
             <w:r>
               <w:rPr>
@@ -1461,11 +2030,11 @@
         </w:tc>
         <w:tc>
           <w:tcPr>
-            <w:tcW w:type="dxa" w:w="2154"/>
+            <w:tcW w:type="dxa" w:w="2438"/>
           </w:tcPr>
           <w:p>
             <w:pPr>
-              <w:spacing w:after="0"/>
+              <w:spacing w:after="0" w:line="240" w:lineRule="auto"/>
             </w:pPr>
             <w:r>
               <w:rPr>
@@ -1477,19 +2046,17 @@
         </w:tc>
         <w:tc>
           <w:tcPr>
-            <w:tcW w:type="dxa" w:w="3402"/>
+            <w:tcW w:type="dxa" w:w="3288"/>
           </w:tcPr>
           <w:p>
             <w:pPr>
-              <w:spacing w:after="0"/>
+              <w:spacing w:after="0" w:line="240" w:lineRule="auto"/>
             </w:pPr>
             <w:r>
               <w:rPr>
                 <w:b w:val="0"/>
               </w:rPr>
-              <w:t>dim_aerolinea</w:t>
-              <w:br/>
-              <w:t>(dimensión)</w:t>
+              <w:t>dim_aerolinea (dimensión)</w:t>
             </w:r>
           </w:p>
         </w:tc>
@@ -1500,11 +2067,11 @@
         </w:trPr>
         <w:tc>
           <w:tcPr>
-            <w:tcW w:type="dxa" w:w="3515"/>
+            <w:tcW w:type="dxa" w:w="3345"/>
           </w:tcPr>
           <w:p>
             <w:pPr>
-              <w:spacing w:after="0"/>
+              <w:spacing w:after="0" w:line="240" w:lineRule="auto"/>
             </w:pPr>
             <w:r>
               <w:rPr>
@@ -1518,11 +2085,11 @@
         </w:tc>
         <w:tc>
           <w:tcPr>
-            <w:tcW w:type="dxa" w:w="2154"/>
+            <w:tcW w:type="dxa" w:w="2438"/>
           </w:tcPr>
           <w:p>
             <w:pPr>
-              <w:spacing w:after="0"/>
+              <w:spacing w:after="0" w:line="240" w:lineRule="auto"/>
             </w:pPr>
             <w:r>
               <w:rPr>
@@ -1534,19 +2101,17 @@
         </w:tc>
         <w:tc>
           <w:tcPr>
-            <w:tcW w:type="dxa" w:w="3402"/>
+            <w:tcW w:type="dxa" w:w="3288"/>
           </w:tcPr>
           <w:p>
             <w:pPr>
-              <w:spacing w:after="0"/>
+              <w:spacing w:after="0" w:line="240" w:lineRule="auto"/>
             </w:pPr>
             <w:r>
               <w:rPr>
                 <w:b w:val="0"/>
               </w:rPr>
-              <w:t>dim_aeropuerto, en dos roles</w:t>
-              <w:br/>
-              <w:t>(dimensión)</w:t>
+              <w:t>dim_aeropuerto (dimensión)</w:t>
             </w:r>
           </w:p>
         </w:tc>
@@ -1557,11 +2122,11 @@
         </w:trPr>
         <w:tc>
           <w:tcPr>
-            <w:tcW w:type="dxa" w:w="3515"/>
+            <w:tcW w:type="dxa" w:w="3345"/>
           </w:tcPr>
           <w:p>
             <w:pPr>
-              <w:spacing w:after="0"/>
+              <w:spacing w:after="0" w:line="240" w:lineRule="auto"/>
             </w:pPr>
             <w:r>
               <w:rPr>
@@ -1573,33 +2138,33 @@
         </w:tc>
         <w:tc>
           <w:tcPr>
-            <w:tcW w:type="dxa" w:w="2154"/>
+            <w:tcW w:type="dxa" w:w="2438"/>
           </w:tcPr>
           <w:p>
             <w:pPr>
-              <w:spacing w:after="0"/>
+              <w:spacing w:after="0" w:line="240" w:lineRule="auto"/>
             </w:pPr>
             <w:r>
               <w:rPr>
                 <w:b w:val="0"/>
               </w:rPr>
-              <w:t>Hora programada de salida (hhmm)</w:t>
+              <w:t>Hora programada de salida</w:t>
             </w:r>
           </w:p>
         </w:tc>
         <w:tc>
           <w:tcPr>
-            <w:tcW w:type="dxa" w:w="3402"/>
+            <w:tcW w:type="dxa" w:w="3288"/>
           </w:tcPr>
           <w:p>
             <w:pPr>
-              <w:spacing w:after="0"/>
+              <w:spacing w:after="0" w:line="240" w:lineRule="auto"/>
             </w:pPr>
             <w:r>
               <w:rPr>
                 <w:b w:val="0"/>
               </w:rPr>
-              <w:t>salida_programada (degenerada)</w:t>
+              <w:t>salida_programada (dimensión degenerada)</w:t>
               <w:br/>
               <w:t>dim_hora (dimensión)</w:t>
             </w:r>
@@ -1612,11 +2177,11 @@
         </w:trPr>
         <w:tc>
           <w:tcPr>
-            <w:tcW w:type="dxa" w:w="3515"/>
+            <w:tcW w:type="dxa" w:w="3345"/>
           </w:tcPr>
           <w:p>
             <w:pPr>
-              <w:spacing w:after="0"/>
+              <w:spacing w:after="0" w:line="240" w:lineRule="auto"/>
             </w:pPr>
             <w:r>
               <w:rPr>
@@ -1628,35 +2193,33 @@
         </w:tc>
         <w:tc>
           <w:tcPr>
-            <w:tcW w:type="dxa" w:w="2154"/>
+            <w:tcW w:type="dxa" w:w="2438"/>
           </w:tcPr>
           <w:p>
             <w:pPr>
-              <w:spacing w:after="0"/>
+              <w:spacing w:after="0" w:line="240" w:lineRule="auto"/>
             </w:pPr>
             <w:r>
               <w:rPr>
                 <w:b w:val="0"/>
               </w:rPr>
-              <w:t>Motivo: A, B, C o D</w:t>
+              <w:t>Motivo de la cancelación</w:t>
             </w:r>
           </w:p>
         </w:tc>
         <w:tc>
           <w:tcPr>
-            <w:tcW w:type="dxa" w:w="3402"/>
+            <w:tcW w:type="dxa" w:w="3288"/>
           </w:tcPr>
           <w:p>
             <w:pPr>
-              <w:spacing w:after="0"/>
+              <w:spacing w:after="0" w:line="240" w:lineRule="auto"/>
             </w:pPr>
             <w:r>
               <w:rPr>
                 <w:b w:val="0"/>
               </w:rPr>
-              <w:t>dim_motivo_cancelacion</w:t>
-              <w:br/>
-              <w:t>(dimensión)</w:t>
+              <w:t>dim_motivo_cancelacion (dimensión)</w:t>
             </w:r>
           </w:p>
         </w:tc>
@@ -1667,11 +2230,11 @@
         </w:trPr>
         <w:tc>
           <w:tcPr>
-            <w:tcW w:type="dxa" w:w="3515"/>
+            <w:tcW w:type="dxa" w:w="3345"/>
           </w:tcPr>
           <w:p>
             <w:pPr>
-              <w:spacing w:after="0"/>
+              <w:spacing w:after="0" w:line="240" w:lineRule="auto"/>
             </w:pPr>
             <w:r>
               <w:rPr>
@@ -1685,11 +2248,11 @@
         </w:tc>
         <w:tc>
           <w:tcPr>
-            <w:tcW w:type="dxa" w:w="2154"/>
+            <w:tcW w:type="dxa" w:w="2438"/>
           </w:tcPr>
           <w:p>
             <w:pPr>
-              <w:spacing w:after="0"/>
+              <w:spacing w:after="0" w:line="240" w:lineRule="auto"/>
             </w:pPr>
             <w:r>
               <w:rPr>
@@ -1701,11 +2264,11 @@
         </w:tc>
         <w:tc>
           <w:tcPr>
-            <w:tcW w:type="dxa" w:w="3402"/>
+            <w:tcW w:type="dxa" w:w="3288"/>
           </w:tcPr>
           <w:p>
             <w:pPr>
-              <w:spacing w:after="0"/>
+              <w:spacing w:after="0" w:line="240" w:lineRule="auto"/>
             </w:pPr>
             <w:r>
               <w:rPr>
@@ -1726,11 +2289,11 @@
         </w:trPr>
         <w:tc>
           <w:tcPr>
-            <w:tcW w:type="dxa" w:w="3515"/>
+            <w:tcW w:type="dxa" w:w="3345"/>
           </w:tcPr>
           <w:p>
             <w:pPr>
-              <w:spacing w:after="0"/>
+              <w:spacing w:after="0" w:line="240" w:lineRule="auto"/>
             </w:pPr>
             <w:r>
               <w:rPr>
@@ -1742,11 +2305,11 @@
         </w:tc>
         <w:tc>
           <w:tcPr>
-            <w:tcW w:type="dxa" w:w="2154"/>
+            <w:tcW w:type="dxa" w:w="2438"/>
           </w:tcPr>
           <w:p>
             <w:pPr>
-              <w:spacing w:after="0"/>
+              <w:spacing w:after="0" w:line="240" w:lineRule="auto"/>
             </w:pPr>
             <w:r>
               <w:rPr>
@@ -1758,19 +2321,17 @@
         </w:tc>
         <w:tc>
           <w:tcPr>
-            <w:tcW w:type="dxa" w:w="3402"/>
+            <w:tcW w:type="dxa" w:w="3288"/>
           </w:tcPr>
           <w:p>
             <w:pPr>
-              <w:spacing w:after="0"/>
+              <w:spacing w:after="0" w:line="240" w:lineRule="auto"/>
             </w:pPr>
             <w:r>
               <w:rPr>
                 <w:b w:val="0"/>
               </w:rPr>
-              <w:t>retraso_salida_min</w:t>
-              <w:br/>
-              <w:t>(métrica aditiva)</w:t>
+              <w:t>retraso_salida_min (métrica)</w:t>
             </w:r>
           </w:p>
         </w:tc>
@@ -1781,11 +2342,11 @@
         </w:trPr>
         <w:tc>
           <w:tcPr>
-            <w:tcW w:type="dxa" w:w="3515"/>
+            <w:tcW w:type="dxa" w:w="3345"/>
           </w:tcPr>
           <w:p>
             <w:pPr>
-              <w:spacing w:after="0"/>
+              <w:spacing w:after="0" w:line="240" w:lineRule="auto"/>
             </w:pPr>
             <w:r>
               <w:rPr>
@@ -1797,11 +2358,11 @@
         </w:tc>
         <w:tc>
           <w:tcPr>
-            <w:tcW w:type="dxa" w:w="2154"/>
+            <w:tcW w:type="dxa" w:w="2438"/>
           </w:tcPr>
           <w:p>
             <w:pPr>
-              <w:spacing w:after="0"/>
+              <w:spacing w:after="0" w:line="240" w:lineRule="auto"/>
             </w:pPr>
             <w:r>
               <w:rPr>
@@ -1813,19 +2374,19 @@
         </w:tc>
         <w:tc>
           <w:tcPr>
-            <w:tcW w:type="dxa" w:w="3402"/>
+            <w:tcW w:type="dxa" w:w="3288"/>
           </w:tcPr>
           <w:p>
             <w:pPr>
-              <w:spacing w:after="0"/>
+              <w:spacing w:after="0" w:line="240" w:lineRule="auto"/>
             </w:pPr>
             <w:r>
               <w:rPr>
                 <w:b w:val="0"/>
               </w:rPr>
-              <w:t>retraso_llegada_min (métrica aditiva)</w:t>
+              <w:t>retraso_llegada_min (métrica)</w:t>
               <w:br/>
-              <w:t>es_retrasado, es_puntual (indicadores)</w:t>
+              <w:t>es_retrasado y es_puntual (indicadores)</w:t>
             </w:r>
           </w:p>
         </w:tc>
@@ -1836,11 +2397,11 @@
         </w:trPr>
         <w:tc>
           <w:tcPr>
-            <w:tcW w:type="dxa" w:w="3515"/>
+            <w:tcW w:type="dxa" w:w="3345"/>
           </w:tcPr>
           <w:p>
             <w:pPr>
-              <w:spacing w:after="0"/>
+              <w:spacing w:after="0" w:line="240" w:lineRule="auto"/>
             </w:pPr>
             <w:r>
               <w:rPr>
@@ -1854,11 +2415,11 @@
         </w:tc>
         <w:tc>
           <w:tcPr>
-            <w:tcW w:type="dxa" w:w="2154"/>
+            <w:tcW w:type="dxa" w:w="2438"/>
           </w:tcPr>
           <w:p>
             <w:pPr>
-              <w:spacing w:after="0"/>
+              <w:spacing w:after="0" w:line="240" w:lineRule="auto"/>
             </w:pPr>
             <w:r>
               <w:rPr>
@@ -1870,11 +2431,11 @@
         </w:tc>
         <w:tc>
           <w:tcPr>
-            <w:tcW w:type="dxa" w:w="3402"/>
+            <w:tcW w:type="dxa" w:w="3288"/>
           </w:tcPr>
           <w:p>
             <w:pPr>
-              <w:spacing w:after="0"/>
+              <w:spacing w:after="0" w:line="240" w:lineRule="auto"/>
             </w:pPr>
             <w:r>
               <w:rPr>
@@ -1884,7 +2445,7 @@
               <w:br/>
               <w:t>taxi_llegada_min</w:t>
               <w:br/>
-              <w:t>(métricas aditivas)</w:t>
+              <w:t>(métricas)</w:t>
             </w:r>
           </w:p>
         </w:tc>
@@ -1895,11 +2456,11 @@
         </w:trPr>
         <w:tc>
           <w:tcPr>
-            <w:tcW w:type="dxa" w:w="3515"/>
+            <w:tcW w:type="dxa" w:w="3345"/>
           </w:tcPr>
           <w:p>
             <w:pPr>
-              <w:spacing w:after="0"/>
+              <w:spacing w:after="0" w:line="240" w:lineRule="auto"/>
             </w:pPr>
             <w:r>
               <w:rPr>
@@ -1915,11 +2476,11 @@
         </w:tc>
         <w:tc>
           <w:tcPr>
-            <w:tcW w:type="dxa" w:w="2154"/>
+            <w:tcW w:type="dxa" w:w="2438"/>
           </w:tcPr>
           <w:p>
             <w:pPr>
-              <w:spacing w:after="0"/>
+              <w:spacing w:after="0" w:line="240" w:lineRule="auto"/>
             </w:pPr>
             <w:r>
               <w:rPr>
@@ -1931,11 +2492,11 @@
         </w:tc>
         <w:tc>
           <w:tcPr>
-            <w:tcW w:type="dxa" w:w="3402"/>
+            <w:tcW w:type="dxa" w:w="3288"/>
           </w:tcPr>
           <w:p>
             <w:pPr>
-              <w:spacing w:after="0"/>
+              <w:spacing w:after="0" w:line="240" w:lineRule="auto"/>
             </w:pPr>
             <w:r>
               <w:rPr>
@@ -1947,7 +2508,7 @@
               <w:br/>
               <w:t>tiempo_aire_min</w:t>
               <w:br/>
-              <w:t>(métricas aditivas)</w:t>
+              <w:t>(métricas)</w:t>
             </w:r>
           </w:p>
         </w:tc>
@@ -1958,11 +2519,11 @@
         </w:trPr>
         <w:tc>
           <w:tcPr>
-            <w:tcW w:type="dxa" w:w="3515"/>
+            <w:tcW w:type="dxa" w:w="3345"/>
           </w:tcPr>
           <w:p>
             <w:pPr>
-              <w:spacing w:after="0"/>
+              <w:spacing w:after="0" w:line="240" w:lineRule="auto"/>
             </w:pPr>
             <w:r>
               <w:rPr>
@@ -1974,11 +2535,11 @@
         </w:tc>
         <w:tc>
           <w:tcPr>
-            <w:tcW w:type="dxa" w:w="2154"/>
+            <w:tcW w:type="dxa" w:w="2438"/>
           </w:tcPr>
           <w:p>
             <w:pPr>
-              <w:spacing w:after="0"/>
+              <w:spacing w:after="0" w:line="240" w:lineRule="auto"/>
             </w:pPr>
             <w:r>
               <w:rPr>
@@ -1990,19 +2551,17 @@
         </w:tc>
         <w:tc>
           <w:tcPr>
-            <w:tcW w:type="dxa" w:w="3402"/>
+            <w:tcW w:type="dxa" w:w="3288"/>
           </w:tcPr>
           <w:p>
             <w:pPr>
-              <w:spacing w:after="0"/>
+              <w:spacing w:after="0" w:line="240" w:lineRule="auto"/>
             </w:pPr>
             <w:r>
               <w:rPr>
                 <w:b w:val="0"/>
               </w:rPr>
-              <w:t>distancia_millas</w:t>
-              <w:br/>
-              <w:t>(métrica aditiva)</w:t>
+              <w:t>distancia_millas (métrica)</w:t>
             </w:r>
           </w:p>
         </w:tc>
@@ -2013,11 +2572,11 @@
         </w:trPr>
         <w:tc>
           <w:tcPr>
-            <w:tcW w:type="dxa" w:w="3515"/>
+            <w:tcW w:type="dxa" w:w="3345"/>
           </w:tcPr>
           <w:p>
             <w:pPr>
-              <w:spacing w:after="0"/>
+              <w:spacing w:after="0" w:line="240" w:lineRule="auto"/>
             </w:pPr>
             <w:r>
               <w:rPr>
@@ -2037,27 +2596,27 @@
         </w:tc>
         <w:tc>
           <w:tcPr>
-            <w:tcW w:type="dxa" w:w="2154"/>
+            <w:tcW w:type="dxa" w:w="2438"/>
           </w:tcPr>
           <w:p>
             <w:pPr>
-              <w:spacing w:after="0"/>
+              <w:spacing w:after="0" w:line="240" w:lineRule="auto"/>
             </w:pPr>
             <w:r>
               <w:rPr>
                 <w:b w:val="0"/>
               </w:rPr>
-              <w:t>Minutos de retraso por causa: aerolínea, clima, sistema aéreo, seguridad y avión tardío</w:t>
+              <w:t>Minutos de retraso por cada causa</w:t>
             </w:r>
           </w:p>
         </w:tc>
         <w:tc>
           <w:tcPr>
-            <w:tcW w:type="dxa" w:w="3402"/>
+            <w:tcW w:type="dxa" w:w="3288"/>
           </w:tcPr>
           <w:p>
             <w:pPr>
-              <w:spacing w:after="0"/>
+              <w:spacing w:after="0" w:line="240" w:lineRule="auto"/>
             </w:pPr>
             <w:r>
               <w:rPr>
@@ -2073,7 +2632,7 @@
               <w:br/>
               <w:t>retraso_avion_tardio_min</w:t>
               <w:br/>
-              <w:t>(métricas aditivas)</w:t>
+              <w:t>(métricas)</w:t>
             </w:r>
           </w:p>
         </w:tc>
@@ -2084,11 +2643,11 @@
         </w:trPr>
         <w:tc>
           <w:tcPr>
-            <w:tcW w:type="dxa" w:w="3515"/>
+            <w:tcW w:type="dxa" w:w="3345"/>
           </w:tcPr>
           <w:p>
             <w:pPr>
-              <w:spacing w:after="0"/>
+              <w:spacing w:after="0" w:line="240" w:lineRule="auto"/>
             </w:pPr>
             <w:r>
               <w:rPr>
@@ -2102,27 +2661,27 @@
         </w:tc>
         <w:tc>
           <w:tcPr>
-            <w:tcW w:type="dxa" w:w="2154"/>
+            <w:tcW w:type="dxa" w:w="2438"/>
           </w:tcPr>
           <w:p>
             <w:pPr>
-              <w:spacing w:after="0"/>
+              <w:spacing w:after="0" w:line="240" w:lineRule="auto"/>
             </w:pPr>
             <w:r>
               <w:rPr>
                 <w:b w:val="0"/>
               </w:rPr>
-              <w:t>1 si el vuelo fue cancelado o desviado</w:t>
+              <w:t>Indican si el vuelo fue cancelado o desviado</w:t>
             </w:r>
           </w:p>
         </w:tc>
         <w:tc>
           <w:tcPr>
-            <w:tcW w:type="dxa" w:w="3402"/>
+            <w:tcW w:type="dxa" w:w="3288"/>
           </w:tcPr>
           <w:p>
             <w:pPr>
-              <w:spacing w:after="0"/>
+              <w:spacing w:after="0" w:line="240" w:lineRule="auto"/>
             </w:pPr>
             <w:r>
               <w:rPr>
@@ -2132,7 +2691,7 @@
               <w:br/>
               <w:t>es_desviado</w:t>
               <w:br/>
-              <w:t>(indicadores 0/1)</w:t>
+              <w:t>(indicadores)</w:t>
             </w:r>
           </w:p>
         </w:tc>
@@ -2143,11 +2702,11 @@
         </w:trPr>
         <w:tc>
           <w:tcPr>
-            <w:tcW w:type="dxa" w:w="3515"/>
+            <w:tcW w:type="dxa" w:w="3345"/>
           </w:tcPr>
           <w:p>
             <w:pPr>
-              <w:spacing w:after="0"/>
+              <w:spacing w:after="0" w:line="240" w:lineRule="auto"/>
             </w:pPr>
             <w:r>
               <w:rPr>
@@ -2167,11 +2726,11 @@
         </w:tc>
         <w:tc>
           <w:tcPr>
-            <w:tcW w:type="dxa" w:w="2154"/>
+            <w:tcW w:type="dxa" w:w="2438"/>
           </w:tcPr>
           <w:p>
             <w:pPr>
-              <w:spacing w:after="0"/>
+              <w:spacing w:after="0" w:line="240" w:lineRule="auto"/>
             </w:pPr>
             <w:r>
               <w:rPr>
@@ -2183,17 +2742,233 @@
         </w:tc>
         <w:tc>
           <w:tcPr>
-            <w:tcW w:type="dxa" w:w="3402"/>
+            <w:tcW w:type="dxa" w:w="3288"/>
           </w:tcPr>
           <w:p>
             <w:pPr>
-              <w:spacing w:after="0"/>
+              <w:spacing w:after="0" w:line="240" w:lineRule="auto"/>
             </w:pPr>
             <w:r>
               <w:rPr>
                 <w:b w:val="0"/>
               </w:rPr>
-              <w:t>No se cargan: lo necesario ya está en los retrasos y los tiempos</w:t>
+              <w:t>No se cargan, porque lo necesario ya está en los retrasos y los tiempos</w:t>
+            </w:r>
+          </w:p>
+        </w:tc>
+      </w:tr>
+      <w:tr>
+        <w:trPr>
+          <w:cantSplit w:val="true"/>
+        </w:trPr>
+        <w:tc>
+          <w:tcPr>
+            <w:tcW w:type="dxa" w:w="3345"/>
+          </w:tcPr>
+          <w:p>
+            <w:pPr>
+              <w:spacing w:after="0" w:line="240" w:lineRule="auto"/>
+            </w:pPr>
+            <w:r>
+              <w:rPr>
+                <w:b w:val="0"/>
+              </w:rPr>
+              <w:t>airlines.csv (todas)</w:t>
+            </w:r>
+          </w:p>
+        </w:tc>
+        <w:tc>
+          <w:tcPr>
+            <w:tcW w:type="dxa" w:w="2438"/>
+          </w:tcPr>
+          <w:p>
+            <w:pPr>
+              <w:spacing w:after="0" w:line="240" w:lineRule="auto"/>
+            </w:pPr>
+            <w:r>
+              <w:rPr>
+                <w:b w:val="0"/>
+              </w:rPr>
+              <w:t>Datos de cada aerolínea</w:t>
+            </w:r>
+          </w:p>
+        </w:tc>
+        <w:tc>
+          <w:tcPr>
+            <w:tcW w:type="dxa" w:w="3288"/>
+          </w:tcPr>
+          <w:p>
+            <w:pPr>
+              <w:spacing w:after="0" w:line="240" w:lineRule="auto"/>
+            </w:pPr>
+            <w:r>
+              <w:rPr>
+                <w:b w:val="0"/>
+              </w:rPr>
+              <w:t>dim_aerolinea (dimensión)</w:t>
+            </w:r>
+          </w:p>
+        </w:tc>
+      </w:tr>
+      <w:tr>
+        <w:trPr>
+          <w:cantSplit w:val="true"/>
+        </w:trPr>
+        <w:tc>
+          <w:tcPr>
+            <w:tcW w:type="dxa" w:w="3345"/>
+          </w:tcPr>
+          <w:p>
+            <w:pPr>
+              <w:spacing w:after="0" w:line="240" w:lineRule="auto"/>
+            </w:pPr>
+            <w:r>
+              <w:rPr>
+                <w:b w:val="0"/>
+              </w:rPr>
+              <w:t>airports.csv (todas)</w:t>
+            </w:r>
+          </w:p>
+        </w:tc>
+        <w:tc>
+          <w:tcPr>
+            <w:tcW w:type="dxa" w:w="2438"/>
+          </w:tcPr>
+          <w:p>
+            <w:pPr>
+              <w:spacing w:after="0" w:line="240" w:lineRule="auto"/>
+            </w:pPr>
+            <w:r>
+              <w:rPr>
+                <w:b w:val="0"/>
+              </w:rPr>
+              <w:t>Datos de cada aeropuerto</w:t>
+            </w:r>
+          </w:p>
+        </w:tc>
+        <w:tc>
+          <w:tcPr>
+            <w:tcW w:type="dxa" w:w="3288"/>
+          </w:tcPr>
+          <w:p>
+            <w:pPr>
+              <w:spacing w:after="0" w:line="240" w:lineRule="auto"/>
+            </w:pPr>
+            <w:r>
+              <w:rPr>
+                <w:b w:val="0"/>
+              </w:rPr>
+              <w:t>dim_aeropuerto (dimensión); la región se obtiene del estado</w:t>
+            </w:r>
+          </w:p>
+        </w:tc>
+      </w:tr>
+    </w:tbl>
+    <w:p>
+      <w:pPr>
+        <w:spacing w:after="0"/>
+      </w:pPr>
+    </w:p>
+    <w:p>
+      <w:pPr>
+        <w:keepNext/>
+        <w:spacing w:before="120"/>
+      </w:pPr>
+      <w:r>
+        <w:rPr>
+          <w:b/>
+        </w:rPr>
+        <w:t>4.4 Métricas y su clasificación</w:t>
+      </w:r>
+    </w:p>
+    <w:p>
+      <w:pPr>
+        <w:jc w:val="both"/>
+      </w:pPr>
+      <w:r>
+        <w:t>En la Tabla 6 se clasifican las métricas de la tabla de hechos según si se pueden sumar o no.</w:t>
+      </w:r>
+    </w:p>
+    <w:p>
+      <w:pPr>
+        <w:keepNext/>
+        <w:spacing w:after="60"/>
+      </w:pPr>
+      <w:r>
+        <w:rPr>
+          <w:b/>
+        </w:rPr>
+        <w:t xml:space="preserve">Tabla 6. </w:t>
+      </w:r>
+      <w:r>
+        <w:t>Clasificación de las métricas</w:t>
+      </w:r>
+    </w:p>
+    <w:tbl>
+      <w:tblPr>
+        <w:tblStyle w:val="TableGrid"/>
+        <w:tblW w:type="auto" w:w="0"/>
+        <w:tblLayout w:type="fixed"/>
+        <w:tblLook w:firstColumn="1" w:firstRow="1" w:lastColumn="0" w:lastRow="0" w:noHBand="0" w:noVBand="1" w:val="04A0"/>
+      </w:tblPr>
+      <w:tblGrid>
+        <w:gridCol w:w="3515"/>
+        <w:gridCol w:w="1474"/>
+        <w:gridCol w:w="4082"/>
+      </w:tblGrid>
+      <w:tr>
+        <w:trPr>
+          <w:cantSplit w:val="true"/>
+          <w:tblHeader w:val="true"/>
+        </w:trPr>
+        <w:tc>
+          <w:tcPr>
+            <w:tcW w:type="dxa" w:w="3515"/>
+            <w:shd w:val="clear" w:color="auto" w:fill="D9D9D9"/>
+          </w:tcPr>
+          <w:p>
+            <w:pPr>
+              <w:spacing w:after="0" w:line="240" w:lineRule="auto"/>
+            </w:pPr>
+            <w:r>
+              <w:rPr>
+                <w:b/>
+              </w:rPr>
+              <w:t>Métrica</w:t>
+            </w:r>
+          </w:p>
+        </w:tc>
+        <w:tc>
+          <w:tcPr>
+            <w:tcW w:type="dxa" w:w="1474"/>
+            <w:shd w:val="clear" w:color="auto" w:fill="D9D9D9"/>
+          </w:tcPr>
+          <w:p>
+            <w:pPr>
+              <w:spacing w:after="0" w:line="240" w:lineRule="auto"/>
+            </w:pPr>
+            <w:r>
+              <w:rPr>
+                <w:b/>
+              </w:rPr>
+              <w:t>Tipo</w:t>
+            </w:r>
+          </w:p>
+        </w:tc>
+        <w:tc>
+          <w:tcPr>
+            <w:tcW w:type="dxa" w:w="4082"/>
+            <w:shd w:val="clear" w:color="auto" w:fill="D9D9D9"/>
+          </w:tcPr>
+          <w:p>
+            <w:pPr>
+              <w:spacing w:after="0" w:line="240" w:lineRule="auto"/>
+            </w:pPr>
+            <w:r>
+              <w:rPr>
+                <w:b/>
+              </w:rPr>
+              <w:t>Motivo</w:t>
             </w:r>
           </w:p>
         </w:tc>
@@ -2208,47 +2983,45 @@
           </w:tcPr>
           <w:p>
             <w:pPr>
-              <w:spacing w:after="0"/>
+              <w:spacing w:after="0" w:line="240" w:lineRule="auto"/>
             </w:pPr>
             <w:r>
               <w:rPr>
                 <w:b w:val="0"/>
               </w:rPr>
-              <w:t>airlines.csv: IATA_CODE, AIRLINE</w:t>
+              <w:t>Minutos de retraso en la salida y en la llegada</w:t>
             </w:r>
           </w:p>
         </w:tc>
         <w:tc>
           <w:tcPr>
-            <w:tcW w:type="dxa" w:w="2154"/>
+            <w:tcW w:type="dxa" w:w="1474"/>
           </w:tcPr>
           <w:p>
             <w:pPr>
-              <w:spacing w:after="0"/>
+              <w:spacing w:after="0" w:line="240" w:lineRule="auto"/>
             </w:pPr>
             <w:r>
               <w:rPr>
                 <w:b w:val="0"/>
               </w:rPr>
-              <w:t>Código y nombre de la aerolínea</w:t>
+              <w:t>Aditiva</w:t>
             </w:r>
           </w:p>
         </w:tc>
         <w:tc>
           <w:tcPr>
-            <w:tcW w:type="dxa" w:w="3402"/>
+            <w:tcW w:type="dxa" w:w="4082"/>
           </w:tcPr>
           <w:p>
             <w:pPr>
-              <w:spacing w:after="0"/>
+              <w:spacing w:after="0" w:line="240" w:lineRule="auto"/>
             </w:pPr>
             <w:r>
               <w:rPr>
                 <w:b w:val="0"/>
               </w:rPr>
-              <w:t>dim_aerolinea</w:t>
-              <w:br/>
-              <w:t>(dimensión)</w:t>
+              <w:t>Se suman por aerolínea, aeropuerto o fecha para obtener el total de minutos de retraso.</w:t>
             </w:r>
           </w:p>
         </w:tc>
@@ -2263,47 +3036,257 @@
           </w:tcPr>
           <w:p>
             <w:pPr>
-              <w:spacing w:after="0"/>
+              <w:spacing w:after="0" w:line="240" w:lineRule="auto"/>
             </w:pPr>
             <w:r>
               <w:rPr>
                 <w:b w:val="0"/>
               </w:rPr>
-              <w:t>airports.csv: IATA_CODE, AIRPORT, CITY, STATE, COUNTRY, LATITUDE, LONGITUDE</w:t>
+              <w:t>Minutos de retraso por causa</w:t>
             </w:r>
           </w:p>
         </w:tc>
         <w:tc>
           <w:tcPr>
-            <w:tcW w:type="dxa" w:w="2154"/>
+            <w:tcW w:type="dxa" w:w="1474"/>
           </w:tcPr>
           <w:p>
             <w:pPr>
-              <w:spacing w:after="0"/>
+              <w:spacing w:after="0" w:line="240" w:lineRule="auto"/>
             </w:pPr>
             <w:r>
               <w:rPr>
                 <w:b w:val="0"/>
               </w:rPr>
-              <w:t>Datos de cada aeropuerto</w:t>
+              <w:t>Aditiva</w:t>
             </w:r>
           </w:p>
         </w:tc>
         <w:tc>
           <w:tcPr>
-            <w:tcW w:type="dxa" w:w="3402"/>
+            <w:tcW w:type="dxa" w:w="4082"/>
           </w:tcPr>
           <w:p>
             <w:pPr>
-              <w:spacing w:after="0"/>
+              <w:spacing w:after="0" w:line="240" w:lineRule="auto"/>
             </w:pPr>
             <w:r>
               <w:rPr>
                 <w:b w:val="0"/>
               </w:rPr>
-              <w:t>dim_aeropuerto; la región se deriva del estado</w:t>
-              <w:br/>
-              <w:t>(dimensión)</w:t>
+              <w:t>La suma por causa muestra cuál genera más retraso.</w:t>
+            </w:r>
+          </w:p>
+        </w:tc>
+      </w:tr>
+      <w:tr>
+        <w:trPr>
+          <w:cantSplit w:val="true"/>
+        </w:trPr>
+        <w:tc>
+          <w:tcPr>
+            <w:tcW w:type="dxa" w:w="3515"/>
+          </w:tcPr>
+          <w:p>
+            <w:pPr>
+              <w:spacing w:after="0" w:line="240" w:lineRule="auto"/>
+            </w:pPr>
+            <w:r>
+              <w:rPr>
+                <w:b w:val="0"/>
+              </w:rPr>
+              <w:t>Tiempos de rodaje, tiempo programado, tiempo real y tiempo en el aire</w:t>
+            </w:r>
+          </w:p>
+        </w:tc>
+        <w:tc>
+          <w:tcPr>
+            <w:tcW w:type="dxa" w:w="1474"/>
+          </w:tcPr>
+          <w:p>
+            <w:pPr>
+              <w:spacing w:after="0" w:line="240" w:lineRule="auto"/>
+            </w:pPr>
+            <w:r>
+              <w:rPr>
+                <w:b w:val="0"/>
+              </w:rPr>
+              <w:t>Aditiva</w:t>
+            </w:r>
+          </w:p>
+        </w:tc>
+        <w:tc>
+          <w:tcPr>
+            <w:tcW w:type="dxa" w:w="4082"/>
+          </w:tcPr>
+          <w:p>
+            <w:pPr>
+              <w:spacing w:after="0" w:line="240" w:lineRule="auto"/>
+            </w:pPr>
+            <w:r>
+              <w:rPr>
+                <w:b w:val="0"/>
+              </w:rPr>
+              <w:t>Se pueden sumar o promediar por cualquier dimensión.</w:t>
+            </w:r>
+          </w:p>
+        </w:tc>
+      </w:tr>
+      <w:tr>
+        <w:trPr>
+          <w:cantSplit w:val="true"/>
+        </w:trPr>
+        <w:tc>
+          <w:tcPr>
+            <w:tcW w:type="dxa" w:w="3515"/>
+          </w:tcPr>
+          <w:p>
+            <w:pPr>
+              <w:spacing w:after="0" w:line="240" w:lineRule="auto"/>
+            </w:pPr>
+            <w:r>
+              <w:rPr>
+                <w:b w:val="0"/>
+              </w:rPr>
+              <w:t>Distancia</w:t>
+            </w:r>
+          </w:p>
+        </w:tc>
+        <w:tc>
+          <w:tcPr>
+            <w:tcW w:type="dxa" w:w="1474"/>
+          </w:tcPr>
+          <w:p>
+            <w:pPr>
+              <w:spacing w:after="0" w:line="240" w:lineRule="auto"/>
+            </w:pPr>
+            <w:r>
+              <w:rPr>
+                <w:b w:val="0"/>
+              </w:rPr>
+              <w:t>Aditiva</w:t>
+            </w:r>
+          </w:p>
+        </w:tc>
+        <w:tc>
+          <w:tcPr>
+            <w:tcW w:type="dxa" w:w="4082"/>
+          </w:tcPr>
+          <w:p>
+            <w:pPr>
+              <w:spacing w:after="0" w:line="240" w:lineRule="auto"/>
+            </w:pPr>
+            <w:r>
+              <w:rPr>
+                <w:b w:val="0"/>
+              </w:rPr>
+              <w:t>La suma da el total de millas voladas.</w:t>
+            </w:r>
+          </w:p>
+        </w:tc>
+      </w:tr>
+      <w:tr>
+        <w:trPr>
+          <w:cantSplit w:val="true"/>
+        </w:trPr>
+        <w:tc>
+          <w:tcPr>
+            <w:tcW w:type="dxa" w:w="3515"/>
+          </w:tcPr>
+          <w:p>
+            <w:pPr>
+              <w:spacing w:after="0" w:line="240" w:lineRule="auto"/>
+            </w:pPr>
+            <w:r>
+              <w:rPr>
+                <w:b w:val="0"/>
+              </w:rPr>
+              <w:t>Indicadores de vuelo cancelado, desviado, retrasado y puntual (0 o 1)</w:t>
+            </w:r>
+          </w:p>
+        </w:tc>
+        <w:tc>
+          <w:tcPr>
+            <w:tcW w:type="dxa" w:w="1474"/>
+          </w:tcPr>
+          <w:p>
+            <w:pPr>
+              <w:spacing w:after="0" w:line="240" w:lineRule="auto"/>
+            </w:pPr>
+            <w:r>
+              <w:rPr>
+                <w:b w:val="0"/>
+              </w:rPr>
+              <w:t>Aditiva</w:t>
+            </w:r>
+          </w:p>
+        </w:tc>
+        <w:tc>
+          <w:tcPr>
+            <w:tcW w:type="dxa" w:w="4082"/>
+          </w:tcPr>
+          <w:p>
+            <w:pPr>
+              <w:spacing w:after="0" w:line="240" w:lineRule="auto"/>
+            </w:pPr>
+            <w:r>
+              <w:rPr>
+                <w:b w:val="0"/>
+              </w:rPr>
+              <w:t>La suma da la cantidad de vuelos de cada tipo.</w:t>
+            </w:r>
+          </w:p>
+        </w:tc>
+      </w:tr>
+      <w:tr>
+        <w:trPr>
+          <w:cantSplit w:val="true"/>
+        </w:trPr>
+        <w:tc>
+          <w:tcPr>
+            <w:tcW w:type="dxa" w:w="3515"/>
+          </w:tcPr>
+          <w:p>
+            <w:pPr>
+              <w:spacing w:after="0" w:line="240" w:lineRule="auto"/>
+            </w:pPr>
+            <w:r>
+              <w:rPr>
+                <w:b w:val="0"/>
+              </w:rPr>
+              <w:t>Porcentajes de puntualidad y de cancelación, y promedios</w:t>
+            </w:r>
+          </w:p>
+        </w:tc>
+        <w:tc>
+          <w:tcPr>
+            <w:tcW w:type="dxa" w:w="1474"/>
+          </w:tcPr>
+          <w:p>
+            <w:pPr>
+              <w:spacing w:after="0" w:line="240" w:lineRule="auto"/>
+            </w:pPr>
+            <w:r>
+              <w:rPr>
+                <w:b w:val="0"/>
+              </w:rPr>
+              <w:t>No aditiva</w:t>
+            </w:r>
+          </w:p>
+        </w:tc>
+        <w:tc>
+          <w:tcPr>
+            <w:tcW w:type="dxa" w:w="4082"/>
+          </w:tcPr>
+          <w:p>
+            <w:pPr>
+              <w:spacing w:after="0" w:line="240" w:lineRule="auto"/>
+            </w:pPr>
+            <w:r>
+              <w:rPr>
+                <w:b w:val="0"/>
+              </w:rPr>
+              <w:t>No se pueden sumar; se calculan a partir de los totales.</w:t>
             </w:r>
           </w:p>
         </w:tc>
@@ -2316,78 +3299,22 @@
     </w:p>
     <w:p>
       <w:pPr>
-        <w:pStyle w:val="ListBullet"/>
-        <w:spacing w:after="20"/>
         <w:jc w:val="both"/>
+      </w:pPr>
+      <w:r>
+        <w:t>No hay métricas semiaditivas, porque cada vuelo es un evento independiente y ninguna medida representa un saldo acumulado en el tiempo.</w:t>
+      </w:r>
+    </w:p>
+    <w:p>
+      <w:pPr>
+        <w:keepNext/>
+        <w:spacing w:before="120"/>
       </w:pPr>
       <w:r>
         <w:rPr>
           <w:b/>
         </w:rPr>
-        <w:t>Claves:</w:t>
-      </w:r>
-      <w:r>
-        <w:rPr>
-          <w:b w:val="0"/>
-        </w:rPr>
-        <w:t xml:space="preserve"> las claves sustitutas (sk_*) son enteros generados por el DBMS; los códigos IATA del dataset son claves naturales únicas que el ETL usa para buscar la clave sustituta. dim_aeropuerto se relaciona dos veces con los hechos (origen y destino).</w:t>
-      </w:r>
-    </w:p>
-    <w:p>
-      <w:pPr>
-        <w:pStyle w:val="ListBullet"/>
-        <w:spacing w:after="20"/>
-        <w:jc w:val="both"/>
-      </w:pPr>
-      <w:r>
-        <w:rPr>
-          <w:b/>
-        </w:rPr>
-        <w:t>Métricas aditivas:</w:t>
-      </w:r>
-      <w:r>
-        <w:rPr>
-          <w:b w:val="0"/>
-        </w:rPr>
-        <w:t xml:space="preserve"> minutos de retraso (total y por causa), tiempos, distancia e indicadores 0/1 (su suma cuenta vuelos cancelados, retrasados o puntuales).</w:t>
-      </w:r>
-    </w:p>
-    <w:p>
-      <w:pPr>
-        <w:pStyle w:val="ListBullet"/>
-        <w:spacing w:after="20"/>
-        <w:jc w:val="both"/>
-      </w:pPr>
-      <w:r>
-        <w:rPr>
-          <w:b/>
-        </w:rPr>
-        <w:t>Métricas semiaditivas:</w:t>
-      </w:r>
-      <w:r>
-        <w:rPr>
-          <w:b w:val="0"/>
-        </w:rPr>
-        <w:t xml:space="preserve"> no hay en este hecho, porque cada vuelo es un evento independiente y no un saldo acumulado.</w:t>
-      </w:r>
-    </w:p>
-    <w:p>
-      <w:pPr>
-        <w:pStyle w:val="ListBullet"/>
-        <w:spacing w:after="20"/>
-        <w:jc w:val="both"/>
-      </w:pPr>
-      <w:r>
-        <w:rPr>
-          <w:b/>
-        </w:rPr>
-        <w:t>Métricas no aditivas:</w:t>
-      </w:r>
-      <w:r>
-        <w:rPr>
-          <w:b w:val="0"/>
-        </w:rPr>
-        <w:t xml:space="preserve"> porcentajes de puntualidad y de cancelación, y promedios; se recalculan desde sus componentes.</w:t>
+        <w:t>4.5 Verificación del modelo con los objetivos</w:t>
       </w:r>
     </w:p>
     <w:p>
@@ -2395,16 +3322,423 @@
         <w:jc w:val="both"/>
       </w:pPr>
       <w:r>
+        <w:t>La Tabla 7 muestra qué métricas y dimensiones se usan para responder cada objetivo específico.</w:t>
+      </w:r>
+    </w:p>
+    <w:p>
+      <w:pPr>
+        <w:keepNext/>
+        <w:spacing w:after="60"/>
+      </w:pPr>
+      <w:r>
         <w:rPr>
           <w:b/>
         </w:rPr>
-        <w:t>Verificación:</w:t>
+        <w:t xml:space="preserve">Tabla 7. </w:t>
       </w:r>
       <w:r>
-        <w:rPr>
-          <w:b w:val="0"/>
-        </w:rPr>
-        <w:t xml:space="preserve"> OE1 usa es_puntual por aerolínea y mes; OE2, es_cancelado y es_desviado por aerolínea y motivo; OE3, los minutos por causa; OE4, retraso_llegada_min por aeropuertos de origen y destino; OE5, retraso_salida_min por franja horaria y día; OE6, taxi_salida_min por aeropuerto de origen. Todos los objetivos se pueden responder con el modelo.</w:t>
+        <w:t>Verificación del modelo lógico</w:t>
+      </w:r>
+    </w:p>
+    <w:tbl>
+      <w:tblPr>
+        <w:tblStyle w:val="TableGrid"/>
+        <w:tblW w:type="auto" w:w="0"/>
+        <w:tblLayout w:type="fixed"/>
+        <w:tblLook w:firstColumn="1" w:firstRow="1" w:lastColumn="0" w:lastRow="0" w:noHBand="0" w:noVBand="1" w:val="04A0"/>
+      </w:tblPr>
+      <w:tblGrid>
+        <w:gridCol w:w="1361"/>
+        <w:gridCol w:w="3742"/>
+        <w:gridCol w:w="3969"/>
+      </w:tblGrid>
+      <w:tr>
+        <w:trPr>
+          <w:cantSplit w:val="true"/>
+          <w:tblHeader w:val="true"/>
+        </w:trPr>
+        <w:tc>
+          <w:tcPr>
+            <w:tcW w:type="dxa" w:w="1361"/>
+            <w:shd w:val="clear" w:color="auto" w:fill="D9D9D9"/>
+          </w:tcPr>
+          <w:p>
+            <w:pPr>
+              <w:spacing w:after="0" w:line="240" w:lineRule="auto"/>
+            </w:pPr>
+            <w:r>
+              <w:rPr>
+                <w:b/>
+              </w:rPr>
+              <w:t>Objetivo</w:t>
+            </w:r>
+          </w:p>
+        </w:tc>
+        <w:tc>
+          <w:tcPr>
+            <w:tcW w:type="dxa" w:w="3742"/>
+            <w:shd w:val="clear" w:color="auto" w:fill="D9D9D9"/>
+          </w:tcPr>
+          <w:p>
+            <w:pPr>
+              <w:spacing w:after="0" w:line="240" w:lineRule="auto"/>
+            </w:pPr>
+            <w:r>
+              <w:rPr>
+                <w:b/>
+              </w:rPr>
+              <w:t>Métricas</w:t>
+            </w:r>
+          </w:p>
+        </w:tc>
+        <w:tc>
+          <w:tcPr>
+            <w:tcW w:type="dxa" w:w="3969"/>
+            <w:shd w:val="clear" w:color="auto" w:fill="D9D9D9"/>
+          </w:tcPr>
+          <w:p>
+            <w:pPr>
+              <w:spacing w:after="0" w:line="240" w:lineRule="auto"/>
+            </w:pPr>
+            <w:r>
+              <w:rPr>
+                <w:b/>
+              </w:rPr>
+              <w:t>Dimensiones</w:t>
+            </w:r>
+          </w:p>
+        </w:tc>
+      </w:tr>
+      <w:tr>
+        <w:trPr>
+          <w:cantSplit w:val="true"/>
+        </w:trPr>
+        <w:tc>
+          <w:tcPr>
+            <w:tcW w:type="dxa" w:w="1361"/>
+          </w:tcPr>
+          <w:p>
+            <w:pPr>
+              <w:spacing w:after="0" w:line="240" w:lineRule="auto"/>
+            </w:pPr>
+            <w:r>
+              <w:rPr>
+                <w:b w:val="0"/>
+              </w:rPr>
+              <w:t>OE1</w:t>
+            </w:r>
+          </w:p>
+        </w:tc>
+        <w:tc>
+          <w:tcPr>
+            <w:tcW w:type="dxa" w:w="3742"/>
+          </w:tcPr>
+          <w:p>
+            <w:pPr>
+              <w:spacing w:after="0" w:line="240" w:lineRule="auto"/>
+            </w:pPr>
+            <w:r>
+              <w:rPr>
+                <w:b w:val="0"/>
+              </w:rPr>
+              <w:t>es_puntual, es_retrasado</w:t>
+            </w:r>
+          </w:p>
+        </w:tc>
+        <w:tc>
+          <w:tcPr>
+            <w:tcW w:type="dxa" w:w="3969"/>
+          </w:tcPr>
+          <w:p>
+            <w:pPr>
+              <w:spacing w:after="0" w:line="240" w:lineRule="auto"/>
+            </w:pPr>
+            <w:r>
+              <w:rPr>
+                <w:b w:val="0"/>
+              </w:rPr>
+              <w:t>Aerolínea y fecha (mes)</w:t>
+            </w:r>
+          </w:p>
+        </w:tc>
+      </w:tr>
+      <w:tr>
+        <w:trPr>
+          <w:cantSplit w:val="true"/>
+        </w:trPr>
+        <w:tc>
+          <w:tcPr>
+            <w:tcW w:type="dxa" w:w="1361"/>
+          </w:tcPr>
+          <w:p>
+            <w:pPr>
+              <w:spacing w:after="0" w:line="240" w:lineRule="auto"/>
+            </w:pPr>
+            <w:r>
+              <w:rPr>
+                <w:b w:val="0"/>
+              </w:rPr>
+              <w:t>OE2</w:t>
+            </w:r>
+          </w:p>
+        </w:tc>
+        <w:tc>
+          <w:tcPr>
+            <w:tcW w:type="dxa" w:w="3742"/>
+          </w:tcPr>
+          <w:p>
+            <w:pPr>
+              <w:spacing w:after="0" w:line="240" w:lineRule="auto"/>
+            </w:pPr>
+            <w:r>
+              <w:rPr>
+                <w:b w:val="0"/>
+              </w:rPr>
+              <w:t>es_cancelado, es_desviado</w:t>
+            </w:r>
+          </w:p>
+        </w:tc>
+        <w:tc>
+          <w:tcPr>
+            <w:tcW w:type="dxa" w:w="3969"/>
+          </w:tcPr>
+          <w:p>
+            <w:pPr>
+              <w:spacing w:after="0" w:line="240" w:lineRule="auto"/>
+            </w:pPr>
+            <w:r>
+              <w:rPr>
+                <w:b w:val="0"/>
+              </w:rPr>
+              <w:t>Aerolínea y motivo de cancelación</w:t>
+            </w:r>
+          </w:p>
+        </w:tc>
+      </w:tr>
+      <w:tr>
+        <w:trPr>
+          <w:cantSplit w:val="true"/>
+        </w:trPr>
+        <w:tc>
+          <w:tcPr>
+            <w:tcW w:type="dxa" w:w="1361"/>
+          </w:tcPr>
+          <w:p>
+            <w:pPr>
+              <w:spacing w:after="0" w:line="240" w:lineRule="auto"/>
+            </w:pPr>
+            <w:r>
+              <w:rPr>
+                <w:b w:val="0"/>
+              </w:rPr>
+              <w:t>OE3</w:t>
+            </w:r>
+          </w:p>
+        </w:tc>
+        <w:tc>
+          <w:tcPr>
+            <w:tcW w:type="dxa" w:w="3742"/>
+          </w:tcPr>
+          <w:p>
+            <w:pPr>
+              <w:spacing w:after="0" w:line="240" w:lineRule="auto"/>
+            </w:pPr>
+            <w:r>
+              <w:rPr>
+                <w:b w:val="0"/>
+              </w:rPr>
+              <w:t>Minutos de retraso por causa</w:t>
+            </w:r>
+          </w:p>
+        </w:tc>
+        <w:tc>
+          <w:tcPr>
+            <w:tcW w:type="dxa" w:w="3969"/>
+          </w:tcPr>
+          <w:p>
+            <w:pPr>
+              <w:spacing w:after="0" w:line="240" w:lineRule="auto"/>
+            </w:pPr>
+            <w:r>
+              <w:rPr>
+                <w:b w:val="0"/>
+              </w:rPr>
+              <w:t>Fecha y aerolínea</w:t>
+            </w:r>
+          </w:p>
+        </w:tc>
+      </w:tr>
+      <w:tr>
+        <w:trPr>
+          <w:cantSplit w:val="true"/>
+        </w:trPr>
+        <w:tc>
+          <w:tcPr>
+            <w:tcW w:type="dxa" w:w="1361"/>
+          </w:tcPr>
+          <w:p>
+            <w:pPr>
+              <w:spacing w:after="0" w:line="240" w:lineRule="auto"/>
+            </w:pPr>
+            <w:r>
+              <w:rPr>
+                <w:b w:val="0"/>
+              </w:rPr>
+              <w:t>OE4</w:t>
+            </w:r>
+          </w:p>
+        </w:tc>
+        <w:tc>
+          <w:tcPr>
+            <w:tcW w:type="dxa" w:w="3742"/>
+          </w:tcPr>
+          <w:p>
+            <w:pPr>
+              <w:spacing w:after="0" w:line="240" w:lineRule="auto"/>
+            </w:pPr>
+            <w:r>
+              <w:rPr>
+                <w:b w:val="0"/>
+              </w:rPr>
+              <w:t>retraso_llegada_min</w:t>
+            </w:r>
+          </w:p>
+        </w:tc>
+        <w:tc>
+          <w:tcPr>
+            <w:tcW w:type="dxa" w:w="3969"/>
+          </w:tcPr>
+          <w:p>
+            <w:pPr>
+              <w:spacing w:after="0" w:line="240" w:lineRule="auto"/>
+            </w:pPr>
+            <w:r>
+              <w:rPr>
+                <w:b w:val="0"/>
+              </w:rPr>
+              <w:t>Aeropuerto de origen y de destino</w:t>
+            </w:r>
+          </w:p>
+        </w:tc>
+      </w:tr>
+      <w:tr>
+        <w:trPr>
+          <w:cantSplit w:val="true"/>
+        </w:trPr>
+        <w:tc>
+          <w:tcPr>
+            <w:tcW w:type="dxa" w:w="1361"/>
+          </w:tcPr>
+          <w:p>
+            <w:pPr>
+              <w:spacing w:after="0" w:line="240" w:lineRule="auto"/>
+            </w:pPr>
+            <w:r>
+              <w:rPr>
+                <w:b w:val="0"/>
+              </w:rPr>
+              <w:t>OE5</w:t>
+            </w:r>
+          </w:p>
+        </w:tc>
+        <w:tc>
+          <w:tcPr>
+            <w:tcW w:type="dxa" w:w="3742"/>
+          </w:tcPr>
+          <w:p>
+            <w:pPr>
+              <w:spacing w:after="0" w:line="240" w:lineRule="auto"/>
+            </w:pPr>
+            <w:r>
+              <w:rPr>
+                <w:b w:val="0"/>
+              </w:rPr>
+              <w:t>retraso_salida_min, es_retrasado</w:t>
+            </w:r>
+          </w:p>
+        </w:tc>
+        <w:tc>
+          <w:tcPr>
+            <w:tcW w:type="dxa" w:w="3969"/>
+          </w:tcPr>
+          <w:p>
+            <w:pPr>
+              <w:spacing w:after="0" w:line="240" w:lineRule="auto"/>
+            </w:pPr>
+            <w:r>
+              <w:rPr>
+                <w:b w:val="0"/>
+              </w:rPr>
+              <w:t>Hora (franja horaria) y fecha (día de la semana)</w:t>
+            </w:r>
+          </w:p>
+        </w:tc>
+      </w:tr>
+      <w:tr>
+        <w:trPr>
+          <w:cantSplit w:val="true"/>
+        </w:trPr>
+        <w:tc>
+          <w:tcPr>
+            <w:tcW w:type="dxa" w:w="1361"/>
+          </w:tcPr>
+          <w:p>
+            <w:pPr>
+              <w:spacing w:after="0" w:line="240" w:lineRule="auto"/>
+            </w:pPr>
+            <w:r>
+              <w:rPr>
+                <w:b w:val="0"/>
+              </w:rPr>
+              <w:t>OE6</w:t>
+            </w:r>
+          </w:p>
+        </w:tc>
+        <w:tc>
+          <w:tcPr>
+            <w:tcW w:type="dxa" w:w="3742"/>
+          </w:tcPr>
+          <w:p>
+            <w:pPr>
+              <w:spacing w:after="0" w:line="240" w:lineRule="auto"/>
+            </w:pPr>
+            <w:r>
+              <w:rPr>
+                <w:b w:val="0"/>
+              </w:rPr>
+              <w:t>taxi_salida_min</w:t>
+            </w:r>
+          </w:p>
+        </w:tc>
+        <w:tc>
+          <w:tcPr>
+            <w:tcW w:type="dxa" w:w="3969"/>
+          </w:tcPr>
+          <w:p>
+            <w:pPr>
+              <w:spacing w:after="0" w:line="240" w:lineRule="auto"/>
+            </w:pPr>
+            <w:r>
+              <w:rPr>
+                <w:b w:val="0"/>
+              </w:rPr>
+              <w:t>Aeropuerto de origen</w:t>
+            </w:r>
+          </w:p>
+        </w:tc>
+      </w:tr>
+    </w:tbl>
+    <w:p>
+      <w:pPr>
+        <w:spacing w:after="0"/>
+      </w:pPr>
+    </w:p>
+    <w:p>
+      <w:pPr>
+        <w:jc w:val="both"/>
+      </w:pPr>
+      <w:r>
+        <w:t>Como se observa, todos los objetivos se pueden responder con las métricas y dimensiones del modelo.</w:t>
       </w:r>
     </w:p>
     <w:p>
@@ -2465,13 +3799,10 @@
         <w:rPr>
           <w:b/>
         </w:rPr>
-        <w:t>Figura 2.</w:t>
+        <w:t xml:space="preserve">Figura 2. </w:t>
       </w:r>
       <w:r>
-        <w:rPr>
-          <w:b w:val="0"/>
-        </w:rPr>
-        <w:t xml:space="preserve"> Modelo lógico del DataMart Puntualidad de Vuelos (esquema en estrella).</w:t>
+        <w:t>Modelo lógico del DataMart Puntualidad de Vuelos.</w:t>
       </w:r>
     </w:p>
     <w:p>
@@ -2479,10 +3810,7 @@
         <w:jc w:val="center"/>
       </w:pPr>
       <w:r>
-        <w:rPr>
-          <w:b w:val="0"/>
-        </w:rPr>
-        <w:t>PK = clave primaria (sustituta); FK = clave foránea, con la tabla a la que apunta; NK = clave natural única; DD = dimensión degenerada; ‖──&lt; = relación 1:N. dim_aeropuerto se relaciona dos veces con fact_vuelo (origen y destino).</w:t>
+        <w:t>PK: clave primaria. FK: clave foránea. NK: clave natural. DD: dimensión degenerada. Todas las relaciones son de uno a muchos.</w:t>
       </w:r>
     </w:p>
     <w:p>
@@ -2498,13 +3826,25 @@
     <w:p>
       <w:pPr>
         <w:keepNext/>
+        <w:spacing w:before="240" w:after="120"/>
+      </w:pPr>
+      <w:r>
+        <w:rPr>
+          <w:b/>
+        </w:rPr>
+        <w:t>5. MODELADO FÍSICO DEL DATAMART</w:t>
+      </w:r>
+    </w:p>
+    <w:p>
+      <w:pPr>
+        <w:keepNext/>
         <w:spacing w:before="120"/>
       </w:pPr>
       <w:r>
         <w:rPr>
           <w:b/>
         </w:rPr>
-        <w:t>5. Modelado Físico del DataMart</w:t>
+        <w:t>5.1 Implementación en PostgreSQL</w:t>
       </w:r>
     </w:p>
     <w:p>
@@ -2512,79 +3852,19 @@
         <w:jc w:val="both"/>
       </w:pPr>
       <w:r>
-        <w:rPr>
-          <w:b w:val="0"/>
-        </w:rPr>
-        <w:t xml:space="preserve">Se implementó en </w:t>
-      </w:r>
-      <w:r>
-        <w:rPr>
-          <w:b/>
-        </w:rPr>
-        <w:t>PostgreSQL 16</w:t>
-      </w:r>
-      <w:r>
-        <w:rPr>
-          <w:b w:val="0"/>
-        </w:rPr>
-        <w:t xml:space="preserve"> (base y esquema dw_vuelos) con scripts SQL que crean las cinco dimensiones y la tabla de hechos, los índices y los datos fijos (fechas 2014–2016, las 24 horas y los motivos de cancelación).</w:t>
+        <w:t>El modelo físico se implementó en PostgreSQL 16, en una base de datos llamada dw_vuelos. Se crearon las cinco tablas de dimensiones y la tabla de hechos con sus tipos de datos, claves, restricciones e índices. También se cargaron los datos fijos: el calendario de 2014 a 2016, las 24 horas del día y los motivos de cancelación. La Figura 3 muestra el modelo físico tal como quedó en la base de datos.</w:t>
       </w:r>
     </w:p>
     <w:p>
       <w:pPr>
-        <w:pStyle w:val="ListBullet"/>
-        <w:spacing w:after="20"/>
-        <w:jc w:val="both"/>
+        <w:keepNext/>
+        <w:spacing w:before="120"/>
       </w:pPr>
       <w:r>
         <w:rPr>
           <w:b/>
         </w:rPr>
-        <w:t>Tipos de datos:</w:t>
-      </w:r>
-      <w:r>
-        <w:rPr>
-          <w:b w:val="0"/>
-        </w:rPr>
-        <w:t xml:space="preserve"> claves INTEGER/BIGINT IDENTITY; minutos y distancia SMALLINT (los retrasos negativos indican adelanto); indicadores SMALLINT; fecha DATE y hora programada TIME; códigos VARCHAR(3).</w:t>
-      </w:r>
-    </w:p>
-    <w:p>
-      <w:pPr>
-        <w:pStyle w:val="ListBullet"/>
-        <w:spacing w:after="20"/>
-        <w:jc w:val="both"/>
-      </w:pPr>
-      <w:r>
-        <w:rPr>
-          <w:b/>
-        </w:rPr>
-        <w:t>Restricciones e integridad referencial:</w:t>
-      </w:r>
-      <w:r>
-        <w:rPr>
-          <w:b w:val="0"/>
-        </w:rPr>
-        <w:t xml:space="preserve"> PK en todas las tablas, UNIQUE en los códigos IATA y en la clave natural del vuelo, seis FK obligatorias (dos hacia dim_aeropuerto) y reglas CHECK (distancia &gt; 0, un vuelo cancelado debe tener motivo, es_retrasado = 1 solo si llegó con 15 minutos o más de retraso). Se probó que el DBMS rechaza aerolíneas inexistentes, vuelos cancelados sin motivo, vuelos duplicados, distancias negativas y el borrado de aeropuertos con vuelos.</w:t>
-      </w:r>
-    </w:p>
-    <w:p>
-      <w:pPr>
-        <w:pStyle w:val="ListBullet"/>
-        <w:spacing w:after="20"/>
-        <w:jc w:val="both"/>
-      </w:pPr>
-      <w:r>
-        <w:rPr>
-          <w:b/>
-        </w:rPr>
-        <w:t>Índices y orientación al análisis y al ETL:</w:t>
-      </w:r>
-      <w:r>
-        <w:rPr>
-          <w:b w:val="0"/>
-        </w:rPr>
-        <w:t xml:space="preserve"> índices en cada FK, en (aerolínea, fecha), en la ruta (origen, destino) y un índice parcial de vuelos cancelados; la clave natural única permite recargar sin duplicar y el miembro «Desconocido» (-1) evita perder vuelos con códigos no encontrados.</w:t>
+        <w:t>5.2 Tipos de datos y restricciones</w:t>
       </w:r>
     </w:p>
     <w:p>
@@ -2592,10 +3872,357 @@
         <w:jc w:val="both"/>
       </w:pPr>
       <w:r>
+        <w:t>La Tabla 8 resume los tipos de datos elegidos para las columnas de las tablas.</w:t>
+      </w:r>
+    </w:p>
+    <w:p>
+      <w:pPr>
+        <w:keepNext/>
+        <w:spacing w:after="60"/>
+      </w:pPr>
+      <w:r>
         <w:rPr>
-          <w:b w:val="0"/>
+          <w:b/>
         </w:rPr>
-        <w:t>La Figura 3 muestra el modelo físico implementado, obtenido del catálogo de PostgreSQL: cada tabla con sus columnas, tipos de datos, claves y columnas obligatorias. Los scripts SQL de creación se entregan junto con el proyecto.</w:t>
+        <w:t xml:space="preserve">Tabla 8. </w:t>
+      </w:r>
+      <w:r>
+        <w:t>Tipos de datos utilizados</w:t>
+      </w:r>
+    </w:p>
+    <w:tbl>
+      <w:tblPr>
+        <w:tblStyle w:val="TableGrid"/>
+        <w:tblW w:type="auto" w:w="0"/>
+        <w:tblLayout w:type="fixed"/>
+        <w:tblLook w:firstColumn="1" w:firstRow="1" w:lastColumn="0" w:lastRow="0" w:noHBand="0" w:noVBand="1" w:val="04A0"/>
+      </w:tblPr>
+      <w:tblGrid>
+        <w:gridCol w:w="2835"/>
+        <w:gridCol w:w="2835"/>
+        <w:gridCol w:w="3402"/>
+      </w:tblGrid>
+      <w:tr>
+        <w:trPr>
+          <w:cantSplit w:val="true"/>
+          <w:tblHeader w:val="true"/>
+        </w:trPr>
+        <w:tc>
+          <w:tcPr>
+            <w:tcW w:type="dxa" w:w="2835"/>
+            <w:shd w:val="clear" w:color="auto" w:fill="D9D9D9"/>
+          </w:tcPr>
+          <w:p>
+            <w:pPr>
+              <w:spacing w:after="0" w:line="240" w:lineRule="auto"/>
+            </w:pPr>
+            <w:r>
+              <w:rPr>
+                <w:b/>
+              </w:rPr>
+              <w:t>Datos</w:t>
+            </w:r>
+          </w:p>
+        </w:tc>
+        <w:tc>
+          <w:tcPr>
+            <w:tcW w:type="dxa" w:w="2835"/>
+            <w:shd w:val="clear" w:color="auto" w:fill="D9D9D9"/>
+          </w:tcPr>
+          <w:p>
+            <w:pPr>
+              <w:spacing w:after="0" w:line="240" w:lineRule="auto"/>
+            </w:pPr>
+            <w:r>
+              <w:rPr>
+                <w:b/>
+              </w:rPr>
+              <w:t>Tipo de dato</w:t>
+            </w:r>
+          </w:p>
+        </w:tc>
+        <w:tc>
+          <w:tcPr>
+            <w:tcW w:type="dxa" w:w="3402"/>
+            <w:shd w:val="clear" w:color="auto" w:fill="D9D9D9"/>
+          </w:tcPr>
+          <w:p>
+            <w:pPr>
+              <w:spacing w:after="0" w:line="240" w:lineRule="auto"/>
+            </w:pPr>
+            <w:r>
+              <w:rPr>
+                <w:b/>
+              </w:rPr>
+              <w:t>Motivo</w:t>
+            </w:r>
+          </w:p>
+        </w:tc>
+      </w:tr>
+      <w:tr>
+        <w:trPr>
+          <w:cantSplit w:val="true"/>
+        </w:trPr>
+        <w:tc>
+          <w:tcPr>
+            <w:tcW w:type="dxa" w:w="2835"/>
+          </w:tcPr>
+          <w:p>
+            <w:pPr>
+              <w:spacing w:after="0" w:line="240" w:lineRule="auto"/>
+            </w:pPr>
+            <w:r>
+              <w:rPr>
+                <w:b w:val="0"/>
+              </w:rPr>
+              <w:t>Claves sustitutas</w:t>
+            </w:r>
+          </w:p>
+        </w:tc>
+        <w:tc>
+          <w:tcPr>
+            <w:tcW w:type="dxa" w:w="2835"/>
+          </w:tcPr>
+          <w:p>
+            <w:pPr>
+              <w:spacing w:after="0" w:line="240" w:lineRule="auto"/>
+            </w:pPr>
+            <w:r>
+              <w:rPr>
+                <w:b w:val="0"/>
+              </w:rPr>
+              <w:t>INTEGER y BIGINT con IDENTITY</w:t>
+            </w:r>
+          </w:p>
+        </w:tc>
+        <w:tc>
+          <w:tcPr>
+            <w:tcW w:type="dxa" w:w="3402"/>
+          </w:tcPr>
+          <w:p>
+            <w:pPr>
+              <w:spacing w:after="0" w:line="240" w:lineRule="auto"/>
+            </w:pPr>
+            <w:r>
+              <w:rPr>
+                <w:b w:val="0"/>
+              </w:rPr>
+              <w:t>Se generan automáticamente.</w:t>
+            </w:r>
+          </w:p>
+        </w:tc>
+      </w:tr>
+      <w:tr>
+        <w:trPr>
+          <w:cantSplit w:val="true"/>
+        </w:trPr>
+        <w:tc>
+          <w:tcPr>
+            <w:tcW w:type="dxa" w:w="2835"/>
+          </w:tcPr>
+          <w:p>
+            <w:pPr>
+              <w:spacing w:after="0" w:line="240" w:lineRule="auto"/>
+            </w:pPr>
+            <w:r>
+              <w:rPr>
+                <w:b w:val="0"/>
+              </w:rPr>
+              <w:t>Minutos, distancia e indicadores</w:t>
+            </w:r>
+          </w:p>
+        </w:tc>
+        <w:tc>
+          <w:tcPr>
+            <w:tcW w:type="dxa" w:w="2835"/>
+          </w:tcPr>
+          <w:p>
+            <w:pPr>
+              <w:spacing w:after="0" w:line="240" w:lineRule="auto"/>
+            </w:pPr>
+            <w:r>
+              <w:rPr>
+                <w:b w:val="0"/>
+              </w:rPr>
+              <w:t>SMALLINT</w:t>
+            </w:r>
+          </w:p>
+        </w:tc>
+        <w:tc>
+          <w:tcPr>
+            <w:tcW w:type="dxa" w:w="3402"/>
+          </w:tcPr>
+          <w:p>
+            <w:pPr>
+              <w:spacing w:after="0" w:line="240" w:lineRule="auto"/>
+            </w:pPr>
+            <w:r>
+              <w:rPr>
+                <w:b w:val="0"/>
+              </w:rPr>
+              <w:t>Son números pequeños y los indicadores se pueden sumar.</w:t>
+            </w:r>
+          </w:p>
+        </w:tc>
+      </w:tr>
+      <w:tr>
+        <w:trPr>
+          <w:cantSplit w:val="true"/>
+        </w:trPr>
+        <w:tc>
+          <w:tcPr>
+            <w:tcW w:type="dxa" w:w="2835"/>
+          </w:tcPr>
+          <w:p>
+            <w:pPr>
+              <w:spacing w:after="0" w:line="240" w:lineRule="auto"/>
+            </w:pPr>
+            <w:r>
+              <w:rPr>
+                <w:b w:val="0"/>
+              </w:rPr>
+              <w:t>Fecha y hora programada</w:t>
+            </w:r>
+          </w:p>
+        </w:tc>
+        <w:tc>
+          <w:tcPr>
+            <w:tcW w:type="dxa" w:w="2835"/>
+          </w:tcPr>
+          <w:p>
+            <w:pPr>
+              <w:spacing w:after="0" w:line="240" w:lineRule="auto"/>
+            </w:pPr>
+            <w:r>
+              <w:rPr>
+                <w:b w:val="0"/>
+              </w:rPr>
+              <w:t>DATE y TIME</w:t>
+            </w:r>
+          </w:p>
+        </w:tc>
+        <w:tc>
+          <w:tcPr>
+            <w:tcW w:type="dxa" w:w="3402"/>
+          </w:tcPr>
+          <w:p>
+            <w:pPr>
+              <w:spacing w:after="0" w:line="240" w:lineRule="auto"/>
+            </w:pPr>
+            <w:r>
+              <w:rPr>
+                <w:b w:val="0"/>
+              </w:rPr>
+              <w:t>Permiten trabajar con fechas y horas.</w:t>
+            </w:r>
+          </w:p>
+        </w:tc>
+      </w:tr>
+      <w:tr>
+        <w:trPr>
+          <w:cantSplit w:val="true"/>
+        </w:trPr>
+        <w:tc>
+          <w:tcPr>
+            <w:tcW w:type="dxa" w:w="2835"/>
+          </w:tcPr>
+          <w:p>
+            <w:pPr>
+              <w:spacing w:after="0" w:line="240" w:lineRule="auto"/>
+            </w:pPr>
+            <w:r>
+              <w:rPr>
+                <w:b w:val="0"/>
+              </w:rPr>
+              <w:t>Códigos y nombres</w:t>
+            </w:r>
+          </w:p>
+        </w:tc>
+        <w:tc>
+          <w:tcPr>
+            <w:tcW w:type="dxa" w:w="2835"/>
+          </w:tcPr>
+          <w:p>
+            <w:pPr>
+              <w:spacing w:after="0" w:line="240" w:lineRule="auto"/>
+            </w:pPr>
+            <w:r>
+              <w:rPr>
+                <w:b w:val="0"/>
+              </w:rPr>
+              <w:t>VARCHAR y CHAR</w:t>
+            </w:r>
+          </w:p>
+        </w:tc>
+        <w:tc>
+          <w:tcPr>
+            <w:tcW w:type="dxa" w:w="3402"/>
+          </w:tcPr>
+          <w:p>
+            <w:pPr>
+              <w:spacing w:after="0" w:line="240" w:lineRule="auto"/>
+            </w:pPr>
+            <w:r>
+              <w:rPr>
+                <w:b w:val="0"/>
+              </w:rPr>
+              <w:t>Texto de longitud limitada.</w:t>
+            </w:r>
+          </w:p>
+        </w:tc>
+      </w:tr>
+    </w:tbl>
+    <w:p>
+      <w:pPr>
+        <w:spacing w:after="0"/>
+      </w:pPr>
+    </w:p>
+    <w:p>
+      <w:pPr>
+        <w:jc w:val="both"/>
+      </w:pPr>
+      <w:r>
+        <w:t>Las restricciones definidas son: clave primaria en todas las tablas, UNIQUE en los códigos IATA y en la combinación que identifica a cada vuelo, NOT NULL en las columnas obligatorias y reglas CHECK, por ejemplo, que la distancia sea mayor que cero o que un vuelo cancelado tenga un motivo de cancelación.</w:t>
+      </w:r>
+    </w:p>
+    <w:p>
+      <w:pPr>
+        <w:keepNext/>
+        <w:spacing w:before="120"/>
+      </w:pPr>
+      <w:r>
+        <w:rPr>
+          <w:b/>
+        </w:rPr>
+        <w:t>5.3 Relaciones e integridad referencial</w:t>
+      </w:r>
+    </w:p>
+    <w:p>
+      <w:pPr>
+        <w:jc w:val="both"/>
+      </w:pPr>
+      <w:r>
+        <w:t>Las relaciones entre la tabla de hechos y las dimensiones se crearon como claves foráneas: seis en total, dos de ellas hacia la dimensión aeropuerto. Para comprobar la integridad referencial se hicieron pruebas, y la base de datos rechazó correctamente un vuelo con una aerolínea que no existe, un vuelo cancelado sin motivo, un vuelo repetido, una distancia negativa y la eliminación de un aeropuerto que tiene vuelos registrados.</w:t>
+      </w:r>
+    </w:p>
+    <w:p>
+      <w:pPr>
+        <w:keepNext/>
+        <w:spacing w:before="120"/>
+      </w:pPr>
+      <w:r>
+        <w:rPr>
+          <w:b/>
+        </w:rPr>
+        <w:t>5.4 Preparación para las consultas y para el ETL</w:t>
+      </w:r>
+    </w:p>
+    <w:p>
+      <w:pPr>
+        <w:jc w:val="both"/>
+      </w:pPr>
+      <w:r>
+        <w:t>Para que las consultas sean rápidas se crearon índices sobre las claves foráneas, sobre la combinación de aerolínea y fecha, sobre las rutas (origen y destino) y un índice parcial para los vuelos cancelados. Para facilitar la carga con Apache Hop, las dimensiones de aerolínea y aeropuerto tienen un registro "Desconocido" con clave -⁠1, que se usa cuando un código no se encuentra, y la clave del vuelo evita que se carguen vuelos repetidos si el proceso se ejecuta más de una vez.</w:t>
       </w:r>
     </w:p>
     <w:p>
@@ -2656,13 +4283,10 @@
         <w:rPr>
           <w:b/>
         </w:rPr>
-        <w:t>Figura 3.</w:t>
+        <w:t xml:space="preserve">Figura 3. </w:t>
       </w:r>
       <w:r>
-        <w:rPr>
-          <w:b w:val="0"/>
-        </w:rPr>
-        <w:t xml:space="preserve"> Modelo físico del DataMart Puntualidad de Vuelos en PostgreSQL 16 (esquema dw_vuelos).</w:t>
+        <w:t>Modelo físico del DataMart Puntualidad de Vuelos en PostgreSQL 16.</w:t>
       </w:r>
     </w:p>
     <w:p>
@@ -2670,10 +4294,7 @@
         <w:jc w:val="center"/>
       </w:pPr>
       <w:r>
-        <w:rPr>
-          <w:b w:val="0"/>
-        </w:rPr>
-        <w:t>PK = clave primaria; FK = clave foránea; UK = forma parte de una restricción UNIQUE; NN = NOT NULL; IDENTITY = valor generado por el DBMS; ‖──&lt; = relación 1:N. dim_aeropuerto se relaciona dos veces con fact_vuelo (origen y destino).</w:t>
+        <w:t>PK: clave primaria. FK: clave foránea. UK: restricción UNIQUE. NN: NOT NULL. IDENTITY: valor generado por la base de datos.</w:t>
       </w:r>
     </w:p>
     <w:sectPr>
@@ -3050,7 +4671,7 @@
     <w:qFormat/>
     <w:rsid w:val="00FC693F"/>
     <w:pPr>
-      <w:spacing w:before="0" w:after="60" w:line="240" w:lineRule="auto"/>
+      <w:spacing w:before="0" w:after="120" w:line="276" w:lineRule="auto"/>
     </w:pPr>
     <w:rPr>
       <w:rFonts w:ascii="Arial" w:hAnsi="Arial" w:eastAsia="Arial" w:cs="Arial"/>
@@ -3584,14 +5205,8 @@
       <w:numPr>
         <w:numId w:val="1"/>
       </w:numPr>
-      <w:spacing w:before="0" w:after="60" w:line="240" w:lineRule="auto"/>
       <w:contextualSpacing/>
     </w:pPr>
-    <w:rPr>
-      <w:rFonts w:ascii="Arial" w:hAnsi="Arial" w:eastAsia="Arial" w:cs="Arial"/>
-      <w:color w:val="000000"/>
-      <w:sz w:val="24"/>
-    </w:rPr>
   </w:style>
   <w:style w:type="paragraph" w:styleId="ListBullet2">
     <w:name w:val="List Bullet 2"/>

</xml_diff>

<commit_message>
Quitar la justificación del tema del documento
Co-Authored-By: Claude Opus 5.5 <noreply@anthropic.com>
Claude-Session: https://claude.ai/code/session_01UrpbqW5jvhcx6qo3xxD3vZ
</commit_message>
<xml_diff>
--- a/proyecto-dw-vuelos/docs/Primera_Presentacion_DW_Vuelos.docx
+++ b/proyecto-dw-vuelos/docs/Primera_Presentacion_DW_Vuelos.docx
@@ -586,26 +586,6 @@
       </w:pPr>
       <w:r>
         <w:t>Actualmente estos datos están en un archivo plano, que sirve para registrar los vuelos pero no para analizarlos. Por ejemplo, para saber qué aerolínea tuvo más retrasos en diciembre o cuál fue la causa más frecuente, habría que procesar millones de filas en cada consulta. La necesidad de análisis es conocer dónde, cuándo y por qué se producen los retrasos y las cancelaciones, para que las aerolíneas y los aeropuertos puedan mejorar su puntualidad y los pasajeros puedan elegir mejor sus vuelos.</w:t>
-      </w:r>
-    </w:p>
-    <w:p>
-      <w:pPr>
-        <w:keepNext/>
-        <w:spacing w:before="120"/>
-      </w:pPr>
-      <w:r>
-        <w:rPr>
-          <w:b/>
-        </w:rPr>
-        <w:t>1.4 Justificación del tema</w:t>
-      </w:r>
-    </w:p>
-    <w:p>
-      <w:pPr>
-        <w:jc w:val="both"/>
-      </w:pPr>
-      <w:r>
-        <w:t>El tema no pertenece a los casos excluidos en la consigna, como ventas, inventarios, hoteles o restaurantes. Se trata del análisis del desempeño de un sistema de transporte, con un volumen grande de datos, varias causas de retraso y datos que necesitan limpieza antes de cargarse: horas guardadas como números (por ejemplo, 1530 para las 15:30), valores vacíos en los vuelos cancelados y códigos de aeropuerto numéricos en el mes de octubre. Por estas razones se justifica el diseño de un Data Warehouse y de un proceso ETL.</w:t>
       </w:r>
     </w:p>
     <w:p>

</xml_diff>